<commit_message>
implemented live streaming and cupturing of updates
</commit_message>
<xml_diff>
--- a/FraudShield-Project-Documentation.docx
+++ b/FraudShield-Project-Documentation.docx
@@ -7,7 +7,6 @@
     <w:p/>
     <w:p/>
     <w:p/>
-    <w:p/>
     <w:p>
       <w:pPr>
         <w:jc w:val="center"/>
@@ -15,7 +14,7 @@
       <w:r>
         <w:rPr>
           <w:b/>
-          <w:sz w:val="44"/>
+          <w:sz w:val="48"/>
         </w:rPr>
         <w:t>FRAUDSHIELD</w:t>
       </w:r>
@@ -94,13 +93,21 @@
       <w:pPr>
         <w:jc w:val="center"/>
       </w:pPr>
+      <w:r>
+        <w:t>Department of Computer Science</w:t>
+      </w:r>
     </w:p>
     <w:p>
       <w:pPr>
         <w:jc w:val="center"/>
       </w:pPr>
+    </w:p>
+    <w:p>
+      <w:pPr>
+        <w:jc w:val="center"/>
+      </w:pPr>
       <w:r>
-        <w:t>Date: May 2026</w:t>
+        <w:t>Date: June 2026</w:t>
       </w:r>
     </w:p>
     <w:p>
@@ -113,6 +120,118 @@
         <w:pStyle w:val="Heading1"/>
       </w:pPr>
       <w:r>
+        <w:t>Abstract</w:t>
+      </w:r>
+    </w:p>
+    <w:p>
+      <w:r>
+        <w:t>Credit card fraud remains a major threat to financial institutions, merchants, and consumers. Existing detection systems often rely on either rigid rule-based engines that generate excessive false positives, or opaque machine learning models that lack interpretability for investigators. This project presents FraudShield, a full-stack web platform that combines deterministic rules, behavioral profiling, and scikit-learn machine learning into a unified 0–100 risk score, delivered through a secure, role-based operations console built with Flask and Next.js.</w:t>
+      </w:r>
+    </w:p>
+    <w:p>
+      <w:r>
+        <w:t>The system supports three personas—cardholder, fraud analyst, and administrator—each with scoped access to transactions, dashboards, dispute resolution, explainability views, and exportable reports. Transactions are ingested via manual capture, REST API, or a live simulator; each ingest triggers hybrid scoring, persistence to PostgreSQL (Neon), audit logging, and optional alert notifications. Evaluation using seeded realistic demo data demonstrates effective flagging of high-risk patterns, sub-second to low-second API latency depending on hosting, and successful role-based data isolation.</w:t>
+      </w:r>
+    </w:p>
+    <w:p>
+      <w:r>
+        <w:t>Keywords: credit card fraud detection, hybrid scoring, machine learning, Flask, Next.js, role-based access control, explainable AI, financial technology.</w:t>
+      </w:r>
+    </w:p>
+    <w:p>
+      <w:r>
+        <w:br w:type="page"/>
+      </w:r>
+    </w:p>
+    <w:p>
+      <w:pPr>
+        <w:pStyle w:val="Heading1"/>
+      </w:pPr>
+      <w:r>
+        <w:t>Acknowledgements</w:t>
+      </w:r>
+    </w:p>
+    <w:p>
+      <w:r>
+        <w:t>I would like to express my sincere gratitude to my project supervisor for their guidance, constructive feedback, and encouragement throughout the development of FraudShield. I also thank the faculty and staff of the Department of Computer Science for providing the academic foundation and resources that made this work possible. Finally, I acknowledge my peers and family for their support during the research, implementation, and testing phases of this project.</w:t>
+      </w:r>
+    </w:p>
+    <w:p>
+      <w:r>
+        <w:br w:type="page"/>
+      </w:r>
+    </w:p>
+    <w:p>
+      <w:pPr>
+        <w:pStyle w:val="Heading1"/>
+      </w:pPr>
+      <w:r>
+        <w:t>Table of Contents</w:t>
+      </w:r>
+    </w:p>
+    <w:p>
+      <w:r>
+        <w:t>Note: In Microsoft Word, update this table by right-clicking and selecting 'Update Field' after opening the document, or use References → Table of Contents.</w:t>
+      </w:r>
+    </w:p>
+    <w:p>
+      <w:pPr>
+        <w:pStyle w:val="ListNumber"/>
+      </w:pPr>
+      <w:r>
+        <w:t>Chapter 1: Introduction</w:t>
+      </w:r>
+    </w:p>
+    <w:p>
+      <w:pPr>
+        <w:pStyle w:val="ListNumber"/>
+      </w:pPr>
+      <w:r>
+        <w:t>Chapter 2: Review of Related Works</w:t>
+      </w:r>
+    </w:p>
+    <w:p>
+      <w:pPr>
+        <w:pStyle w:val="ListNumber"/>
+      </w:pPr>
+      <w:r>
+        <w:t>Chapter 3: Methodology</w:t>
+      </w:r>
+    </w:p>
+    <w:p>
+      <w:pPr>
+        <w:pStyle w:val="ListNumber"/>
+      </w:pPr>
+      <w:r>
+        <w:t>Chapter 4: Implementation and Results</w:t>
+      </w:r>
+    </w:p>
+    <w:p>
+      <w:pPr>
+        <w:pStyle w:val="ListNumber"/>
+      </w:pPr>
+      <w:r>
+        <w:t>Chapter 5: Findings and Conclusion</w:t>
+      </w:r>
+    </w:p>
+    <w:p>
+      <w:pPr>
+        <w:pStyle w:val="ListNumber"/>
+      </w:pPr>
+      <w:r>
+        <w:t>References</w:t>
+      </w:r>
+    </w:p>
+    <w:p>
+      <w:r>
+        <w:br w:type="page"/>
+      </w:r>
+    </w:p>
+    <w:p>
+      <w:pPr>
+        <w:pStyle w:val="Heading1"/>
+      </w:pPr>
+      <w:r>
         <w:t>Chapter 1: Introduction</w:t>
       </w:r>
     </w:p>
@@ -126,7 +245,12 @@
     </w:p>
     <w:p>
       <w:r>
-        <w:t>Credit card fraud causes significant financial losses to banks, merchants, and cardholders worldwide. Traditional detection approaches rely heavily on manual review or single-method automated systems that either produce high false-positive rates or lack transparency for investigators. Many small and medium financial institutions lack affordable, integrated platforms that combine real-time scoring, behavioral profiling, machine learning, explainable decisions, and role-based operational workflows in one system. FraudShield addresses this gap by providing a web-based fraud detection platform that ingests transactions, computes hybrid risk scores, stores audit evidence, and supports cardholders, analysts, and administrators through dedicated interfaces.</w:t>
+        <w:t>Credit card fraud causes billions of dollars in losses annually and erodes consumer trust in digital payments. Financial institutions must detect suspicious transactions quickly while minimising false positives that block legitimate purchases. Many organisations still depend on manual review queues, legacy rule-only engines, or proprietary black-box scoring services that are expensive, inflexible, or difficult to audit.</w:t>
+      </w:r>
+    </w:p>
+    <w:p>
+      <w:r>
+        <w:t>Small and medium institutions, as well as academic environments, lack integrated platforms that combine real-time hybrid scoring (rules + behavior + machine learning), explainable decisions, dispute workflows, role-based dashboards, and exportable compliance evidence in one cohesive system. FraudShield addresses this gap by delivering a web-based fraud detection platform that ingests transactions, computes transparent risk scores, stores audit trails, and supports cardholders, analysts, and administrators through dedicated interfaces.</w:t>
       </w:r>
     </w:p>
     <w:p>
@@ -139,7 +263,7 @@
     </w:p>
     <w:p>
       <w:r>
-        <w:t>The aim of this project is to design and implement FraudShield, a full-stack credit card fraud detection system that scores transactions in near real time using rules, behavioral analytics, and machine learning, and presents results through a secure, role-based web application suitable for demonstration, evaluation, and future production extension.</w:t>
+        <w:t>The aim of this project is to design, implement, and evaluate FraudShield—a full-stack credit card fraud detection system that scores transactions in near real time using a hybrid intelligence pipeline, and presents results through a secure, role-based web application suitable for demonstration, academic assessment, and future production extension.</w:t>
       </w:r>
     </w:p>
     <w:p>
@@ -155,7 +279,7 @@
         <w:pStyle w:val="ListBullet"/>
       </w:pPr>
       <w:r>
-        <w:t>To develop a RESTful backend API for user authentication, transaction ingestion, and fraud scoring.</w:t>
+        <w:t>To develop a RESTful Flask backend API for authentication, transaction ingestion, fraud scoring, and reporting.</w:t>
       </w:r>
     </w:p>
     <w:p>
@@ -171,7 +295,7 @@
         <w:pStyle w:val="ListBullet"/>
       </w:pPr>
       <w:r>
-        <w:t>To train and integrate a scikit-learn classification model for fraud probability estimation.</w:t>
+        <w:t>To train and integrate a scikit-learn classification model serialized as a joblib artifact for inference.</w:t>
       </w:r>
     </w:p>
     <w:p>
@@ -179,7 +303,7 @@
         <w:pStyle w:val="ListBullet"/>
       </w:pPr>
       <w:r>
-        <w:t>To design a relational database schema for users, transactions, decisions, alerts, and audit logs.</w:t>
+        <w:t>To design a normalised PostgreSQL relational schema for users, transactions, decisions, disputes, alerts, and audit logs.</w:t>
       </w:r>
     </w:p>
     <w:p>
@@ -187,7 +311,7 @@
         <w:pStyle w:val="ListBullet"/>
       </w:pPr>
       <w:r>
-        <w:t>To build a responsive Next.js dashboard with KPIs, monitoring, explainability, and reporting.</w:t>
+        <w:t>To build a responsive Next.js 14 dashboard with KPIs, monitoring, explainability, disputes, and admin tools.</w:t>
       </w:r>
     </w:p>
     <w:p>
@@ -195,7 +319,7 @@
         <w:pStyle w:val="ListBullet"/>
       </w:pPr>
       <w:r>
-        <w:t>To enforce role-based access control for cardholder, analyst, and administrator personas.</w:t>
+        <w:t>To enforce role-based access control (RBAC) for cardholder, analyst, and administrator personas.</w:t>
       </w:r>
     </w:p>
     <w:p>
@@ -203,7 +327,7 @@
         <w:pStyle w:val="ListBullet"/>
       </w:pPr>
       <w:r>
-        <w:t>To provide exportable reports (CSV, PDF, JSON) and simulated alert notifications.</w:t>
+        <w:t>To provide exportable reports (CSV, PDF, JSON), in-app notifications, and optional OAuth social login.</w:t>
       </w:r>
     </w:p>
     <w:p>
@@ -211,7 +335,7 @@
         <w:pStyle w:val="ListBullet"/>
       </w:pPr>
       <w:r>
-        <w:t>To document and test the system against functional and non-functional requirements.</w:t>
+        <w:t>To document requirements, UML models, testing evidence, and results in accordance with CS project guidelines.</w:t>
       </w:r>
     </w:p>
     <w:p>
@@ -224,7 +348,7 @@
     </w:p>
     <w:p>
       <w:r>
-        <w:t>Electronic payments continue to grow while fraud techniques evolve. Institutions need systems that balance automation with human oversight. A dedicated academic implementation allows controlled experimentation with scoring logic, reproducible datasets, and clear traceability—requirements that are difficult to evaluate on closed commercial products. The project justification rests on demonstrating that a modular, explainable, and extensible architecture can be built with mainstream open-source tools within a final-year timeline.</w:t>
+        <w:t>Electronic payment volumes continue to grow while fraud techniques evolve (card-not-present fraud, account takeover, velocity attacks). Institutions need systems that balance automation with human oversight and regulatory explainability. A dedicated academic implementation enables controlled experimentation with scoring logic, reproducible datasets, and full traceability—requirements difficult to evaluate on closed commercial products. The project demonstrates that a modular, explainable, extensible architecture can be built with mainstream open-source tools within a final-year timeline.</w:t>
       </w:r>
     </w:p>
     <w:p>
@@ -237,7 +361,7 @@
     </w:p>
     <w:p>
       <w:r>
-        <w:t>Motivation includes personal interest in financial technology, machine learning applied to security, and full-stack software engineering. Observing how banks flag unusual spending patterns inspired investigation into how rules and models can work together. The project also strengthens skills in API design, database modelling, JWT security, and data visualisation—competencies valued in fintech and software engineering careers.</w:t>
+        <w:t>Motivation stems from interest in financial technology, applied machine learning for security, and full-stack software engineering. Observing how banks flag unusual spending patterns led to investigation of how rules and statistical models complement each other. The project strengthens competencies in API design, database modelling, JWT security, data visualisation, and Agile delivery—skills valued in fintech and software engineering careers.</w:t>
       </w:r>
     </w:p>
     <w:p>
@@ -253,7 +377,7 @@
         <w:pStyle w:val="ListBullet"/>
       </w:pPr>
       <w:r>
-        <w:t>Web application with landing page, registration, login, and password recovery.</w:t>
+        <w:t>Public landing page with product overview and authentication entry points.</w:t>
       </w:r>
     </w:p>
     <w:p>
@@ -261,7 +385,7 @@
         <w:pStyle w:val="ListBullet"/>
       </w:pPr>
       <w:r>
-        <w:t>Transaction ingestion via manual form, API endpoint, and optional background simulator.</w:t>
+        <w:t>User registration, login, password recovery (OTP), and optional Google/GitHub OAuth.</w:t>
       </w:r>
     </w:p>
     <w:p>
@@ -269,7 +393,7 @@
         <w:pStyle w:val="ListBullet"/>
       </w:pPr>
       <w:r>
-        <w:t>Fraud scoring pipeline with persisted decisions and user profile updates.</w:t>
+        <w:t>Transaction ingestion via manual form, REST API, background simulator, and admin reseed.</w:t>
       </w:r>
     </w:p>
     <w:p>
@@ -277,7 +401,7 @@
         <w:pStyle w:val="ListBullet"/>
       </w:pPr>
       <w:r>
-        <w:t>Dashboard modules: overview, monitoring, capture, flagged queue, fraud lab, explainability, analytics, alerts, reports, admin, profile.</w:t>
+        <w:t>Hybrid fraud scoring with persisted FraudDecision records and UserProfile updates.</w:t>
       </w:r>
     </w:p>
     <w:p>
@@ -285,7 +409,7 @@
         <w:pStyle w:val="ListBullet"/>
       </w:pPr>
       <w:r>
-        <w:t>SQLite database with Flask-Migrate schema management.</w:t>
+        <w:t>Dashboard modules: overview, monitoring, capture, flagged queue, disputes, fraud lab, explainability, analytics, alerts, reports, admin, profile.</w:t>
       </w:r>
     </w:p>
     <w:p>
@@ -293,7 +417,15 @@
         <w:pStyle w:val="ListBullet"/>
       </w:pPr>
       <w:r>
-        <w:t>JWT authentication and three application roles.</w:t>
+        <w:t>PostgreSQL database (Neon cloud or local) with Flask-Migrate schema management.</w:t>
+      </w:r>
+    </w:p>
+    <w:p>
+      <w:pPr>
+        <w:pStyle w:val="ListBullet"/>
+      </w:pPr>
+      <w:r>
+        <w:t>JWT authentication, session cookie for Next.js middleware, and three application roles.</w:t>
       </w:r>
     </w:p>
     <w:p>
@@ -309,7 +441,7 @@
         <w:pStyle w:val="ListBullet"/>
       </w:pPr>
       <w:r>
-        <w:t>Integration with live payment networks (Visa/Mastercard switches).</w:t>
+        <w:t>Integration with live payment network switches (Visa/Mastercard authorisation rails).</w:t>
       </w:r>
     </w:p>
     <w:p>
@@ -317,7 +449,7 @@
         <w:pStyle w:val="ListBullet"/>
       </w:pPr>
       <w:r>
-        <w:t>Production-grade SMS/email gateways (email is simulated as database records).</w:t>
+        <w:t>Production-grade SMS/email gateways (alerts are stored as database records and in-app notifications).</w:t>
       </w:r>
     </w:p>
     <w:p>
@@ -325,7 +457,7 @@
         <w:pStyle w:val="ListBullet"/>
       </w:pPr>
       <w:r>
-        <w:t>Real SHAP/LIME integration (explainability uses documented approximation).</w:t>
+        <w:t>Formal SHAP/LIME integration (explainability uses documented feature contribution approximation).</w:t>
       </w:r>
     </w:p>
     <w:p>
@@ -333,7 +465,7 @@
         <w:pStyle w:val="ListBullet"/>
       </w:pPr>
       <w:r>
-        <w:t>Horizontal scaling, Kubernetes deployment, and multi-region redundancy.</w:t>
+        <w:t>Horizontal auto-scaling, Kubernetes orchestration, and multi-region disaster recovery.</w:t>
       </w:r>
     </w:p>
     <w:p>
@@ -349,7 +481,7 @@
         <w:pStyle w:val="ListBullet"/>
       </w:pPr>
       <w:r>
-        <w:t>SQLite is used for portability; high-concurrency production would require PostgreSQL or similar.</w:t>
+        <w:t>Cloud-hosted PostgreSQL (Neon) introduces network latency on ingest compared to local SQLite.</w:t>
       </w:r>
     </w:p>
     <w:p>
@@ -357,7 +489,7 @@
         <w:pStyle w:val="ListBullet"/>
       </w:pPr>
       <w:r>
-        <w:t>ML model trained on public-style features; domain-specific retraining would be needed in production.</w:t>
+        <w:t>ML model trained on public-style features; domain-specific retraining would be required in production.</w:t>
       </w:r>
     </w:p>
     <w:p>
@@ -365,7 +497,7 @@
         <w:pStyle w:val="ListBullet"/>
       </w:pPr>
       <w:r>
-        <w:t>FraudRule database catalog is admin-manageable but not yet wired into the live rule engine.</w:t>
+        <w:t>2FA toggle is a demonstration flag without full TOTP hardware key integration.</w:t>
       </w:r>
     </w:p>
     <w:p>
@@ -373,7 +505,7 @@
         <w:pStyle w:val="ListBullet"/>
       </w:pPr>
       <w:r>
-        <w:t>Some dashboard metrics are illustrative when data is sparse.</w:t>
+        <w:t>OAuth and email features depend on correct environment configuration in backend .env.</w:t>
       </w:r>
     </w:p>
     <w:p>
@@ -381,7 +513,7 @@
         <w:pStyle w:val="ListBullet"/>
       </w:pPr>
       <w:r>
-        <w:t>2FA toggle is a demonstration flag without TOTP hardware integration.</w:t>
+        <w:t>Some dashboard KPIs use cached aggregates; cache invalidation occurs on ingest and reseed.</w:t>
       </w:r>
     </w:p>
     <w:p>
@@ -405,7 +537,7 @@
         <w:pStyle w:val="ListBullet"/>
       </w:pPr>
       <w:r>
-        <w:t>Fraud analysts who need queues, explainability, and export tools.</w:t>
+        <w:t>Fraud analysts who need prioritised queues, explainability, dispute resolution, and export tools.</w:t>
       </w:r>
     </w:p>
     <w:p>
@@ -413,7 +545,7 @@
         <w:pStyle w:val="ListBullet"/>
       </w:pPr>
       <w:r>
-        <w:t>Cardholders who benefit from faster detection of suspicious activity on their accounts.</w:t>
+        <w:t>Cardholders who benefit from faster detection and review of suspicious activity on their accounts.</w:t>
       </w:r>
     </w:p>
     <w:p>
@@ -442,7 +574,7 @@
     </w:p>
     <w:p>
       <w:r>
-        <w:t>Academically, the project demonstrates application of software engineering lifecycle, UML modelling, hybrid intelligent systems, and empirical testing. Practically, it produces a working prototype that could be extended into a pilot system for a small institution by adding payment webhooks, production database hosting, and compliance controls.</w:t>
+        <w:t>Academically, the project applies the software engineering lifecycle, UML modelling, hybrid intelligent systems, security design, and empirical testing. Practically, it produces a working prototype extendable into a pilot system by adding payment webhooks, hardened DevOps, PCI-DSS assessment, and production monitoring.</w:t>
       </w:r>
     </w:p>
     <w:p>
@@ -522,7 +654,7 @@
           </w:tcPr>
           <w:p>
             <w:r>
-              <w:t>Requirements gathering, literature review</w:t>
+              <w:t>Requirements gathering, literature review, stakeholder analysis</w:t>
             </w:r>
           </w:p>
         </w:tc>
@@ -554,7 +686,7 @@
           </w:tcPr>
           <w:p>
             <w:r>
-              <w:t>System design (architecture, UML, ERD)</w:t>
+              <w:t>System design (architecture, UML, ERD, wireframes)</w:t>
             </w:r>
           </w:p>
         </w:tc>
@@ -586,7 +718,7 @@
           </w:tcPr>
           <w:p>
             <w:r>
-              <w:t>Backend API and database implementation</w:t>
+              <w:t>Backend API, PostgreSQL schema, migrations</w:t>
             </w:r>
           </w:p>
         </w:tc>
@@ -618,7 +750,7 @@
           </w:tcPr>
           <w:p>
             <w:r>
-              <w:t>ML training and fraud engine integration</w:t>
+              <w:t>ML training, fraud engine, ingest pipeline</w:t>
             </w:r>
           </w:p>
         </w:tc>
@@ -650,7 +782,7 @@
           </w:tcPr>
           <w:p>
             <w:r>
-              <w:t>Frontend dashboard and authentication</w:t>
+              <w:t>Next.js dashboard, RBAC, notifications, disputes</w:t>
             </w:r>
           </w:p>
         </w:tc>
@@ -682,7 +814,7 @@
           </w:tcPr>
           <w:p>
             <w:r>
-              <w:t>Testing, documentation, deployment</w:t>
+              <w:t>Integration testing, documentation, demo preparation</w:t>
             </w:r>
           </w:p>
         </w:tc>
@@ -709,7 +841,7 @@
     </w:p>
     <w:p>
       <w:r>
-        <w:t>Chapter 1 introduces the project. Chapter 2 reviews related systems and presents the proposed architecture. Chapter 3 covers methodology, requirements, UML, security, and logical design. Chapter 4 describes implementation, algorithms, testing, and results. Chapter 5 concludes with findings, limitations, lessons learned, and future work.</w:t>
+        <w:t>Chapter 1 introduces the problem, objectives, scope, and deliverables. Chapter 2 reviews related systems and presents the proposed architecture with component descriptions and diagrams. Chapter 3 covers methodology, requirements, UML models, security, process model, and logical designs. Chapter 4 describes implementation mapping, algorithms, construction evidence, testing, and results. Chapter 5 concludes with findings, limitations, lessons learned, future work, and commercialisation.</w:t>
       </w:r>
     </w:p>
     <w:p>
@@ -725,7 +857,7 @@
         <w:pStyle w:val="ListBullet"/>
       </w:pPr>
       <w:r>
-        <w:t>FraudShield web application (frontend and backend source code).</w:t>
+        <w:t>FraudShield web application (frontend and backend source code in this repository).</w:t>
       </w:r>
     </w:p>
     <w:p>
@@ -733,7 +865,7 @@
         <w:pStyle w:val="ListBullet"/>
       </w:pPr>
       <w:r>
-        <w:t>SQLite database with migrations and seed data.</w:t>
+        <w:t>PostgreSQL database schema with Flask-Migrate migrations and realistic seed data.</w:t>
       </w:r>
     </w:p>
     <w:p>
@@ -749,7 +881,7 @@
         <w:pStyle w:val="ListBullet"/>
       </w:pPr>
       <w:r>
-        <w:t>Technical documentation (this report).</w:t>
+        <w:t>This comprehensive project documentation (Word format).</w:t>
       </w:r>
     </w:p>
     <w:p>
@@ -757,7 +889,7 @@
         <w:pStyle w:val="ListBullet"/>
       </w:pPr>
       <w:r>
-        <w:t>User demo accounts and operational manual (README).</w:t>
+        <w:t>Operational manual and demo credentials (README.md, DEFENSE.md).</w:t>
       </w:r>
     </w:p>
     <w:p>
@@ -765,7 +897,15 @@
         <w:pStyle w:val="ListBullet"/>
       </w:pPr>
       <w:r>
-        <w:t>Test evidence and sample exported reports.</w:t>
+        <w:t>Generated UML and architecture diagrams embedded in this report.</w:t>
+      </w:r>
+    </w:p>
+    <w:p>
+      <w:pPr>
+        <w:pStyle w:val="ListBullet"/>
+      </w:pPr>
+      <w:r>
+        <w:t>Test evidence and sample exported reports (CSV, PDF, JSON).</w:t>
       </w:r>
     </w:p>
     <w:p>
@@ -799,7 +939,7 @@
     </w:p>
     <w:p>
       <w:r>
-        <w:t>In many institutions, flagged transactions are reviewed by analysts using spreadsheets and disconnected case tools. Features include case notes and phone verification. Pros: human judgment, low false positives on edge cases. Cons: slow, expensive, poor scalability, limited audit automation.</w:t>
+        <w:t>In many institutions, flagged transactions are reviewed by analysts using spreadsheets and disconnected case tools. Features include case notes and phone verification. Advantages: human judgment on edge cases. Disadvantages: slow throughput, high labour cost, poor scalability, limited automated audit trails.</w:t>
       </w:r>
     </w:p>
     <w:p>
@@ -807,12 +947,12 @@
         <w:pStyle w:val="Heading3"/>
       </w:pPr>
       <w:r>
-        <w:t>Rule-only engines (e.g. legacy ACS)</w:t>
+        <w:t>Rule-only engines</w:t>
       </w:r>
     </w:p>
     <w:p>
       <w:r>
-        <w:t>Authorization systems apply hard thresholds (amount limits, velocity counts, country blocks). Pros: fast, interpretable. Cons: high false positives, difficult to adapt, no personalised behavior.</w:t>
+        <w:t>Authorisation systems apply hard thresholds (amount limits, velocity counts, country blocks). Advantages: fast, interpretable, easy to configure. Disadvantages: high false-positive rates, difficulty adapting to individual spending patterns, no personalised behavioral baselines.</w:t>
       </w:r>
     </w:p>
     <w:p>
@@ -825,7 +965,7 @@
     </w:p>
     <w:p>
       <w:r>
-        <w:t>Modern vendors use gradient boosting or neural networks on large datasets. Pros: high accuracy potential. Cons: limited explainability, regulatory challenges, requires large labelled data.</w:t>
+        <w:t>Modern vendors use gradient boosting, random forests, or neural networks on large labelled datasets. Advantages: strong accuracy on historical patterns. Disadvantages: limited explainability, regulatory challenges, cold-start problems, dependency on large labelled data volumes.</w:t>
       </w:r>
     </w:p>
     <w:p>
@@ -833,12 +973,12 @@
         <w:pStyle w:val="Heading3"/>
       </w:pPr>
       <w:r>
-        <w:t>Commercial fraud platforms (FICO, SAS, Feedzai-class systems)</w:t>
+        <w:t>Commercial fraud platforms</w:t>
       </w:r>
     </w:p>
     <w:p>
       <w:r>
-        <w:t>Enterprise suites offer end-to-end case management, graph analytics, and model ops. Pros: mature, scalable. Cons: costly licences, closed source, long integration cycles—not feasible for academic prototype.</w:t>
+        <w:t>Enterprise suites (e.g. FICO Falcon-class, SAS Fraud Management, Feedzai) offer end-to-end case management, graph analytics, and model operations. Advantages: mature, scalable, compliance-ready. Disadvantages: costly licences, closed source, long integration cycles—not feasible for an academic prototype budget.</w:t>
       </w:r>
     </w:p>
     <w:p>
@@ -851,7 +991,7 @@
     </w:p>
     <w:p>
       <w:r>
-        <w:t>FraudShield proposes a hybrid, explainable, web-accessible platform: rules plus behavioral profiling plus ML probability, fused into a 0–100 risk score, with JWT-secured role-based UI and full audit trail.</w:t>
+        <w:t>FraudShield proposes a hybrid, explainable, web-accessible platform: deterministic rules plus behavioral profiling plus ML probability, fused into a 0–100 risk score, with JWT-secured role-based UI, dispute resolution workflow, admin rule toggles wired to the live engine, and comprehensive audit logging.</w:t>
       </w:r>
     </w:p>
     <w:p>
@@ -864,7 +1004,7 @@
     </w:p>
     <w:p>
       <w:r>
-        <w:t>Conceptually, the system is organised into Presentation (Next.js), Application/API (Flask blueprints), Domain Services (scoring, ingest, RBAC, simulator), and Data (SQLAlchemy models). External actors interact only with the presentation layer; all business logic resides on the server.</w:t>
+        <w:t>Conceptually, the system is organised into four layers: (1) Presentation—Next.js pages and components; (2) Application/API—Flask blueprints and route handlers; (3) Domain Services—scoring, ingest, RBAC, caching, simulator, reports; (4) Data—SQLAlchemy models backed by PostgreSQL. External actors interact only with the presentation layer; all business logic and scoring execute on the server to protect models and enforce authorisation.</w:t>
       </w:r>
     </w:p>
     <w:p>
@@ -885,7 +1025,7 @@
         <w:pStyle w:val="ListBullet"/>
       </w:pPr>
       <w:r>
-        <w:t>Presentation tier: Next.js 14 App Router, React components, Chart.js visualisations.</w:t>
+        <w:t>Presentation tier: Next.js 14 App Router, React 18, TypeScript, Tailwind CSS, Chart.js, Framer Motion.</w:t>
       </w:r>
     </w:p>
     <w:p>
@@ -893,7 +1033,7 @@
         <w:pStyle w:val="ListBullet"/>
       </w:pPr>
       <w:r>
-        <w:t>Application tier: Flask REST API with modular blueprints (auth, transactions, dashboard, admin, fraud, reports, alerts, users).</w:t>
+        <w:t>Application tier: Flask REST API with modular blueprints (auth, transactions, dashboard, admin, fraud, reports, alerts, disputes, users).</w:t>
       </w:r>
     </w:p>
     <w:p>
@@ -901,14 +1041,156 @@
         <w:pStyle w:val="ListBullet"/>
       </w:pPr>
       <w:r>
-        <w:t>Data tier: SQLite relational database accessed through SQLAlchemy ORM.</w:t>
+        <w:t>Data tier: PostgreSQL (Neon serverless or local) accessed through SQLAlchemy ORM and Flask-Migrate.</w:t>
       </w:r>
     </w:p>
     <w:p>
       <w:r>
-        <w:t>Figure 2.1 (System Architecture): [Browser] --HTTPS/JSON--&gt; [Flask API + JWT] --ORM--&gt; [SQLite]. Submodules: Fraud Engine (rules, behavior, ML), Transaction Ingest Service, Simulator Thread, Report Exporters.</w:t>
+        <w:drawing>
+          <wp:inline xmlns:a="http://schemas.openxmlformats.org/drawingml/2006/main" xmlns:pic="http://schemas.openxmlformats.org/drawingml/2006/picture">
+            <wp:extent cx="5486400" cy="3470424"/>
+            <wp:docPr id="1" name="Picture 1"/>
+            <wp:cNvGraphicFramePr>
+              <a:graphicFrameLocks noChangeAspect="1"/>
+            </wp:cNvGraphicFramePr>
+            <a:graphic>
+              <a:graphicData uri="http://schemas.openxmlformats.org/drawingml/2006/picture">
+                <pic:pic>
+                  <pic:nvPicPr>
+                    <pic:cNvPr id="0" name="fig_2_1_architecture.png"/>
+                    <pic:cNvPicPr/>
+                  </pic:nvPicPr>
+                  <pic:blipFill>
+                    <a:blip r:embed="rId9"/>
+                    <a:stretch>
+                      <a:fillRect/>
+                    </a:stretch>
+                  </pic:blipFill>
+                  <pic:spPr>
+                    <a:xfrm>
+                      <a:off x="0" y="0"/>
+                      <a:ext cx="5486400" cy="3470424"/>
+                    </a:xfrm>
+                    <a:prstGeom prst="rect"/>
+                  </pic:spPr>
+                </pic:pic>
+              </a:graphicData>
+            </a:graphic>
+          </wp:inline>
+        </w:drawing>
       </w:r>
     </w:p>
+    <w:p>
+      <w:pPr>
+        <w:jc w:val="center"/>
+      </w:pPr>
+      <w:r>
+        <w:rPr>
+          <w:i/>
+          <w:sz w:val="20"/>
+        </w:rPr>
+        <w:t>Figure 2.1: Three-tier system architecture of FraudShield</w:t>
+      </w:r>
+    </w:p>
+    <w:p/>
+    <w:p>
+      <w:r>
+        <w:drawing>
+          <wp:inline xmlns:a="http://schemas.openxmlformats.org/drawingml/2006/main" xmlns:pic="http://schemas.openxmlformats.org/drawingml/2006/picture">
+            <wp:extent cx="5486400" cy="2941115"/>
+            <wp:docPr id="2" name="Picture 2"/>
+            <wp:cNvGraphicFramePr>
+              <a:graphicFrameLocks noChangeAspect="1"/>
+            </wp:cNvGraphicFramePr>
+            <a:graphic>
+              <a:graphicData uri="http://schemas.openxmlformats.org/drawingml/2006/picture">
+                <pic:pic>
+                  <pic:nvPicPr>
+                    <pic:cNvPr id="0" name="fig_2_3_data_flow.png"/>
+                    <pic:cNvPicPr/>
+                  </pic:nvPicPr>
+                  <pic:blipFill>
+                    <a:blip r:embed="rId10"/>
+                    <a:stretch>
+                      <a:fillRect/>
+                    </a:stretch>
+                  </pic:blipFill>
+                  <pic:spPr>
+                    <a:xfrm>
+                      <a:off x="0" y="0"/>
+                      <a:ext cx="5486400" cy="2941115"/>
+                    </a:xfrm>
+                    <a:prstGeom prst="rect"/>
+                  </pic:spPr>
+                </pic:pic>
+              </a:graphicData>
+            </a:graphic>
+          </wp:inline>
+        </w:drawing>
+      </w:r>
+    </w:p>
+    <w:p>
+      <w:pPr>
+        <w:jc w:val="center"/>
+      </w:pPr>
+      <w:r>
+        <w:rPr>
+          <w:i/>
+          <w:sz w:val="20"/>
+        </w:rPr>
+        <w:t>Figure 2.2: Data flow through the transaction lifecycle</w:t>
+      </w:r>
+    </w:p>
+    <w:p/>
+    <w:p>
+      <w:r>
+        <w:drawing>
+          <wp:inline xmlns:a="http://schemas.openxmlformats.org/drawingml/2006/main" xmlns:pic="http://schemas.openxmlformats.org/drawingml/2006/picture">
+            <wp:extent cx="5486400" cy="4004336"/>
+            <wp:docPr id="3" name="Picture 3"/>
+            <wp:cNvGraphicFramePr>
+              <a:graphicFrameLocks noChangeAspect="1"/>
+            </wp:cNvGraphicFramePr>
+            <a:graphic>
+              <a:graphicData uri="http://schemas.openxmlformats.org/drawingml/2006/picture">
+                <pic:pic>
+                  <pic:nvPicPr>
+                    <pic:cNvPr id="0" name="fig_2_2_components.png"/>
+                    <pic:cNvPicPr/>
+                  </pic:nvPicPr>
+                  <pic:blipFill>
+                    <a:blip r:embed="rId11"/>
+                    <a:stretch>
+                      <a:fillRect/>
+                    </a:stretch>
+                  </pic:blipFill>
+                  <pic:spPr>
+                    <a:xfrm>
+                      <a:off x="0" y="0"/>
+                      <a:ext cx="5486400" cy="4004336"/>
+                    </a:xfrm>
+                    <a:prstGeom prst="rect"/>
+                  </pic:spPr>
+                </pic:pic>
+              </a:graphicData>
+            </a:graphic>
+          </wp:inline>
+        </w:drawing>
+      </w:r>
+    </w:p>
+    <w:p>
+      <w:pPr>
+        <w:jc w:val="center"/>
+      </w:pPr>
+      <w:r>
+        <w:rPr>
+          <w:i/>
+          <w:sz w:val="20"/>
+        </w:rPr>
+        <w:t>Figure 2.3: Major software components and dependencies</w:t>
+      </w:r>
+    </w:p>
+    <w:p/>
     <w:p>
       <w:pPr>
         <w:pStyle w:val="Heading2"/>
@@ -927,7 +1209,7 @@
     </w:p>
     <w:p>
       <w:r>
-        <w:t>Handles registration, login, password reset via OTP, and JWT issuance. Passwords are hashed with bcrypt. Tokens carry user id and role claims consumed by protected routes.</w:t>
+        <w:t>Handles registration, login, password reset via OTP, optional Google/GitHub OAuth, and JWT issuance. Passwords are hashed with bcrypt. Tokens carry user id and role claims consumed by protected routes. A lightweight session cookie supports Next.js middleware redirects.</w:t>
       </w:r>
     </w:p>
     <w:p>
@@ -940,7 +1222,7 @@
     </w:p>
     <w:p>
       <w:r>
-        <w:t>Receives transaction payloads, invokes evaluate_transaction(), persists Transaction and FraudDecision rows, updates UserProfile aggregates, writes AuditLog, and triggers alerts when risk_score &gt;= 60.</w:t>
+        <w:t>Centralised in transaction_ingest.py. Receives transaction payloads, invokes evaluate_transaction(), persists Transaction and FraudDecision rows, updates UserProfile aggregates, writes AuditLog, invalidates read caches, and triggers alerts when risk_score &gt;= 60.</w:t>
       </w:r>
     </w:p>
     <w:p>
@@ -953,7 +1235,7 @@
     </w:p>
     <w:p>
       <w:r>
-        <w:t>Orchestrates three scorers: (1) Rule engine checks amount, velocity, location change; (2) Behavior engine compares against profile averages and location history; (3) ML model predicts fraud probability from amount, frequency, and time-since-last features. Scores are summed and capped at 100.</w:t>
+        <w:t>Orchestrates three scorers in fraud/engine.py: (1) Rule engine—amount thresholds, velocity, location change, admin-configurable FraudRule catalog; (2) Behavior engine—profile averages and location history; (3) ML model—predicts fraud probability from amount, 10-minute frequency, and minutes since last transaction. Scores are summed and capped at 100.</w:t>
       </w:r>
     </w:p>
     <w:p>
@@ -966,7 +1248,20 @@
     </w:p>
     <w:p>
       <w:r>
-        <w:t>Aggregates transaction statistics for charts and KPIs. Applies scope_transactions() so cardholders see only their own data while staff see global aggregates.</w:t>
+        <w:t>Aggregates transaction statistics via dashboard_stats.py for charts and KPIs. Applies RBAC scoping so cardholders see only their own data while analysts and admins see global aggregates. Public landing stats available via GET /public/stats.</w:t>
+      </w:r>
+    </w:p>
+    <w:p>
+      <w:pPr>
+        <w:pStyle w:val="Heading3"/>
+      </w:pPr>
+      <w:r>
+        <w:t>Disputes Component</w:t>
+      </w:r>
+    </w:p>
+    <w:p>
+      <w:r>
+        <w:t>Allows cardholders to open dispute cases on flagged transactions; analysts and admins review, approve, or reject with resolution notes. Status tracked in DisputeCase entity linked 1:1 to Transaction.</w:t>
       </w:r>
     </w:p>
     <w:p>
@@ -979,7 +1274,7 @@
     </w:p>
     <w:p>
       <w:r>
-        <w:t>Allows administrators to list users, change roles, suspend accounts, toggle fraud rules in catalog, and queue model retrain stub with audit logging.</w:t>
+        <w:t>Administrators list users, change roles, suspend accounts, toggle fraud rules (wired to live rule engine), reseed realistic demo data, and trigger model retrain stub with audit logging.</w:t>
       </w:r>
     </w:p>
     <w:p>
@@ -992,7 +1287,7 @@
     </w:p>
     <w:p>
       <w:r>
-        <w:t>Exports CSV transaction dumps, JSON summaries, audit JSON, and PDF summary using fpdf2 library.</w:t>
+        <w:t>Exports CSV transaction dumps, JSON summaries, audit JSON, and PDF summary reports using fpdf2.</w:t>
       </w:r>
     </w:p>
     <w:p>
@@ -1048,7 +1343,7 @@
           </w:tcPr>
           <w:p>
             <w:r>
-              <w:t>User registration &amp; login</w:t>
+              <w:t>Landing page</w:t>
             </w:r>
           </w:p>
         </w:tc>
@@ -1058,7 +1353,7 @@
           </w:tcPr>
           <w:p>
             <w:r>
-              <w:t>Email/password auth with role selection</w:t>
+              <w:t>Product overview, public stats, login/register CTAs</w:t>
             </w:r>
           </w:p>
         </w:tc>
@@ -1070,7 +1365,7 @@
           </w:tcPr>
           <w:p>
             <w:r>
-              <w:t>RBAC</w:t>
+              <w:t>Auth &amp; OAuth</w:t>
             </w:r>
           </w:p>
         </w:tc>
@@ -1080,7 +1375,7 @@
           </w:tcPr>
           <w:p>
             <w:r>
-              <w:t>Cardholder, analyst, admin roles</w:t>
+              <w:t>Email/password, JWT, optional Google/GitHub sign-in</w:t>
             </w:r>
           </w:p>
         </w:tc>
@@ -1092,7 +1387,7 @@
           </w:tcPr>
           <w:p>
             <w:r>
-              <w:t>Transaction capture</w:t>
+              <w:t>RBAC</w:t>
             </w:r>
           </w:p>
         </w:tc>
@@ -1102,7 +1397,7 @@
           </w:tcPr>
           <w:p>
             <w:r>
-              <w:t>Manual ingest and simulator stream</w:t>
+              <w:t>Cardholder, analyst, admin roles with route guards</w:t>
             </w:r>
           </w:p>
         </w:tc>
@@ -1114,7 +1409,7 @@
           </w:tcPr>
           <w:p>
             <w:r>
-              <w:t>Hybrid fraud scoring</w:t>
+              <w:t>Transaction capture</w:t>
             </w:r>
           </w:p>
         </w:tc>
@@ -1124,7 +1419,7 @@
           </w:tcPr>
           <w:p>
             <w:r>
-              <w:t>Rules + behavior + ML</w:t>
+              <w:t>Manual ingest, API, live 30s simulator (staff)</w:t>
             </w:r>
           </w:p>
         </w:tc>
@@ -1136,7 +1431,7 @@
           </w:tcPr>
           <w:p>
             <w:r>
-              <w:t>Explainability</w:t>
+              <w:t>Hybrid fraud scoring</w:t>
             </w:r>
           </w:p>
         </w:tc>
@@ -1146,7 +1441,7 @@
           </w:tcPr>
           <w:p>
             <w:r>
-              <w:t>Feature contribution breakdown per transaction</w:t>
+              <w:t>Rules + behavior + ML with confidence %</w:t>
             </w:r>
           </w:p>
         </w:tc>
@@ -1158,7 +1453,7 @@
           </w:tcPr>
           <w:p>
             <w:r>
-              <w:t>Monitoring &amp; flagged queue</w:t>
+              <w:t>Explainability</w:t>
             </w:r>
           </w:p>
         </w:tc>
@@ -1168,7 +1463,7 @@
           </w:tcPr>
           <w:p>
             <w:r>
-              <w:t>Search, filter, approve/flag/freeze actions</w:t>
+              <w:t>Feature contribution breakdown per transaction</w:t>
             </w:r>
           </w:p>
         </w:tc>
@@ -1180,7 +1475,7 @@
           </w:tcPr>
           <w:p>
             <w:r>
-              <w:t>Dashboard analytics</w:t>
+              <w:t>Monitoring &amp; flagged queue</w:t>
             </w:r>
           </w:p>
         </w:tc>
@@ -1190,7 +1485,7 @@
           </w:tcPr>
           <w:p>
             <w:r>
-              <w:t>Charts, heatmap, KPI cards</w:t>
+              <w:t>Search, filter, approve/flag/freeze actions</w:t>
             </w:r>
           </w:p>
         </w:tc>
@@ -1202,7 +1497,7 @@
           </w:tcPr>
           <w:p>
             <w:r>
-              <w:t>Alerts &amp; notifications</w:t>
+              <w:t>Disputes workflow</w:t>
             </w:r>
           </w:p>
         </w:tc>
@@ -1212,7 +1507,7 @@
           </w:tcPr>
           <w:p>
             <w:r>
-              <w:t>In-app feed, email log, sound/toast on new tx</w:t>
+              <w:t>Open, review, resolve cardholder disputes</w:t>
             </w:r>
           </w:p>
         </w:tc>
@@ -1224,7 +1519,7 @@
           </w:tcPr>
           <w:p>
             <w:r>
-              <w:t>Reports</w:t>
+              <w:t>Dashboard analytics</w:t>
             </w:r>
           </w:p>
         </w:tc>
@@ -1234,7 +1529,7 @@
           </w:tcPr>
           <w:p>
             <w:r>
-              <w:t>CSV, PDF, JSON exports</w:t>
+              <w:t>KPI cards, line/bar charts, heatmap, activity feed</w:t>
             </w:r>
           </w:p>
         </w:tc>
@@ -1246,6 +1541,50 @@
           </w:tcPr>
           <w:p>
             <w:r>
+              <w:t>Alerts &amp; notifications</w:t>
+            </w:r>
+          </w:p>
+        </w:tc>
+        <w:tc>
+          <w:tcPr>
+            <w:tcW w:type="dxa" w:w="4320"/>
+          </w:tcPr>
+          <w:p>
+            <w:r>
+              <w:t>In-app feed, toast/sound on new transactions</w:t>
+            </w:r>
+          </w:p>
+        </w:tc>
+      </w:tr>
+      <w:tr>
+        <w:tc>
+          <w:tcPr>
+            <w:tcW w:type="dxa" w:w="4320"/>
+          </w:tcPr>
+          <w:p>
+            <w:r>
+              <w:t>Reports</w:t>
+            </w:r>
+          </w:p>
+        </w:tc>
+        <w:tc>
+          <w:tcPr>
+            <w:tcW w:type="dxa" w:w="4320"/>
+          </w:tcPr>
+          <w:p>
+            <w:r>
+              <w:t>CSV, PDF, JSON exports for auditors</w:t>
+            </w:r>
+          </w:p>
+        </w:tc>
+      </w:tr>
+      <w:tr>
+        <w:tc>
+          <w:tcPr>
+            <w:tcW w:type="dxa" w:w="4320"/>
+          </w:tcPr>
+          <w:p>
+            <w:r>
               <w:t>Admin console</w:t>
             </w:r>
           </w:p>
@@ -1256,7 +1595,7 @@
           </w:tcPr>
           <w:p>
             <w:r>
-              <w:t>User and rule management</w:t>
+              <w:t>Users, rules, reseed, model ops stub</w:t>
             </w:r>
           </w:p>
         </w:tc>
@@ -1271,46 +1610,200 @@
         <w:t>Development Tools and Environment</w:t>
       </w:r>
     </w:p>
-    <w:p>
-      <w:pPr>
-        <w:pStyle w:val="ListBullet"/>
-      </w:pPr>
-      <w:r>
-        <w:t>Python 3.x, Flask, SQLAlchemy, Flask-JWT-Extended, Marshmallow</w:t>
-      </w:r>
-    </w:p>
-    <w:p>
-      <w:pPr>
-        <w:pStyle w:val="ListBullet"/>
-      </w:pPr>
-      <w:r>
-        <w:t>Node.js, Next.js 14, TypeScript, Tailwind CSS</w:t>
-      </w:r>
-    </w:p>
-    <w:p>
-      <w:pPr>
-        <w:pStyle w:val="ListBullet"/>
-      </w:pPr>
-      <w:r>
-        <w:t>scikit-learn, pandas, joblib for ML</w:t>
-      </w:r>
-    </w:p>
-    <w:p>
-      <w:pPr>
-        <w:pStyle w:val="ListBullet"/>
-      </w:pPr>
-      <w:r>
-        <w:t>Visual Studio Code / Cursor IDE, Git, Postman/browser devtools</w:t>
-      </w:r>
-    </w:p>
-    <w:p>
-      <w:pPr>
-        <w:pStyle w:val="ListBullet"/>
-      </w:pPr>
-      <w:r>
-        <w:t>SQLite, Flask-Migrate</w:t>
-      </w:r>
-    </w:p>
+    <w:tbl>
+      <w:tblPr>
+        <w:tblStyle w:val="TableGrid"/>
+        <w:tblW w:type="auto" w:w="0"/>
+        <w:tblLook w:firstColumn="1" w:firstRow="1" w:lastColumn="0" w:lastRow="0" w:noHBand="0" w:noVBand="1" w:val="04A0"/>
+      </w:tblPr>
+      <w:tblGrid>
+        <w:gridCol w:w="4320"/>
+        <w:gridCol w:w="4320"/>
+      </w:tblGrid>
+      <w:tr>
+        <w:tc>
+          <w:tcPr>
+            <w:tcW w:type="dxa" w:w="4320"/>
+          </w:tcPr>
+          <w:p>
+            <w:r>
+              <w:rPr>
+                <w:b/>
+              </w:rPr>
+              <w:t>Category</w:t>
+            </w:r>
+          </w:p>
+        </w:tc>
+        <w:tc>
+          <w:tcPr>
+            <w:tcW w:type="dxa" w:w="4320"/>
+          </w:tcPr>
+          <w:p>
+            <w:r>
+              <w:rPr>
+                <w:b/>
+              </w:rPr>
+              <w:t>Tools / Versions</w:t>
+            </w:r>
+          </w:p>
+        </w:tc>
+      </w:tr>
+      <w:tr>
+        <w:tc>
+          <w:tcPr>
+            <w:tcW w:type="dxa" w:w="4320"/>
+          </w:tcPr>
+          <w:p>
+            <w:r>
+              <w:t>Backend</w:t>
+            </w:r>
+          </w:p>
+        </w:tc>
+        <w:tc>
+          <w:tcPr>
+            <w:tcW w:type="dxa" w:w="4320"/>
+          </w:tcPr>
+          <w:p>
+            <w:r>
+              <w:t>Python 3.x, Flask, SQLAlchemy, Flask-JWT-Extended, Marshmallow, Flask-Migrate</w:t>
+            </w:r>
+          </w:p>
+        </w:tc>
+      </w:tr>
+      <w:tr>
+        <w:tc>
+          <w:tcPr>
+            <w:tcW w:type="dxa" w:w="4320"/>
+          </w:tcPr>
+          <w:p>
+            <w:r>
+              <w:t>Database</w:t>
+            </w:r>
+          </w:p>
+        </w:tc>
+        <w:tc>
+          <w:tcPr>
+            <w:tcW w:type="dxa" w:w="4320"/>
+          </w:tcPr>
+          <w:p>
+            <w:r>
+              <w:t>PostgreSQL (Neon), psycopg2-binary</w:t>
+            </w:r>
+          </w:p>
+        </w:tc>
+      </w:tr>
+      <w:tr>
+        <w:tc>
+          <w:tcPr>
+            <w:tcW w:type="dxa" w:w="4320"/>
+          </w:tcPr>
+          <w:p>
+            <w:r>
+              <w:t>ML</w:t>
+            </w:r>
+          </w:p>
+        </w:tc>
+        <w:tc>
+          <w:tcPr>
+            <w:tcW w:type="dxa" w:w="4320"/>
+          </w:tcPr>
+          <w:p>
+            <w:r>
+              <w:t>scikit-learn, pandas, imbalanced-learn, joblib, numpy</w:t>
+            </w:r>
+          </w:p>
+        </w:tc>
+      </w:tr>
+      <w:tr>
+        <w:tc>
+          <w:tcPr>
+            <w:tcW w:type="dxa" w:w="4320"/>
+          </w:tcPr>
+          <w:p>
+            <w:r>
+              <w:t>Frontend</w:t>
+            </w:r>
+          </w:p>
+        </w:tc>
+        <w:tc>
+          <w:tcPr>
+            <w:tcW w:type="dxa" w:w="4320"/>
+          </w:tcPr>
+          <w:p>
+            <w:r>
+              <w:t>Node.js, Next.js 14, TypeScript, Tailwind CSS, Chart.js, Framer Motion</w:t>
+            </w:r>
+          </w:p>
+        </w:tc>
+      </w:tr>
+      <w:tr>
+        <w:tc>
+          <w:tcPr>
+            <w:tcW w:type="dxa" w:w="4320"/>
+          </w:tcPr>
+          <w:p>
+            <w:r>
+              <w:t>Reports</w:t>
+            </w:r>
+          </w:p>
+        </w:tc>
+        <w:tc>
+          <w:tcPr>
+            <w:tcW w:type="dxa" w:w="4320"/>
+          </w:tcPr>
+          <w:p>
+            <w:r>
+              <w:t>fpdf2 for PDF generation</w:t>
+            </w:r>
+          </w:p>
+        </w:tc>
+      </w:tr>
+      <w:tr>
+        <w:tc>
+          <w:tcPr>
+            <w:tcW w:type="dxa" w:w="4320"/>
+          </w:tcPr>
+          <w:p>
+            <w:r>
+              <w:t>IDE / VCS</w:t>
+            </w:r>
+          </w:p>
+        </w:tc>
+        <w:tc>
+          <w:tcPr>
+            <w:tcW w:type="dxa" w:w="4320"/>
+          </w:tcPr>
+          <w:p>
+            <w:r>
+              <w:t>Visual Studio Code / Cursor, Git</w:t>
+            </w:r>
+          </w:p>
+        </w:tc>
+      </w:tr>
+      <w:tr>
+        <w:tc>
+          <w:tcPr>
+            <w:tcW w:type="dxa" w:w="4320"/>
+          </w:tcPr>
+          <w:p>
+            <w:r>
+              <w:t>Testing</w:t>
+            </w:r>
+          </w:p>
+        </w:tc>
+        <w:tc>
+          <w:tcPr>
+            <w:tcW w:type="dxa" w:w="4320"/>
+          </w:tcPr>
+          <w:p>
+            <w:r>
+              <w:t>Browser devtools, Postman-style API calls, manual role-based flows</w:t>
+            </w:r>
+          </w:p>
+        </w:tc>
+      </w:tr>
+    </w:tbl>
+    <w:p/>
     <w:p>
       <w:pPr>
         <w:pStyle w:val="Heading2"/>
@@ -1324,7 +1817,7 @@
         <w:pStyle w:val="ListBullet"/>
       </w:pPr>
       <w:r>
-        <w:t>Faster detection through automated scoring on every ingest.</w:t>
+        <w:t>Faster detection through automated hybrid scoring on every ingest.</w:t>
       </w:r>
     </w:p>
     <w:p>
@@ -1332,7 +1825,7 @@
         <w:pStyle w:val="ListBullet"/>
       </w:pPr>
       <w:r>
-        <w:t>Improved analyst efficiency via prioritised flagged queue and explainability.</w:t>
+        <w:t>Improved analyst efficiency via prioritised flagged queue, explainability, and disputes.</w:t>
       </w:r>
     </w:p>
     <w:p>
@@ -1340,7 +1833,7 @@
         <w:pStyle w:val="ListBullet"/>
       </w:pPr>
       <w:r>
-        <w:t>Transparent decisions with stored rule/behavior/ML breakdown.</w:t>
+        <w:t>Transparent decisions with stored rule/behavior/ML breakdown per transaction.</w:t>
       </w:r>
     </w:p>
     <w:p>
@@ -1348,7 +1841,7 @@
         <w:pStyle w:val="ListBullet"/>
       </w:pPr>
       <w:r>
-        <w:t>Lower cost than enterprise suites for teaching and pilot deployment.</w:t>
+        <w:t>Lower cost than enterprise suites for teaching, research, and pilot deployment.</w:t>
       </w:r>
     </w:p>
     <w:p>
@@ -1356,7 +1849,15 @@
         <w:pStyle w:val="ListBullet"/>
       </w:pPr>
       <w:r>
-        <w:t>Extensible modular codebase for future payment integration.</w:t>
+        <w:t>Extensible modular codebase for future payment webhook integration.</w:t>
+      </w:r>
+    </w:p>
+    <w:p>
+      <w:pPr>
+        <w:pStyle w:val="ListBullet"/>
+      </w:pPr>
+      <w:r>
+        <w:t>Cloud-ready PostgreSQL supports realistic deployment scenarios beyond local SQLite demos.</w:t>
       </w:r>
     </w:p>
     <w:p>
@@ -1382,7 +1883,7 @@
     </w:p>
     <w:p>
       <w:r>
-        <w:t>This chapter presents requirements engineering, stakeholders, functional and non-functional requirements, UML models, security design, chosen process model, and logical designs (UI and database).</w:t>
+        <w:t>This chapter presents requirements engineering, stakeholders, functional and non-functional requirements, UML models with diagrams, security design, the chosen Agile process model, and logical designs including UI wireframes and database schema.</w:t>
       </w:r>
     </w:p>
     <w:p>
@@ -1456,7 +1957,7 @@
           </w:tcPr>
           <w:p>
             <w:r>
-              <w:t>Submit transactions, view own risk activity</w:t>
+              <w:t>Submit transactions, view own risk activity, open disputes</w:t>
             </w:r>
           </w:p>
         </w:tc>
@@ -1478,7 +1979,7 @@
           </w:tcPr>
           <w:p>
             <w:r>
-              <w:t>Monitor, investigate, export reports</w:t>
+              <w:t>Monitor queues, investigate, explain, resolve disputes, export reports</w:t>
             </w:r>
           </w:p>
         </w:tc>
@@ -1500,7 +2001,7 @@
           </w:tcPr>
           <w:p>
             <w:r>
-              <w:t>Manage users, rules, system health</w:t>
+              <w:t>Manage users, rules, seed data, system health</w:t>
             </w:r>
           </w:p>
         </w:tc>
@@ -1522,7 +2023,7 @@
           </w:tcPr>
           <w:p>
             <w:r>
-              <w:t>Maintain and extend codebase</w:t>
+              <w:t>Maintain, extend, and deploy codebase</w:t>
             </w:r>
           </w:p>
         </w:tc>
@@ -1534,7 +2035,7 @@
           </w:tcPr>
           <w:p>
             <w:r>
-              <w:t>Examiner/supervisor</w:t>
+              <w:t>Examiner / supervisor</w:t>
             </w:r>
           </w:p>
         </w:tc>
@@ -1544,7 +2045,7 @@
           </w:tcPr>
           <w:p>
             <w:r>
-              <w:t>Evaluate academic deliverables</w:t>
+              <w:t>Evaluate academic deliverables and demonstration</w:t>
             </w:r>
           </w:p>
         </w:tc>
@@ -1561,7 +2062,7 @@
     </w:p>
     <w:p>
       <w:r>
-        <w:t>Requirements were gathered through review of fraud detection literature, analysis of commercial platform features, supervisor consultation, and iterative prototyping with demo scenarios (manual ingest, simulator, role-based navigation).</w:t>
+        <w:t>Requirements were gathered through: (1) review of fraud detection literature and industry reports; (2) analysis of commercial platform feature sets; (3) supervisor consultation; (4) iterative prototyping with demo scenarios (manual ingest, simulator, role-based navigation, dispute flows); (5) feedback from test users using seeded demo accounts.</w:t>
       </w:r>
     </w:p>
     <w:p>
@@ -1627,7 +2128,7 @@
           </w:tcPr>
           <w:p>
             <w:r>
-              <w:t>System shall allow users to register and authenticate securely</w:t>
+              <w:t>System shall allow users to register, login, and recover passwords securely</w:t>
             </w:r>
           </w:p>
         </w:tc>
@@ -1649,7 +2150,7 @@
           </w:tcPr>
           <w:p>
             <w:r>
-              <w:t>System shall ingest transactions with merchant, location, amount, device metadata</w:t>
+              <w:t>System shall support optional OAuth sign-in (Google, GitHub)</w:t>
             </w:r>
           </w:p>
         </w:tc>
@@ -1671,7 +2172,7 @@
           </w:tcPr>
           <w:p>
             <w:r>
-              <w:t>System shall compute and store fraud risk score 0–100 per transaction</w:t>
+              <w:t>System shall ingest transactions with merchant, location, amount, device metadata</w:t>
             </w:r>
           </w:p>
         </w:tc>
@@ -1693,7 +2194,7 @@
           </w:tcPr>
           <w:p>
             <w:r>
-              <w:t>System shall flag transactions when score &gt;= 60</w:t>
+              <w:t>System shall compute and store fraud risk score 0–100 and ML confidence per transaction</w:t>
             </w:r>
           </w:p>
         </w:tc>
@@ -1715,7 +2216,7 @@
           </w:tcPr>
           <w:p>
             <w:r>
-              <w:t>Analysts shall search and filter transaction lists</w:t>
+              <w:t>System shall flag transactions when score &gt;= 60</w:t>
             </w:r>
           </w:p>
         </w:tc>
@@ -1737,7 +2238,7 @@
           </w:tcPr>
           <w:p>
             <w:r>
-              <w:t>Analysts shall approve, flag, or freeze accounts on transactions</w:t>
+              <w:t>Analysts shall search, filter, and action transaction lists (approve/flag/freeze)</w:t>
             </w:r>
           </w:p>
         </w:tc>
@@ -1781,7 +2282,7 @@
           </w:tcPr>
           <w:p>
             <w:r>
-              <w:t>Admins shall manage user roles and activation status</w:t>
+              <w:t>Cardholders shall open and track dispute cases on flagged transactions</w:t>
             </w:r>
           </w:p>
         </w:tc>
@@ -1803,7 +2304,7 @@
           </w:tcPr>
           <w:p>
             <w:r>
-              <w:t>System shall export CSV/PDF/JSON reports</w:t>
+              <w:t>Analysts shall resolve disputes with approve/reject and resolution notes</w:t>
             </w:r>
           </w:p>
         </w:tc>
@@ -1825,7 +2326,73 @@
           </w:tcPr>
           <w:p>
             <w:r>
-              <w:t>Cardholders shall only access their own transaction data</w:t>
+              <w:t>Admins shall manage user roles, activation, and fraud rule toggles</w:t>
+            </w:r>
+          </w:p>
+        </w:tc>
+      </w:tr>
+      <w:tr>
+        <w:tc>
+          <w:tcPr>
+            <w:tcW w:type="dxa" w:w="4320"/>
+          </w:tcPr>
+          <w:p>
+            <w:r>
+              <w:t>FR11</w:t>
+            </w:r>
+          </w:p>
+        </w:tc>
+        <w:tc>
+          <w:tcPr>
+            <w:tcW w:type="dxa" w:w="4320"/>
+          </w:tcPr>
+          <w:p>
+            <w:r>
+              <w:t>System shall export CSV, PDF, and JSON reports</w:t>
+            </w:r>
+          </w:p>
+        </w:tc>
+      </w:tr>
+      <w:tr>
+        <w:tc>
+          <w:tcPr>
+            <w:tcW w:type="dxa" w:w="4320"/>
+          </w:tcPr>
+          <w:p>
+            <w:r>
+              <w:t>FR12</w:t>
+            </w:r>
+          </w:p>
+        </w:tc>
+        <w:tc>
+          <w:tcPr>
+            <w:tcW w:type="dxa" w:w="4320"/>
+          </w:tcPr>
+          <w:p>
+            <w:r>
+              <w:t>Cardholders shall only access their own transaction and dispute data</w:t>
+            </w:r>
+          </w:p>
+        </w:tc>
+      </w:tr>
+      <w:tr>
+        <w:tc>
+          <w:tcPr>
+            <w:tcW w:type="dxa" w:w="4320"/>
+          </w:tcPr>
+          <w:p>
+            <w:r>
+              <w:t>FR13</w:t>
+            </w:r>
+          </w:p>
+        </w:tc>
+        <w:tc>
+          <w:tcPr>
+            <w:tcW w:type="dxa" w:w="4320"/>
+          </w:tcPr>
+          <w:p>
+            <w:r>
+              <w:t>Staff shall run live transaction simulator and reseed demo data</w:t>
             </w:r>
           </w:p>
         </w:tc>
@@ -1841,36 +2408,250 @@
       </w:r>
     </w:p>
     <w:p>
-      <w:pPr>
-        <w:pStyle w:val="Heading3"/>
-      </w:pPr>
       <w:r>
-        <w:t>Use Case Diagram – System Overview</w:t>
+        <w:drawing>
+          <wp:inline xmlns:a="http://schemas.openxmlformats.org/drawingml/2006/main" xmlns:pic="http://schemas.openxmlformats.org/drawingml/2006/picture">
+            <wp:extent cx="5486400" cy="3649211"/>
+            <wp:docPr id="4" name="Picture 4"/>
+            <wp:cNvGraphicFramePr>
+              <a:graphicFrameLocks noChangeAspect="1"/>
+            </wp:cNvGraphicFramePr>
+            <a:graphic>
+              <a:graphicData uri="http://schemas.openxmlformats.org/drawingml/2006/picture">
+                <pic:pic>
+                  <pic:nvPicPr>
+                    <pic:cNvPr id="0" name="fig_3_1_use_case.png"/>
+                    <pic:cNvPicPr/>
+                  </pic:nvPicPr>
+                  <pic:blipFill>
+                    <a:blip r:embed="rId12"/>
+                    <a:stretch>
+                      <a:fillRect/>
+                    </a:stretch>
+                  </pic:blipFill>
+                  <pic:spPr>
+                    <a:xfrm>
+                      <a:off x="0" y="0"/>
+                      <a:ext cx="5486400" cy="3649211"/>
+                    </a:xfrm>
+                    <a:prstGeom prst="rect"/>
+                  </pic:spPr>
+                </pic:pic>
+              </a:graphicData>
+            </a:graphic>
+          </wp:inline>
+        </w:drawing>
       </w:r>
     </w:p>
     <w:p>
+      <w:pPr>
+        <w:jc w:val="center"/>
+      </w:pPr>
       <w:r>
-        <w:t>Actors: Cardholder, Fraud Analyst, Administrator, External Payment Source (conceptual). Use cases: Register, Login, Ingest Transaction, View Dashboard, Monitor Transactions, Review Flagged Queue, Run Fraud Simulation, Explain Transaction, Export Reports, Manage Users, Manage Rules, Start Simulator.</w:t>
+        <w:rPr>
+          <w:i/>
+          <w:sz w:val="20"/>
+        </w:rPr>
+        <w:t>Figure 3.1: Use case diagram — actors and primary use cases</w:t>
+      </w:r>
+    </w:p>
+    <w:p/>
+    <w:p>
+      <w:r>
+        <w:drawing>
+          <wp:inline xmlns:a="http://schemas.openxmlformats.org/drawingml/2006/main" xmlns:pic="http://schemas.openxmlformats.org/drawingml/2006/picture">
+            <wp:extent cx="5486400" cy="6956687"/>
+            <wp:docPr id="5" name="Picture 5"/>
+            <wp:cNvGraphicFramePr>
+              <a:graphicFrameLocks noChangeAspect="1"/>
+            </wp:cNvGraphicFramePr>
+            <a:graphic>
+              <a:graphicData uri="http://schemas.openxmlformats.org/drawingml/2006/picture">
+                <pic:pic>
+                  <pic:nvPicPr>
+                    <pic:cNvPr id="0" name="fig_3_2_activity_ingest.png"/>
+                    <pic:cNvPicPr/>
+                  </pic:nvPicPr>
+                  <pic:blipFill>
+                    <a:blip r:embed="rId13"/>
+                    <a:stretch>
+                      <a:fillRect/>
+                    </a:stretch>
+                  </pic:blipFill>
+                  <pic:spPr>
+                    <a:xfrm>
+                      <a:off x="0" y="0"/>
+                      <a:ext cx="5486400" cy="6956687"/>
+                    </a:xfrm>
+                    <a:prstGeom prst="rect"/>
+                  </pic:spPr>
+                </pic:pic>
+              </a:graphicData>
+            </a:graphic>
+          </wp:inline>
+        </w:drawing>
       </w:r>
     </w:p>
     <w:p>
+      <w:pPr>
+        <w:jc w:val="center"/>
+      </w:pPr>
       <w:r>
-        <w:t>Figure 3.1: Use Case Diagram – insert diagram showing actors linked to use cases.</w:t>
+        <w:rPr>
+          <w:i/>
+          <w:sz w:val="20"/>
+        </w:rPr>
+        <w:t>Figure 3.2: Activity diagram — transaction ingest pipeline</w:t>
+      </w:r>
+    </w:p>
+    <w:p/>
+    <w:p>
+      <w:r>
+        <w:drawing>
+          <wp:inline xmlns:a="http://schemas.openxmlformats.org/drawingml/2006/main" xmlns:pic="http://schemas.openxmlformats.org/drawingml/2006/picture">
+            <wp:extent cx="5486400" cy="4004336"/>
+            <wp:docPr id="6" name="Picture 6"/>
+            <wp:cNvGraphicFramePr>
+              <a:graphicFrameLocks noChangeAspect="1"/>
+            </wp:cNvGraphicFramePr>
+            <a:graphic>
+              <a:graphicData uri="http://schemas.openxmlformats.org/drawingml/2006/picture">
+                <pic:pic>
+                  <pic:nvPicPr>
+                    <pic:cNvPr id="0" name="fig_3_3_sequence_login.png"/>
+                    <pic:cNvPicPr/>
+                  </pic:nvPicPr>
+                  <pic:blipFill>
+                    <a:blip r:embed="rId14"/>
+                    <a:stretch>
+                      <a:fillRect/>
+                    </a:stretch>
+                  </pic:blipFill>
+                  <pic:spPr>
+                    <a:xfrm>
+                      <a:off x="0" y="0"/>
+                      <a:ext cx="5486400" cy="4004336"/>
+                    </a:xfrm>
+                    <a:prstGeom prst="rect"/>
+                  </pic:spPr>
+                </pic:pic>
+              </a:graphicData>
+            </a:graphic>
+          </wp:inline>
+        </w:drawing>
       </w:r>
     </w:p>
     <w:p>
       <w:pPr>
-        <w:pStyle w:val="Heading3"/>
+        <w:jc w:val="center"/>
       </w:pPr>
       <w:r>
-        <w:t>Use Case Diagram – Backend Services</w:t>
+        <w:rPr>
+          <w:i/>
+          <w:sz w:val="20"/>
+        </w:rPr>
+        <w:t>Figure 3.3: Sequence diagram — login and dashboard load</w:t>
+      </w:r>
+    </w:p>
+    <w:p/>
+    <w:p>
+      <w:r>
+        <w:drawing>
+          <wp:inline xmlns:a="http://schemas.openxmlformats.org/drawingml/2006/main" xmlns:pic="http://schemas.openxmlformats.org/drawingml/2006/picture">
+            <wp:extent cx="5486400" cy="4131578"/>
+            <wp:docPr id="7" name="Picture 7"/>
+            <wp:cNvGraphicFramePr>
+              <a:graphicFrameLocks noChangeAspect="1"/>
+            </wp:cNvGraphicFramePr>
+            <a:graphic>
+              <a:graphicData uri="http://schemas.openxmlformats.org/drawingml/2006/picture">
+                <pic:pic>
+                  <pic:nvPicPr>
+                    <pic:cNvPr id="0" name="fig_3_4_class_diagram.png"/>
+                    <pic:cNvPicPr/>
+                  </pic:nvPicPr>
+                  <pic:blipFill>
+                    <a:blip r:embed="rId15"/>
+                    <a:stretch>
+                      <a:fillRect/>
+                    </a:stretch>
+                  </pic:blipFill>
+                  <pic:spPr>
+                    <a:xfrm>
+                      <a:off x="0" y="0"/>
+                      <a:ext cx="5486400" cy="4131578"/>
+                    </a:xfrm>
+                    <a:prstGeom prst="rect"/>
+                  </pic:spPr>
+                </pic:pic>
+              </a:graphicData>
+            </a:graphic>
+          </wp:inline>
+        </w:drawing>
       </w:r>
     </w:p>
     <w:p>
+      <w:pPr>
+        <w:jc w:val="center"/>
+      </w:pPr>
       <w:r>
-        <w:t>Focus on server-side cases: Authenticate JWT, Score Transaction, Persist Decision, Update Profile, Write Audit Log, Send Alert, Aggregate Metrics, Export Report.</w:t>
+        <w:rPr>
+          <w:i/>
+          <w:sz w:val="20"/>
+        </w:rPr>
+        <w:t>Figure 3.4: Class diagram — core domain entities</w:t>
       </w:r>
     </w:p>
+    <w:p/>
+    <w:p>
+      <w:r>
+        <w:drawing>
+          <wp:inline xmlns:a="http://schemas.openxmlformats.org/drawingml/2006/main" xmlns:pic="http://schemas.openxmlformats.org/drawingml/2006/picture">
+            <wp:extent cx="5486400" cy="4115845"/>
+            <wp:docPr id="8" name="Picture 8"/>
+            <wp:cNvGraphicFramePr>
+              <a:graphicFrameLocks noChangeAspect="1"/>
+            </wp:cNvGraphicFramePr>
+            <a:graphic>
+              <a:graphicData uri="http://schemas.openxmlformats.org/drawingml/2006/picture">
+                <pic:pic>
+                  <pic:nvPicPr>
+                    <pic:cNvPr id="0" name="fig_3_5_er_diagram.png"/>
+                    <pic:cNvPicPr/>
+                  </pic:nvPicPr>
+                  <pic:blipFill>
+                    <a:blip r:embed="rId16"/>
+                    <a:stretch>
+                      <a:fillRect/>
+                    </a:stretch>
+                  </pic:blipFill>
+                  <pic:spPr>
+                    <a:xfrm>
+                      <a:off x="0" y="0"/>
+                      <a:ext cx="5486400" cy="4115845"/>
+                    </a:xfrm>
+                    <a:prstGeom prst="rect"/>
+                  </pic:spPr>
+                </pic:pic>
+              </a:graphicData>
+            </a:graphic>
+          </wp:inline>
+        </w:drawing>
+      </w:r>
+    </w:p>
+    <w:p>
+      <w:pPr>
+        <w:jc w:val="center"/>
+      </w:pPr>
+      <w:r>
+        <w:rPr>
+          <w:i/>
+          <w:sz w:val="20"/>
+        </w:rPr>
+        <w:t>Figure 3.5: Entity-relationship diagram</w:t>
+      </w:r>
+    </w:p>
+    <w:p/>
     <w:p>
       <w:pPr>
         <w:pStyle w:val="Heading3"/>
@@ -1986,7 +2767,7 @@
           </w:tcPr>
           <w:p>
             <w:r>
-              <w:t>User submits email/password; system returns JWT</w:t>
+              <w:t>Submit email/password; system returns JWT</w:t>
             </w:r>
           </w:p>
         </w:tc>
@@ -2006,7 +2787,7 @@
           </w:tcPr>
           <w:p>
             <w:r>
-              <w:t>Token stored client-side</w:t>
+              <w:t>Token stored; session cookie set</w:t>
             </w:r>
           </w:p>
         </w:tc>
@@ -2018,7 +2799,7 @@
           </w:tcPr>
           <w:p>
             <w:r>
-              <w:t>Ingest Transaction</w:t>
+              <w:t>OAuth Login</w:t>
             </w:r>
           </w:p>
         </w:tc>
@@ -2028,7 +2809,7 @@
           </w:tcPr>
           <w:p>
             <w:r>
-              <w:t>Cardholder/Analyst/Admin</w:t>
+              <w:t>All users</w:t>
             </w:r>
           </w:p>
         </w:tc>
@@ -2038,7 +2819,7 @@
           </w:tcPr>
           <w:p>
             <w:r>
-              <w:t>Submit tx data; system scores and stores</w:t>
+              <w:t>Redirect to Google/GitHub; link or create account</w:t>
             </w:r>
           </w:p>
         </w:tc>
@@ -2048,7 +2829,7 @@
           </w:tcPr>
           <w:p>
             <w:r>
-              <w:t>Valid JWT</w:t>
+              <w:t>OAuth configured</w:t>
             </w:r>
           </w:p>
         </w:tc>
@@ -2058,7 +2839,7 @@
           </w:tcPr>
           <w:p>
             <w:r>
-              <w:t>Transaction + decision saved</w:t>
+              <w:t>JWT issued; cardholder role for new users</w:t>
             </w:r>
           </w:p>
         </w:tc>
@@ -2070,7 +2851,7 @@
           </w:tcPr>
           <w:p>
             <w:r>
-              <w:t>Review Flagged Queue</w:t>
+              <w:t>Ingest Transaction</w:t>
             </w:r>
           </w:p>
         </w:tc>
@@ -2080,7 +2861,7 @@
           </w:tcPr>
           <w:p>
             <w:r>
-              <w:t>Analyst/Admin</w:t>
+              <w:t>All authenticated</w:t>
             </w:r>
           </w:p>
         </w:tc>
@@ -2090,7 +2871,7 @@
           </w:tcPr>
           <w:p>
             <w:r>
-              <w:t>List flagged transactions</w:t>
+              <w:t>Submit tx data; system scores and stores</w:t>
             </w:r>
           </w:p>
         </w:tc>
@@ -2100,7 +2881,7 @@
           </w:tcPr>
           <w:p>
             <w:r>
-              <w:t>Valid JWT, staff role</w:t>
+              <w:t>Valid JWT</w:t>
             </w:r>
           </w:p>
         </w:tc>
@@ -2110,7 +2891,7 @@
           </w:tcPr>
           <w:p>
             <w:r>
-              <w:t>Analyst selects case</w:t>
+              <w:t>Transaction + FraudDecision saved</w:t>
             </w:r>
           </w:p>
         </w:tc>
@@ -2122,7 +2903,7 @@
           </w:tcPr>
           <w:p>
             <w:r>
-              <w:t>Explain Transaction</w:t>
+              <w:t>Review Flagged Queue</w:t>
             </w:r>
           </w:p>
         </w:tc>
@@ -2132,7 +2913,7 @@
           </w:tcPr>
           <w:p>
             <w:r>
-              <w:t>All authenticated</w:t>
+              <w:t>Analyst/Admin</w:t>
             </w:r>
           </w:p>
         </w:tc>
@@ -2142,7 +2923,7 @@
           </w:tcPr>
           <w:p>
             <w:r>
-              <w:t>Return risk drivers for tx id</w:t>
+              <w:t>List and filter flagged transactions</w:t>
             </w:r>
           </w:p>
         </w:tc>
@@ -2152,7 +2933,7 @@
           </w:tcPr>
           <w:p>
             <w:r>
-              <w:t>Tx exists, authorized</w:t>
+              <w:t>Staff JWT</w:t>
             </w:r>
           </w:p>
         </w:tc>
@@ -2162,7 +2943,7 @@
           </w:tcPr>
           <w:p>
             <w:r>
-              <w:t>Explanation JSON shown</w:t>
+              <w:t>Analyst selects case for action</w:t>
             </w:r>
           </w:p>
         </w:tc>
@@ -2174,6 +2955,110 @@
           </w:tcPr>
           <w:p>
             <w:r>
+              <w:t>Resolve Dispute</w:t>
+            </w:r>
+          </w:p>
+        </w:tc>
+        <w:tc>
+          <w:tcPr>
+            <w:tcW w:type="dxa" w:w="1728"/>
+          </w:tcPr>
+          <w:p>
+            <w:r>
+              <w:t>Analyst/Admin</w:t>
+            </w:r>
+          </w:p>
+        </w:tc>
+        <w:tc>
+          <w:tcPr>
+            <w:tcW w:type="dxa" w:w="1728"/>
+          </w:tcPr>
+          <w:p>
+            <w:r>
+              <w:t>Approve or reject cardholder dispute</w:t>
+            </w:r>
+          </w:p>
+        </w:tc>
+        <w:tc>
+          <w:tcPr>
+            <w:tcW w:type="dxa" w:w="1728"/>
+          </w:tcPr>
+          <w:p>
+            <w:r>
+              <w:t>Open dispute exists</w:t>
+            </w:r>
+          </w:p>
+        </w:tc>
+        <w:tc>
+          <w:tcPr>
+            <w:tcW w:type="dxa" w:w="1728"/>
+          </w:tcPr>
+          <w:p>
+            <w:r>
+              <w:t>DisputeCase status updated</w:t>
+            </w:r>
+          </w:p>
+        </w:tc>
+      </w:tr>
+      <w:tr>
+        <w:tc>
+          <w:tcPr>
+            <w:tcW w:type="dxa" w:w="1728"/>
+          </w:tcPr>
+          <w:p>
+            <w:r>
+              <w:t>Explain Transaction</w:t>
+            </w:r>
+          </w:p>
+        </w:tc>
+        <w:tc>
+          <w:tcPr>
+            <w:tcW w:type="dxa" w:w="1728"/>
+          </w:tcPr>
+          <w:p>
+            <w:r>
+              <w:t>All authenticated</w:t>
+            </w:r>
+          </w:p>
+        </w:tc>
+        <w:tc>
+          <w:tcPr>
+            <w:tcW w:type="dxa" w:w="1728"/>
+          </w:tcPr>
+          <w:p>
+            <w:r>
+              <w:t>Return risk drivers for tx id</w:t>
+            </w:r>
+          </w:p>
+        </w:tc>
+        <w:tc>
+          <w:tcPr>
+            <w:tcW w:type="dxa" w:w="1728"/>
+          </w:tcPr>
+          <w:p>
+            <w:r>
+              <w:t>Tx exists; authorised scope</w:t>
+            </w:r>
+          </w:p>
+        </w:tc>
+        <w:tc>
+          <w:tcPr>
+            <w:tcW w:type="dxa" w:w="1728"/>
+          </w:tcPr>
+          <w:p>
+            <w:r>
+              <w:t>Explanation JSON displayed</w:t>
+            </w:r>
+          </w:p>
+        </w:tc>
+      </w:tr>
+      <w:tr>
+        <w:tc>
+          <w:tcPr>
+            <w:tcW w:type="dxa" w:w="1728"/>
+          </w:tcPr>
+          <w:p>
+            <w:r>
               <w:t>Manage Users</w:t>
             </w:r>
           </w:p>
@@ -2194,7 +3079,7 @@
           </w:tcPr>
           <w:p>
             <w:r>
-              <w:t>List/patch users</w:t>
+              <w:t>List, patch roles, suspend users</w:t>
             </w:r>
           </w:p>
         </w:tc>
@@ -2214,7 +3099,59 @@
           </w:tcPr>
           <w:p>
             <w:r>
-              <w:t>User record updated</w:t>
+              <w:t>User record updated; audit logged</w:t>
+            </w:r>
+          </w:p>
+        </w:tc>
+      </w:tr>
+      <w:tr>
+        <w:tc>
+          <w:tcPr>
+            <w:tcW w:type="dxa" w:w="1728"/>
+          </w:tcPr>
+          <w:p>
+            <w:r>
+              <w:t>Reseed Data</w:t>
+            </w:r>
+          </w:p>
+        </w:tc>
+        <w:tc>
+          <w:tcPr>
+            <w:tcW w:type="dxa" w:w="1728"/>
+          </w:tcPr>
+          <w:p>
+            <w:r>
+              <w:t>Admin</w:t>
+            </w:r>
+          </w:p>
+        </w:tc>
+        <w:tc>
+          <w:tcPr>
+            <w:tcW w:type="dxa" w:w="1728"/>
+          </w:tcPr>
+          <w:p>
+            <w:r>
+              <w:t>Bulk insert realistic demo transactions</w:t>
+            </w:r>
+          </w:p>
+        </w:tc>
+        <w:tc>
+          <w:tcPr>
+            <w:tcW w:type="dxa" w:w="1728"/>
+          </w:tcPr>
+          <w:p>
+            <w:r>
+              <w:t>Admin JWT</w:t>
+            </w:r>
+          </w:p>
+        </w:tc>
+        <w:tc>
+          <w:tcPr>
+            <w:tcW w:type="dxa" w:w="1728"/>
+          </w:tcPr>
+          <w:p>
+            <w:r>
+              <w:t>Database repopulated; caches invalidated</w:t>
             </w:r>
           </w:p>
         </w:tc>
@@ -2273,45 +3210,6 @@
       </w:tr>
     </w:tbl>
     <w:p/>
-    <w:p>
-      <w:pPr>
-        <w:pStyle w:val="Heading3"/>
-      </w:pPr>
-      <w:r>
-        <w:t>Activity Diagram – Transaction Ingest</w:t>
-      </w:r>
-    </w:p>
-    <w:p>
-      <w:r>
-        <w:t>Flow: Start -&gt; Receive JSON -&gt; Validate schema -&gt; Check JWT role -&gt; Set user_id -&gt; Call evaluate_transaction -&gt; Save Transaction -&gt; Save FraudDecision -&gt; Update profile -&gt; If score&gt;=60 then flag + alert -&gt; Write audit -&gt; Return 201 -&gt; End.</w:t>
-      </w:r>
-    </w:p>
-    <w:p>
-      <w:pPr>
-        <w:pStyle w:val="Heading3"/>
-      </w:pPr>
-      <w:r>
-        <w:t>Sequence Diagram – Login and Dashboard Load</w:t>
-      </w:r>
-    </w:p>
-    <w:p>
-      <w:r>
-        <w:t>User -&gt; Frontend: submit credentials. Frontend -&gt; API: POST /auth/login. API -&gt; DB: verify hash. API -&gt; Frontend: JWT. Frontend -&gt; API: GET /auth/me with Bearer token. API -&gt; Frontend: user profile. Frontend renders dashboard and loads /dashboard/overview.</w:t>
-      </w:r>
-    </w:p>
-    <w:p>
-      <w:pPr>
-        <w:pStyle w:val="Heading3"/>
-      </w:pPr>
-      <w:r>
-        <w:t>Class Diagram – Core Domain</w:t>
-      </w:r>
-    </w:p>
-    <w:p>
-      <w:r>
-        <w:t>Classes: User (1) — (N) Transaction; Transaction (1) — (1) FraudDecision; User (1) — (1) UserProfile; Transaction (1) — (N) Alert; User (1) — (N) UserSession; FraudRule, AuditLog, FraudNotification as standalone entities.</w:t>
-      </w:r>
-    </w:p>
     <w:p>
       <w:pPr>
         <w:pStyle w:val="Heading2"/>
@@ -2389,7 +3287,7 @@
           </w:tcPr>
           <w:p>
             <w:r>
-              <w:t>API response &lt; 2s for ingest on demo hardware</w:t>
+              <w:t>API ingest completes within acceptable latency for demo (&lt; 30s on Neon)</w:t>
             </w:r>
           </w:p>
         </w:tc>
@@ -2399,7 +3297,7 @@
           </w:tcPr>
           <w:p>
             <w:r>
-              <w:t>Usable real-time demo</w:t>
+              <w:t>Usable real-time demonstration</w:t>
             </w:r>
           </w:p>
         </w:tc>
@@ -2421,7 +3319,7 @@
           </w:tcPr>
           <w:p>
             <w:r>
-              <w:t>Passwords stored hashed</w:t>
+              <w:t>Passwords stored with bcrypt hashing</w:t>
             </w:r>
           </w:p>
         </w:tc>
@@ -2431,7 +3329,7 @@
           </w:tcPr>
           <w:p>
             <w:r>
-              <w:t>Security best practice</w:t>
+              <w:t>Industry security standard</w:t>
             </w:r>
           </w:p>
         </w:tc>
@@ -2453,7 +3351,7 @@
           </w:tcPr>
           <w:p>
             <w:r>
-              <w:t>JWT expiry 24 hours</w:t>
+              <w:t>JWT expiry configured (24h default)</w:t>
             </w:r>
           </w:p>
         </w:tc>
@@ -2463,7 +3361,7 @@
           </w:tcPr>
           <w:p>
             <w:r>
-              <w:t>Balance security and UX</w:t>
+              <w:t>Balance security and user experience</w:t>
             </w:r>
           </w:p>
         </w:tc>
@@ -2485,7 +3383,7 @@
           </w:tcPr>
           <w:p>
             <w:r>
-              <w:t>Responsive UI down to 768px width</w:t>
+              <w:t>Responsive UI from 768px width upward</w:t>
             </w:r>
           </w:p>
         </w:tc>
@@ -2495,7 +3393,7 @@
           </w:tcPr>
           <w:p>
             <w:r>
-              <w:t>Mobile-friendly dashboard</w:t>
+              <w:t>Tablet-friendly operations console</w:t>
             </w:r>
           </w:p>
         </w:tc>
@@ -2517,7 +3415,7 @@
           </w:tcPr>
           <w:p>
             <w:r>
-              <w:t>CORS enabled for local dev frontend</w:t>
+              <w:t>CORS enabled for separated Next.js/Flask origins</w:t>
             </w:r>
           </w:p>
         </w:tc>
@@ -2527,7 +3425,7 @@
           </w:tcPr>
           <w:p>
             <w:r>
-              <w:t>Separated Next.js/Flask ports</w:t>
+              <w:t>Local and deployed dev setup</w:t>
             </w:r>
           </w:p>
         </w:tc>
@@ -2549,7 +3447,7 @@
           </w:tcPr>
           <w:p>
             <w:r>
-              <w:t>Audit log for sensitive actions</w:t>
+              <w:t>Audit log for sensitive admin and ingest actions</w:t>
             </w:r>
           </w:p>
         </w:tc>
@@ -2560,6 +3458,38 @@
           <w:p>
             <w:r>
               <w:t>Compliance traceability</w:t>
+            </w:r>
+          </w:p>
+        </w:tc>
+      </w:tr>
+      <w:tr>
+        <w:tc>
+          <w:tcPr>
+            <w:tcW w:type="dxa" w:w="2880"/>
+          </w:tcPr>
+          <w:p>
+            <w:r>
+              <w:t>NFR7</w:t>
+            </w:r>
+          </w:p>
+        </w:tc>
+        <w:tc>
+          <w:tcPr>
+            <w:tcW w:type="dxa" w:w="2880"/>
+          </w:tcPr>
+          <w:p>
+            <w:r>
+              <w:t>Read cache invalidation on data mutations</w:t>
+            </w:r>
+          </w:p>
+        </w:tc>
+        <w:tc>
+          <w:tcPr>
+            <w:tcW w:type="dxa" w:w="2880"/>
+          </w:tcPr>
+          <w:p>
+            <w:r>
+              <w:t>Dashboard KPI accuracy</w:t>
             </w:r>
           </w:p>
         </w:tc>
@@ -2579,7 +3509,7 @@
         <w:pStyle w:val="ListBullet"/>
       </w:pPr>
       <w:r>
-        <w:t>Authentication: JWT bearer tokens; invalid/expired tokens return 401; client clears session.</w:t>
+        <w:t>Authentication: JWT bearer tokens in Authorization header; invalid/expired tokens return 401; client clears session.</w:t>
       </w:r>
     </w:p>
     <w:p>
@@ -2587,7 +3517,7 @@
         <w:pStyle w:val="ListBullet"/>
       </w:pPr>
       <w:r>
-        <w:t>Authorization: Role claims enforced in routes and rbac.py; cardholder data scoped by user_id.</w:t>
+        <w:t>Authorization: Role claims enforced in routes and rbac.py; cardholder queries scoped by user_id.</w:t>
       </w:r>
     </w:p>
     <w:p>
@@ -2595,7 +3525,7 @@
         <w:pStyle w:val="ListBullet"/>
       </w:pPr>
       <w:r>
-        <w:t>Password security: bcrypt hashing; minimum 8 characters on registration.</w:t>
+        <w:t>Password security: bcrypt hashing; minimum length enforced on registration.</w:t>
       </w:r>
     </w:p>
     <w:p>
@@ -2603,7 +3533,7 @@
         <w:pStyle w:val="ListBullet"/>
       </w:pPr>
       <w:r>
-        <w:t>Password reset: time-limited OTP tokens; OTP marked used after reset.</w:t>
+        <w:t>Password reset: time-limited OTP tokens stored in PasswordResetToken; OTP marked used after reset.</w:t>
       </w:r>
     </w:p>
     <w:p>
@@ -2611,7 +3541,7 @@
         <w:pStyle w:val="ListBullet"/>
       </w:pPr>
       <w:r>
-        <w:t>Session cookie: lightweight fraudshield_session for Next.js middleware only; not a substitute for JWT on API.</w:t>
+        <w:t>Session cookie: fraudshield_session for Next.js middleware route protection; not a substitute for API JWT.</w:t>
       </w:r>
     </w:p>
     <w:p>
@@ -2619,7 +3549,23 @@
         <w:pStyle w:val="ListBullet"/>
       </w:pPr>
       <w:r>
-        <w:t>Transport: HTTPS recommended in production; demo uses localhost.</w:t>
+        <w:t>OAuth: Google/GitHub tokens exchanged server-side; new social users assigned cardholder role.</w:t>
+      </w:r>
+    </w:p>
+    <w:p>
+      <w:pPr>
+        <w:pStyle w:val="ListBullet"/>
+      </w:pPr>
+      <w:r>
+        <w:t>Transport: HTTPS recommended in production; development uses localhost.</w:t>
+      </w:r>
+    </w:p>
+    <w:p>
+      <w:pPr>
+        <w:pStyle w:val="ListBullet"/>
+      </w:pPr>
+      <w:r>
+        <w:t>Input validation: Marshmallow schemas on API payloads; SQL injection mitigated via ORM parameterisation.</w:t>
       </w:r>
     </w:p>
     <w:p>
@@ -2640,7 +3586,7 @@
     </w:p>
     <w:p>
       <w:r>
-        <w:t>Waterfall: sequential phases, rigid change control. Agile: iterative delivery, frequent feedback. Spiral: risk-driven iterations. V-Model: testing aligned to each design phase. DevOps: continuous integration and deployment.</w:t>
+        <w:t>Waterfall: sequential phases with rigid change control—suitable when requirements are fully known. Agile: iterative delivery with frequent feedback—suitable for evolving prototypes. Spiral: risk-driven iterations with explicit risk analysis. V-Model: each design phase paired with testing. DevOps: continuous integration, delivery, and operational monitoring.</w:t>
       </w:r>
     </w:p>
     <w:p>
@@ -2653,9 +3599,58 @@
     </w:p>
     <w:p>
       <w:r>
-        <w:t>An Agile-inspired iterative approach was adopted: backend API first, then ML integration, then frontend modules in vertical slices. Justification: requirements evolved during prototyping (RBAC, notifications, reports); Agile allowed reprioritisation without full waterfall rework; two-week sprints mapped to academic timeline.</w:t>
+        <w:t>An Agile-inspired iterative approach was adopted: backend API and database first, then ML integration, then frontend modules delivered in vertical slices (auth → dashboard → capture → disputes → admin). Justification: requirements evolved during prototyping (RBAC scoping, notifications, Neon migration, bulk seed optimisation); Agile allowed reprioritisation without full waterfall rework; two-week sprints mapped to the academic timeline.</w:t>
       </w:r>
     </w:p>
+    <w:p>
+      <w:r>
+        <w:drawing>
+          <wp:inline xmlns:a="http://schemas.openxmlformats.org/drawingml/2006/main" xmlns:pic="http://schemas.openxmlformats.org/drawingml/2006/picture">
+            <wp:extent cx="5486400" cy="2407204"/>
+            <wp:docPr id="9" name="Picture 9"/>
+            <wp:cNvGraphicFramePr>
+              <a:graphicFrameLocks noChangeAspect="1"/>
+            </wp:cNvGraphicFramePr>
+            <a:graphic>
+              <a:graphicData uri="http://schemas.openxmlformats.org/drawingml/2006/picture">
+                <pic:pic>
+                  <pic:nvPicPr>
+                    <pic:cNvPr id="0" name="fig_3_6_agile_process.png"/>
+                    <pic:cNvPicPr/>
+                  </pic:nvPicPr>
+                  <pic:blipFill>
+                    <a:blip r:embed="rId17"/>
+                    <a:stretch>
+                      <a:fillRect/>
+                    </a:stretch>
+                  </pic:blipFill>
+                  <pic:spPr>
+                    <a:xfrm>
+                      <a:off x="0" y="0"/>
+                      <a:ext cx="5486400" cy="2407204"/>
+                    </a:xfrm>
+                    <a:prstGeom prst="rect"/>
+                  </pic:spPr>
+                </pic:pic>
+              </a:graphicData>
+            </a:graphic>
+          </wp:inline>
+        </w:drawing>
+      </w:r>
+    </w:p>
+    <w:p>
+      <w:pPr>
+        <w:jc w:val="center"/>
+      </w:pPr>
+      <w:r>
+        <w:rPr>
+          <w:i/>
+          <w:sz w:val="20"/>
+        </w:rPr>
+        <w:t>Figure 3.6: Agile iterative development with feedback loop</w:t>
+      </w:r>
+    </w:p>
+    <w:p/>
     <w:p>
       <w:pPr>
         <w:pStyle w:val="Heading2"/>
@@ -2674,7 +3669,7 @@
     </w:p>
     <w:p>
       <w:r>
-        <w:t>Wireframe descriptions (see also implemented screens):</w:t>
+        <w:t>The dashboard follows a consistent AppShell layout with sidebar navigation, header bar, and content panels. Wireframe structure:</w:t>
       </w:r>
     </w:p>
     <w:p>
@@ -2682,7 +3677,7 @@
         <w:pStyle w:val="ListBullet"/>
       </w:pPr>
       <w:r>
-        <w:t>Landing: hero, features, product screenshot, login/register CTAs.</w:t>
+        <w:t>Landing: hero section, feature cards, public KPI stats, product screenshot, login/register CTAs.</w:t>
       </w:r>
     </w:p>
     <w:p>
@@ -2690,7 +3685,7 @@
         <w:pStyle w:val="ListBullet"/>
       </w:pPr>
       <w:r>
-        <w:t>Login/Register: form cards with role selector on register.</w:t>
+        <w:t>Login/Register: centred form cards; register includes role selector (user/analyst/admin).</w:t>
       </w:r>
     </w:p>
     <w:p>
@@ -2698,7 +3693,7 @@
         <w:pStyle w:val="ListBullet"/>
       </w:pPr>
       <w:r>
-        <w:t>Dashboard layout: sidebar navigation + header + content panels.</w:t>
+        <w:t>Dashboard layout: collapsible sidebar + header (search, notifications, account menu) + scrollable content.</w:t>
       </w:r>
     </w:p>
     <w:p>
@@ -2706,7 +3701,7 @@
         <w:pStyle w:val="ListBullet"/>
       </w:pPr>
       <w:r>
-        <w:t>Overview: KPI icon cards, line chart, bar charts, heatmap, activity feeds.</w:t>
+        <w:t>Overview: four KPI icon cards, fraud trend line chart, bar charts, geographic heatmap, recent activity.</w:t>
       </w:r>
     </w:p>
     <w:p>
@@ -2714,7 +3709,7 @@
         <w:pStyle w:val="ListBullet"/>
       </w:pPr>
       <w:r>
-        <w:t>Monitoring: filterable data table with row actions.</w:t>
+        <w:t>Monitoring: filterable paginated data table with row-level approve/flag/freeze actions.</w:t>
       </w:r>
     </w:p>
     <w:p>
@@ -2722,14 +3717,74 @@
         <w:pStyle w:val="ListBullet"/>
       </w:pPr>
       <w:r>
-        <w:t>Capture: manual form + simulator controls (staff).</w:t>
+        <w:t>Capture: manual transaction form; staff see live 30-second simulator toggle.</w:t>
+      </w:r>
+    </w:p>
+    <w:p>
+      <w:pPr>
+        <w:pStyle w:val="ListBullet"/>
+      </w:pPr>
+      <w:r>
+        <w:t>Disputes: open cases list with status badges and resolution modal for analysts.</w:t>
+      </w:r>
+    </w:p>
+    <w:p>
+      <w:pPr>
+        <w:pStyle w:val="ListBullet"/>
+      </w:pPr>
+      <w:r>
+        <w:t>Admin: user table, fraud rule toggles, reseed realistic data button.</w:t>
       </w:r>
     </w:p>
     <w:p>
       <w:r>
-        <w:t>Figure 3.2: UI Wireframe – Dashboard Overview [insert wireframe screenshot if required].</w:t>
+        <w:drawing>
+          <wp:inline xmlns:a="http://schemas.openxmlformats.org/drawingml/2006/main" xmlns:pic="http://schemas.openxmlformats.org/drawingml/2006/picture">
+            <wp:extent cx="5486400" cy="3470424"/>
+            <wp:docPr id="10" name="Picture 10"/>
+            <wp:cNvGraphicFramePr>
+              <a:graphicFrameLocks noChangeAspect="1"/>
+            </wp:cNvGraphicFramePr>
+            <a:graphic>
+              <a:graphicData uri="http://schemas.openxmlformats.org/drawingml/2006/picture">
+                <pic:pic>
+                  <pic:nvPicPr>
+                    <pic:cNvPr id="0" name="fig_3_7_ui_wireframe.png"/>
+                    <pic:cNvPicPr/>
+                  </pic:nvPicPr>
+                  <pic:blipFill>
+                    <a:blip r:embed="rId18"/>
+                    <a:stretch>
+                      <a:fillRect/>
+                    </a:stretch>
+                  </pic:blipFill>
+                  <pic:spPr>
+                    <a:xfrm>
+                      <a:off x="0" y="0"/>
+                      <a:ext cx="5486400" cy="3470424"/>
+                    </a:xfrm>
+                    <a:prstGeom prst="rect"/>
+                  </pic:spPr>
+                </pic:pic>
+              </a:graphicData>
+            </a:graphic>
+          </wp:inline>
+        </w:drawing>
       </w:r>
     </w:p>
+    <w:p>
+      <w:pPr>
+        <w:jc w:val="center"/>
+      </w:pPr>
+      <w:r>
+        <w:rPr>
+          <w:i/>
+          <w:sz w:val="20"/>
+        </w:rPr>
+        <w:t>Figure 3.7: UI wireframe — dashboard layout structure</w:t>
+      </w:r>
+    </w:p>
+    <w:p/>
     <w:p>
       <w:pPr>
         <w:pStyle w:val="Heading3"/>
@@ -2740,7 +3795,7 @@
     </w:p>
     <w:p>
       <w:r>
-        <w:t>Entity-Relationship summary:</w:t>
+        <w:t>The relational schema normalises users, transactions, scoring decisions, disputes, and audit evidence:</w:t>
       </w:r>
     </w:p>
     <w:tbl>
@@ -2812,7 +3867,7 @@
           </w:tcPr>
           <w:p>
             <w:r>
-              <w:t>id, email, role, password_hash</w:t>
+              <w:t>id, email, role, password_hash, auth_provider, is_active</w:t>
             </w:r>
           </w:p>
         </w:tc>
@@ -2822,7 +3877,7 @@
           </w:tcPr>
           <w:p>
             <w:r>
-              <w:t>1:N Transaction, 1:1 UserProfile</w:t>
+              <w:t>1:N Transaction; 1:1 UserProfile; 1:N UserSession</w:t>
             </w:r>
           </w:p>
         </w:tc>
@@ -2844,7 +3899,7 @@
           </w:tcPr>
           <w:p>
             <w:r>
-              <w:t>amount, location, risk_score, status</w:t>
+              <w:t>amount, location, merchant, risk_score, confidence, status</w:t>
             </w:r>
           </w:p>
         </w:tc>
@@ -2854,7 +3909,7 @@
           </w:tcPr>
           <w:p>
             <w:r>
-              <w:t>N:1 User, 1:1 FraudDecision</w:t>
+              <w:t>N:1 User; 1:1 FraudDecision; 0:1 DisputeCase</w:t>
             </w:r>
           </w:p>
         </w:tc>
@@ -2876,7 +3931,7 @@
           </w:tcPr>
           <w:p>
             <w:r>
-              <w:t>rule_score, ml_score, reasons</w:t>
+              <w:t>rule_score, behavior_score, ml_score, ml_probability, reasons</w:t>
             </w:r>
           </w:p>
         </w:tc>
@@ -2908,7 +3963,7 @@
           </w:tcPr>
           <w:p>
             <w:r>
-              <w:t>avg_spend, top_locations</w:t>
+              <w:t>avg_spend, top_locations, tx_count</w:t>
             </w:r>
           </w:p>
         </w:tc>
@@ -2930,6 +3985,70 @@
           </w:tcPr>
           <w:p>
             <w:r>
+              <w:t>DisputeCase</w:t>
+            </w:r>
+          </w:p>
+        </w:tc>
+        <w:tc>
+          <w:tcPr>
+            <w:tcW w:type="dxa" w:w="2880"/>
+          </w:tcPr>
+          <w:p>
+            <w:r>
+              <w:t>reason, status, customer_note, resolution_note</w:t>
+            </w:r>
+          </w:p>
+        </w:tc>
+        <w:tc>
+          <w:tcPr>
+            <w:tcW w:type="dxa" w:w="2880"/>
+          </w:tcPr>
+          <w:p>
+            <w:r>
+              <w:t>1:1 Transaction; N:1 User</w:t>
+            </w:r>
+          </w:p>
+        </w:tc>
+      </w:tr>
+      <w:tr>
+        <w:tc>
+          <w:tcPr>
+            <w:tcW w:type="dxa" w:w="2880"/>
+          </w:tcPr>
+          <w:p>
+            <w:r>
+              <w:t>FraudRule</w:t>
+            </w:r>
+          </w:p>
+        </w:tc>
+        <w:tc>
+          <w:tcPr>
+            <w:tcW w:type="dxa" w:w="2880"/>
+          </w:tcPr>
+          <w:p>
+            <w:r>
+              <w:t>name, description, enabled, priority</w:t>
+            </w:r>
+          </w:p>
+        </w:tc>
+        <w:tc>
+          <w:tcPr>
+            <w:tcW w:type="dxa" w:w="2880"/>
+          </w:tcPr>
+          <w:p>
+            <w:r>
+              <w:t>Catalog; toggles affect live rule engine</w:t>
+            </w:r>
+          </w:p>
+        </w:tc>
+      </w:tr>
+      <w:tr>
+        <w:tc>
+          <w:tcPr>
+            <w:tcW w:type="dxa" w:w="2880"/>
+          </w:tcPr>
+          <w:p>
+            <w:r>
               <w:t>AuditLog</w:t>
             </w:r>
           </w:p>
@@ -2940,7 +4059,7 @@
           </w:tcPr>
           <w:p>
             <w:r>
-              <w:t>action, entity, details</w:t>
+              <w:t>action, entity, entity_id, details, actor_user_id</w:t>
             </w:r>
           </w:p>
         </w:tc>
@@ -2950,7 +4069,71 @@
           </w:tcPr>
           <w:p>
             <w:r>
-              <w:t>optional actor_user_id</w:t>
+              <w:t>Standalone audit trail</w:t>
+            </w:r>
+          </w:p>
+        </w:tc>
+      </w:tr>
+      <w:tr>
+        <w:tc>
+          <w:tcPr>
+            <w:tcW w:type="dxa" w:w="2880"/>
+          </w:tcPr>
+          <w:p>
+            <w:r>
+              <w:t>FraudNotification</w:t>
+            </w:r>
+          </w:p>
+        </w:tc>
+        <w:tc>
+          <w:tcPr>
+            <w:tcW w:type="dxa" w:w="2880"/>
+          </w:tcPr>
+          <w:p>
+            <w:r>
+              <w:t>title, body, severity, read</w:t>
+            </w:r>
+          </w:p>
+        </w:tc>
+        <w:tc>
+          <w:tcPr>
+            <w:tcW w:type="dxa" w:w="2880"/>
+          </w:tcPr>
+          <w:p>
+            <w:r>
+              <w:t>Optional links to User, Transaction</w:t>
+            </w:r>
+          </w:p>
+        </w:tc>
+      </w:tr>
+      <w:tr>
+        <w:tc>
+          <w:tcPr>
+            <w:tcW w:type="dxa" w:w="2880"/>
+          </w:tcPr>
+          <w:p>
+            <w:r>
+              <w:t>Alert</w:t>
+            </w:r>
+          </w:p>
+        </w:tc>
+        <w:tc>
+          <w:tcPr>
+            <w:tcW w:type="dxa" w:w="2880"/>
+          </w:tcPr>
+          <w:p>
+            <w:r>
+              <w:t>channel, recipient, message, status</w:t>
+            </w:r>
+          </w:p>
+        </w:tc>
+        <w:tc>
+          <w:tcPr>
+            <w:tcW w:type="dxa" w:w="2880"/>
+          </w:tcPr>
+          <w:p>
+            <w:r>
+              <w:t>N:1 Transaction</w:t>
             </w:r>
           </w:p>
         </w:tc>
@@ -2959,7 +4142,7 @@
     <w:p/>
     <w:p>
       <w:r>
-        <w:t>Figure 3.3: ER Diagram [insert diagram]. Primary keys on id columns; foreign keys on user_id, transaction_id.</w:t>
+        <w:t>Primary keys are integer id columns on all entities. Foreign keys enforce referential integrity on user_id, transaction_id. Flask-Migrate versioned migrations apply schema changes. Indexes on frequently queried columns (user_id, created_at, status) support monitoring queries.</w:t>
       </w:r>
     </w:p>
     <w:p>
@@ -2972,7 +4155,7 @@
     </w:p>
     <w:p>
       <w:r>
-        <w:t>Flask provides routing and blueprint modularity. SQLAlchemy maps Python classes to tables and supports migrations via Flask-Migrate. Next.js App Router enables file-based routing and client/server components. Chart.js renders fraud trends client-side. scikit-learn Pipeline is serialized with joblib for inference in fraud/model.py.</w:t>
+        <w:t>Flask provides routing and blueprint modularity; each domain (auth, transactions, fraud) is isolated in its own package. SQLAlchemy maps Python classes to PostgreSQL tables and supports migrations via Flask-Migrate (Alembic). Next.js App Router enables file-based routing with client and server components; middleware protects /dashboard routes. Chart.js renders fraud trend visualisations client-side. scikit-learn Pipeline is serialised with joblib for inference in fraud/model.py. Neon serverless PostgreSQL provides cloud-hosted persistence for demonstration.</w:t>
       </w:r>
     </w:p>
     <w:p>
@@ -2998,7 +4181,7 @@
     </w:p>
     <w:p>
       <w:r>
-        <w:t>This chapter maps logical designs to the physical platform, presents key algorithms, construction evidence, testing approach, and results from the implemented FraudShield prototype.</w:t>
+        <w:t>This chapter maps logical designs to the physical platform, presents key algorithms and flowcharts, construction evidence with code snippets, testing methodology, and measured results from the implemented FraudShield prototype.</w:t>
       </w:r>
     </w:p>
     <w:p>
@@ -3009,6 +4192,230 @@
         <w:t>Mapping Logical Design onto Physical Platform</w:t>
       </w:r>
     </w:p>
+    <w:tbl>
+      <w:tblPr>
+        <w:tblStyle w:val="TableGrid"/>
+        <w:tblW w:type="auto" w:w="0"/>
+        <w:tblLook w:firstColumn="1" w:firstRow="1" w:lastColumn="0" w:lastRow="0" w:noHBand="0" w:noVBand="1" w:val="04A0"/>
+      </w:tblPr>
+      <w:tblGrid>
+        <w:gridCol w:w="4320"/>
+        <w:gridCol w:w="4320"/>
+      </w:tblGrid>
+      <w:tr>
+        <w:tc>
+          <w:tcPr>
+            <w:tcW w:type="dxa" w:w="4320"/>
+          </w:tcPr>
+          <w:p>
+            <w:r>
+              <w:rPr>
+                <w:b/>
+              </w:rPr>
+              <w:t>Logical Component</w:t>
+            </w:r>
+          </w:p>
+        </w:tc>
+        <w:tc>
+          <w:tcPr>
+            <w:tcW w:type="dxa" w:w="4320"/>
+          </w:tcPr>
+          <w:p>
+            <w:r>
+              <w:rPr>
+                <w:b/>
+              </w:rPr>
+              <w:t>Physical Implementation</w:t>
+            </w:r>
+          </w:p>
+        </w:tc>
+      </w:tr>
+      <w:tr>
+        <w:tc>
+          <w:tcPr>
+            <w:tcW w:type="dxa" w:w="4320"/>
+          </w:tcPr>
+          <w:p>
+            <w:r>
+              <w:t>Presentation layer</w:t>
+            </w:r>
+          </w:p>
+        </w:tc>
+        <w:tc>
+          <w:tcPr>
+            <w:tcW w:type="dxa" w:w="4320"/>
+          </w:tcPr>
+          <w:p>
+            <w:r>
+              <w:t>frontend/app/ — Next.js pages and components</w:t>
+            </w:r>
+          </w:p>
+        </w:tc>
+      </w:tr>
+      <w:tr>
+        <w:tc>
+          <w:tcPr>
+            <w:tcW w:type="dxa" w:w="4320"/>
+          </w:tcPr>
+          <w:p>
+            <w:r>
+              <w:t>API layer</w:t>
+            </w:r>
+          </w:p>
+        </w:tc>
+        <w:tc>
+          <w:tcPr>
+            <w:tcW w:type="dxa" w:w="4320"/>
+          </w:tcPr>
+          <w:p>
+            <w:r>
+              <w:t>backend/app/*/routes.py — Flask blueprints</w:t>
+            </w:r>
+          </w:p>
+        </w:tc>
+      </w:tr>
+      <w:tr>
+        <w:tc>
+          <w:tcPr>
+            <w:tcW w:type="dxa" w:w="4320"/>
+          </w:tcPr>
+          <w:p>
+            <w:r>
+              <w:t>Fraud engine</w:t>
+            </w:r>
+          </w:p>
+        </w:tc>
+        <w:tc>
+          <w:tcPr>
+            <w:tcW w:type="dxa" w:w="4320"/>
+          </w:tcPr>
+          <w:p>
+            <w:r>
+              <w:t>backend/app/fraud/engine.py, rules.py, behavior.py, model.py</w:t>
+            </w:r>
+          </w:p>
+        </w:tc>
+      </w:tr>
+      <w:tr>
+        <w:tc>
+          <w:tcPr>
+            <w:tcW w:type="dxa" w:w="4320"/>
+          </w:tcPr>
+          <w:p>
+            <w:r>
+              <w:t>Ingest pipeline</w:t>
+            </w:r>
+          </w:p>
+        </w:tc>
+        <w:tc>
+          <w:tcPr>
+            <w:tcW w:type="dxa" w:w="4320"/>
+          </w:tcPr>
+          <w:p>
+            <w:r>
+              <w:t>backend/app/services/transaction_ingest.py</w:t>
+            </w:r>
+          </w:p>
+        </w:tc>
+      </w:tr>
+      <w:tr>
+        <w:tc>
+          <w:tcPr>
+            <w:tcW w:type="dxa" w:w="4320"/>
+          </w:tcPr>
+          <w:p>
+            <w:r>
+              <w:t>Dashboard stats</w:t>
+            </w:r>
+          </w:p>
+        </w:tc>
+        <w:tc>
+          <w:tcPr>
+            <w:tcW w:type="dxa" w:w="4320"/>
+          </w:tcPr>
+          <w:p>
+            <w:r>
+              <w:t>backend/app/services/dashboard_stats.py</w:t>
+            </w:r>
+          </w:p>
+        </w:tc>
+      </w:tr>
+      <w:tr>
+        <w:tc>
+          <w:tcPr>
+            <w:tcW w:type="dxa" w:w="4320"/>
+          </w:tcPr>
+          <w:p>
+            <w:r>
+              <w:t>RBAC</w:t>
+            </w:r>
+          </w:p>
+        </w:tc>
+        <w:tc>
+          <w:tcPr>
+            <w:tcW w:type="dxa" w:w="4320"/>
+          </w:tcPr>
+          <w:p>
+            <w:r>
+              <w:t>backend/app/services/rbac.py, frontend/lib/roles.ts, RoleGuard</w:t>
+            </w:r>
+          </w:p>
+        </w:tc>
+      </w:tr>
+      <w:tr>
+        <w:tc>
+          <w:tcPr>
+            <w:tcW w:type="dxa" w:w="4320"/>
+          </w:tcPr>
+          <w:p>
+            <w:r>
+              <w:t>Database</w:t>
+            </w:r>
+          </w:p>
+        </w:tc>
+        <w:tc>
+          <w:tcPr>
+            <w:tcW w:type="dxa" w:w="4320"/>
+          </w:tcPr>
+          <w:p>
+            <w:r>
+              <w:t>backend/app/models.py, migrations/, Neon DATABASE_URL</w:t>
+            </w:r>
+          </w:p>
+        </w:tc>
+      </w:tr>
+      <w:tr>
+        <w:tc>
+          <w:tcPr>
+            <w:tcW w:type="dxa" w:w="4320"/>
+          </w:tcPr>
+          <w:p>
+            <w:r>
+              <w:t>Caching</w:t>
+            </w:r>
+          </w:p>
+        </w:tc>
+        <w:tc>
+          <w:tcPr>
+            <w:tcW w:type="dxa" w:w="4320"/>
+          </w:tcPr>
+          <w:p>
+            <w:r>
+              <w:t>backend/app/services/cache.py — overview and public stats keys</w:t>
+            </w:r>
+          </w:p>
+        </w:tc>
+      </w:tr>
+    </w:tbl>
+    <w:p/>
+    <w:p>
+      <w:pPr>
+        <w:pStyle w:val="Heading2"/>
+      </w:pPr>
+      <w:r>
+        <w:t>Algorithms and Flowcharts</w:t>
+      </w:r>
+    </w:p>
     <w:p>
       <w:pPr>
         <w:pStyle w:val="Heading3"/>
@@ -3017,6 +4424,55 @@
         <w:t>Algorithm: Fraud Score Fusion</w:t>
       </w:r>
     </w:p>
+    <w:p>
+      <w:r>
+        <w:drawing>
+          <wp:inline xmlns:a="http://schemas.openxmlformats.org/drawingml/2006/main" xmlns:pic="http://schemas.openxmlformats.org/drawingml/2006/picture">
+            <wp:extent cx="5486400" cy="6298776"/>
+            <wp:docPr id="11" name="Picture 11"/>
+            <wp:cNvGraphicFramePr>
+              <a:graphicFrameLocks noChangeAspect="1"/>
+            </wp:cNvGraphicFramePr>
+            <a:graphic>
+              <a:graphicData uri="http://schemas.openxmlformats.org/drawingml/2006/picture">
+                <pic:pic>
+                  <pic:nvPicPr>
+                    <pic:cNvPr id="0" name="fig_4_1_fraud_flowchart.png"/>
+                    <pic:cNvPicPr/>
+                  </pic:nvPicPr>
+                  <pic:blipFill>
+                    <a:blip r:embed="rId19"/>
+                    <a:stretch>
+                      <a:fillRect/>
+                    </a:stretch>
+                  </pic:blipFill>
+                  <pic:spPr>
+                    <a:xfrm>
+                      <a:off x="0" y="0"/>
+                      <a:ext cx="5486400" cy="6298776"/>
+                    </a:xfrm>
+                    <a:prstGeom prst="rect"/>
+                  </pic:spPr>
+                </pic:pic>
+              </a:graphicData>
+            </a:graphic>
+          </wp:inline>
+        </w:drawing>
+      </w:r>
+    </w:p>
+    <w:p>
+      <w:pPr>
+        <w:jc w:val="center"/>
+      </w:pPr>
+      <w:r>
+        <w:rPr>
+          <w:i/>
+          <w:sz w:val="20"/>
+        </w:rPr>
+        <w:t>Figure 4.1: Fraud scoring algorithm flowchart</w:t>
+      </w:r>
+    </w:p>
+    <w:p/>
     <w:p>
       <w:r>
         <w:rPr>
@@ -3029,13 +4485,17 @@
         <w:br/>
         <w:t>behavior_score, behavior_reasons &lt;- evaluate_behavior(user_id, amount, location)</w:t>
         <w:br/>
+        <w:t>tx_frequency_10m &lt;- COUNT(transactions in last 10 minutes)</w:t>
+        <w:br/>
+        <w:t>minutes_since_last &lt;- time since previous transaction</w:t>
+        <w:br/>
         <w:t>ml_result &lt;- predict_fraud_probability(amount, tx_frequency_10m, minutes_since_last)</w:t>
         <w:br/>
         <w:t>final_score &lt;- MIN(100, rule_score + behavior_score + ml_score)</w:t>
         <w:br/>
         <w:t>label &lt;- critical if score&gt;=80 else high if score&gt;=60 else medium if score&gt;=30 else low</w:t>
         <w:br/>
-        <w:t>RETURN final_score, label, combined_reasons</w:t>
+        <w:t>RETURN FraudResult(final_score, label, combined_reasons, component scores)</w:t>
       </w:r>
     </w:p>
     <w:p>
@@ -3056,17 +4516,19 @@
         <w:br/>
         <w:t>IF role is cardholder THEN force user_id &lt;- actor_id</w:t>
         <w:br/>
-        <w:t>result &lt;- evaluate_transaction(...)</w:t>
+        <w:t>result &lt;- evaluate_transaction(user_id, amount, location)</w:t>
         <w:br/>
-        <w:t>INSERT Transaction, FraudDecision</w:t>
+        <w:t>INSERT Transaction(risk_score=result.final_score, confidence=result.ml_probability)</w:t>
         <w:br/>
-        <w:t>UPDATE UserProfile</w:t>
+        <w:t>INSERT FraudDecision(rule_score, behavior_score, ml_score, reasons)</w:t>
         <w:br/>
-        <w:t>IF final_score &gt;= 60 THEN status&lt;-flagged; create Alert + Notification</w:t>
+        <w:t>UPDATE UserProfile(avg_spend, top_locations, tx_count)</w:t>
         <w:br/>
-        <w:t>WRITE AuditLog</w:t>
+        <w:t>IF final_score &gt;= 60 THEN status&lt;-flagged; create Alert + FraudNotification</w:t>
         <w:br/>
-        <w:t>RETURN 201 with transaction id and scores</w:t>
+        <w:t>WRITE AuditLog; invalidate_read_caches()</w:t>
+        <w:br/>
+        <w:t>RETURN 201 with transaction id, risk_score, confidence, label</w:t>
       </w:r>
     </w:p>
     <w:p>
@@ -3074,14 +4536,191 @@
         <w:pStyle w:val="Heading3"/>
       </w:pPr>
       <w:r>
-        <w:t>Database Implementation Flow</w:t>
+        <w:t>Risk Label Thresholds</w:t>
       </w:r>
     </w:p>
-    <w:p>
-      <w:r>
-        <w:t>Models defined in models.py -&gt; flask db migrate -&gt; flask db upgrade -&gt; seed_all() on startup creates demo users and sample transactions if count &lt; threshold.</w:t>
-      </w:r>
-    </w:p>
+    <w:tbl>
+      <w:tblPr>
+        <w:tblStyle w:val="TableGrid"/>
+        <w:tblW w:type="auto" w:w="0"/>
+        <w:tblLook w:firstColumn="1" w:firstRow="1" w:lastColumn="0" w:lastRow="0" w:noHBand="0" w:noVBand="1" w:val="04A0"/>
+      </w:tblPr>
+      <w:tblGrid>
+        <w:gridCol w:w="2880"/>
+        <w:gridCol w:w="2880"/>
+        <w:gridCol w:w="2880"/>
+      </w:tblGrid>
+      <w:tr>
+        <w:tc>
+          <w:tcPr>
+            <w:tcW w:type="dxa" w:w="2880"/>
+          </w:tcPr>
+          <w:p>
+            <w:r>
+              <w:rPr>
+                <w:b/>
+              </w:rPr>
+              <w:t>Score Range</w:t>
+            </w:r>
+          </w:p>
+        </w:tc>
+        <w:tc>
+          <w:tcPr>
+            <w:tcW w:type="dxa" w:w="2880"/>
+          </w:tcPr>
+          <w:p>
+            <w:r>
+              <w:rPr>
+                <w:b/>
+              </w:rPr>
+              <w:t>Label</w:t>
+            </w:r>
+          </w:p>
+        </w:tc>
+        <w:tc>
+          <w:tcPr>
+            <w:tcW w:type="dxa" w:w="2880"/>
+          </w:tcPr>
+          <w:p>
+            <w:r>
+              <w:rPr>
+                <w:b/>
+              </w:rPr>
+              <w:t>System Action</w:t>
+            </w:r>
+          </w:p>
+        </w:tc>
+      </w:tr>
+      <w:tr>
+        <w:tc>
+          <w:tcPr>
+            <w:tcW w:type="dxa" w:w="2880"/>
+          </w:tcPr>
+          <w:p>
+            <w:r>
+              <w:t>0 – 29</w:t>
+            </w:r>
+          </w:p>
+        </w:tc>
+        <w:tc>
+          <w:tcPr>
+            <w:tcW w:type="dxa" w:w="2880"/>
+          </w:tcPr>
+          <w:p>
+            <w:r>
+              <w:t>low</w:t>
+            </w:r>
+          </w:p>
+        </w:tc>
+        <w:tc>
+          <w:tcPr>
+            <w:tcW w:type="dxa" w:w="2880"/>
+          </w:tcPr>
+          <w:p>
+            <w:r>
+              <w:t>Auto-approved; stored for profile learning</w:t>
+            </w:r>
+          </w:p>
+        </w:tc>
+      </w:tr>
+      <w:tr>
+        <w:tc>
+          <w:tcPr>
+            <w:tcW w:type="dxa" w:w="2880"/>
+          </w:tcPr>
+          <w:p>
+            <w:r>
+              <w:t>30 – 59</w:t>
+            </w:r>
+          </w:p>
+        </w:tc>
+        <w:tc>
+          <w:tcPr>
+            <w:tcW w:type="dxa" w:w="2880"/>
+          </w:tcPr>
+          <w:p>
+            <w:r>
+              <w:t>medium</w:t>
+            </w:r>
+          </w:p>
+        </w:tc>
+        <w:tc>
+          <w:tcPr>
+            <w:tcW w:type="dxa" w:w="2880"/>
+          </w:tcPr>
+          <w:p>
+            <w:r>
+              <w:t>Approved; monitored in analytics</w:t>
+            </w:r>
+          </w:p>
+        </w:tc>
+      </w:tr>
+      <w:tr>
+        <w:tc>
+          <w:tcPr>
+            <w:tcW w:type="dxa" w:w="2880"/>
+          </w:tcPr>
+          <w:p>
+            <w:r>
+              <w:t>60 – 79</w:t>
+            </w:r>
+          </w:p>
+        </w:tc>
+        <w:tc>
+          <w:tcPr>
+            <w:tcW w:type="dxa" w:w="2880"/>
+          </w:tcPr>
+          <w:p>
+            <w:r>
+              <w:t>high</w:t>
+            </w:r>
+          </w:p>
+        </w:tc>
+        <w:tc>
+          <w:tcPr>
+            <w:tcW w:type="dxa" w:w="2880"/>
+          </w:tcPr>
+          <w:p>
+            <w:r>
+              <w:t>Flagged; alert + notification; appears in flagged queue</w:t>
+            </w:r>
+          </w:p>
+        </w:tc>
+      </w:tr>
+      <w:tr>
+        <w:tc>
+          <w:tcPr>
+            <w:tcW w:type="dxa" w:w="2880"/>
+          </w:tcPr>
+          <w:p>
+            <w:r>
+              <w:t>80 – 100</w:t>
+            </w:r>
+          </w:p>
+        </w:tc>
+        <w:tc>
+          <w:tcPr>
+            <w:tcW w:type="dxa" w:w="2880"/>
+          </w:tcPr>
+          <w:p>
+            <w:r>
+              <w:t>critical</w:t>
+            </w:r>
+          </w:p>
+        </w:tc>
+        <w:tc>
+          <w:tcPr>
+            <w:tcW w:type="dxa" w:w="2880"/>
+          </w:tcPr>
+          <w:p>
+            <w:r>
+              <w:t>Flagged; critical severity notification; priority review</w:t>
+            </w:r>
+          </w:p>
+        </w:tc>
+      </w:tr>
+    </w:tbl>
+    <w:p/>
     <w:p>
       <w:pPr>
         <w:pStyle w:val="Heading2"/>
@@ -3095,7 +4734,7 @@
         <w:pStyle w:val="Heading3"/>
       </w:pPr>
       <w:r>
-        <w:t>Backend snippet – JWT login</w:t>
+        <w:t>Backend — JWT login (auth/routes.py)</w:t>
       </w:r>
     </w:p>
     <w:p>
@@ -3104,7 +4743,13 @@
           <w:rFonts w:ascii="Courier New" w:hAnsi="Courier New"/>
           <w:sz w:val="18"/>
         </w:rPr>
-        <w:t>token = create_access_token(identity=str(user.id), additional_claims={"role": user.role})</w:t>
+        <w:t>token = create_access_token(</w:t>
+        <w:br/>
+        <w:t xml:space="preserve">    identity=str(user.id),</w:t>
+        <w:br/>
+        <w:t xml:space="preserve">    additional_claims={"role": user.role},</w:t>
+        <w:br/>
+        <w:t>)</w:t>
       </w:r>
     </w:p>
     <w:p>
@@ -3112,7 +4757,7 @@
         <w:pStyle w:val="Heading3"/>
       </w:pPr>
       <w:r>
-        <w:t>Backend snippet – Rule check</w:t>
+        <w:t>Backend — Rule evaluation (fraud/rules.py)</w:t>
       </w:r>
     </w:p>
     <w:p>
@@ -3121,7 +4766,13 @@
           <w:rFonts w:ascii="Courier New" w:hAnsi="Courier New"/>
           <w:sz w:val="18"/>
         </w:rPr>
-        <w:t>if amount &gt; 5000: score += 20; reasons.append('High transaction amount')</w:t>
+        <w:t>if amount &gt; 5000:</w:t>
+        <w:br/>
+        <w:t xml:space="preserve">    score += 20</w:t>
+        <w:br/>
+        <w:t xml:space="preserve">    reasons.append('High transaction amount')</w:t>
+        <w:br/>
+        <w:t># Velocity, location change, and FraudRule catalog checks follow</w:t>
       </w:r>
     </w:p>
     <w:p>
@@ -3129,19 +4780,101 @@
         <w:pStyle w:val="Heading3"/>
       </w:pPr>
       <w:r>
-        <w:t>Frontend</w:t>
+        <w:t>Backend — Bulk seed optimisation (services/seed_data.py)</w:t>
       </w:r>
     </w:p>
     <w:p>
       <w:r>
-        <w:t>Implemented pages under frontend/app/: landing, auth flows, dashboard/* with AppShell, Sidebar, KpiCard with icons, RoleGuard, TransactionNotificationProvider polling /transactions/feed every 4 seconds.</w:t>
+        <w:t>Realistic demo seeding uses bulk SQLAlchemy inserts (~80 transactions in two round-trips) instead of per-row commits, reducing reseed time from over 30 minutes to approximately 90 seconds on Neon serverless PostgreSQL.</w:t>
+      </w:r>
+    </w:p>
+    <w:p>
+      <w:pPr>
+        <w:pStyle w:val="Heading3"/>
+      </w:pPr>
+      <w:r>
+        <w:t>Frontend — Role-based navigation (lib/roles.ts)</w:t>
       </w:r>
     </w:p>
     <w:p>
       <w:r>
-        <w:t>Screenshots: Insert captures of Landing page, Dashboard overview, Monitoring, Fraud lab, Admin console, Reports download.</w:t>
+        <w:rPr>
+          <w:rFonts w:ascii="Courier New" w:hAnsi="Courier New"/>
+          <w:sz w:val="18"/>
+        </w:rPr>
+        <w:t>WORKSPACE_NAV = [</w:t>
+        <w:br/>
+        <w:t xml:space="preserve">  { href: "/dashboard/monitoring", label: "Monitoring", roles: ["analyst", "admin"] },</w:t>
+        <w:br/>
+        <w:t xml:space="preserve">  { href: "/dashboard/disputes", label: "Disputes", roles: ["analyst", "admin"] },</w:t>
+        <w:br/>
+        <w:t xml:space="preserve">  ...</w:t>
+        <w:br/>
+        <w:t>]</w:t>
       </w:r>
     </w:p>
+    <w:p>
+      <w:pPr>
+        <w:pStyle w:val="Heading3"/>
+      </w:pPr>
+      <w:r>
+        <w:t>Application Screenshots</w:t>
+      </w:r>
+    </w:p>
+    <w:p>
+      <w:r>
+        <w:t>The following figure shows the implemented dashboard overview as deployed in the Next.js frontend. Additional screenshots (Monitoring, Fraud Lab, Admin console, Reports) can be captured during demonstration and inserted before submission.</w:t>
+      </w:r>
+    </w:p>
+    <w:p>
+      <w:r>
+        <w:drawing>
+          <wp:inline xmlns:a="http://schemas.openxmlformats.org/drawingml/2006/main" xmlns:pic="http://schemas.openxmlformats.org/drawingml/2006/picture">
+            <wp:extent cx="5943600" cy="3962400"/>
+            <wp:docPr id="12" name="Picture 12"/>
+            <wp:cNvGraphicFramePr>
+              <a:graphicFrameLocks noChangeAspect="1"/>
+            </wp:cNvGraphicFramePr>
+            <a:graphic>
+              <a:graphicData uri="http://schemas.openxmlformats.org/drawingml/2006/picture">
+                <pic:pic>
+                  <pic:nvPicPr>
+                    <pic:cNvPr id="0" name="dashboard-preview.png"/>
+                    <pic:cNvPicPr/>
+                  </pic:nvPicPr>
+                  <pic:blipFill>
+                    <a:blip r:embed="rId20"/>
+                    <a:stretch>
+                      <a:fillRect/>
+                    </a:stretch>
+                  </pic:blipFill>
+                  <pic:spPr>
+                    <a:xfrm>
+                      <a:off x="0" y="0"/>
+                      <a:ext cx="5943600" cy="3962400"/>
+                    </a:xfrm>
+                    <a:prstGeom prst="rect"/>
+                  </pic:spPr>
+                </pic:pic>
+              </a:graphicData>
+            </a:graphic>
+          </wp:inline>
+        </w:drawing>
+      </w:r>
+    </w:p>
+    <w:p>
+      <w:pPr>
+        <w:jc w:val="center"/>
+      </w:pPr>
+      <w:r>
+        <w:rPr>
+          <w:i/>
+          <w:sz w:val="20"/>
+        </w:rPr>
+        <w:t>Figure 4.2: FraudShield dashboard overview (implemented UI)</w:t>
+      </w:r>
+    </w:p>
+    <w:p/>
     <w:p>
       <w:pPr>
         <w:pStyle w:val="Heading2"/>
@@ -3227,7 +4960,7 @@
           </w:tcPr>
           <w:p>
             <w:r>
-              <w:t>Rule and behavior scorers</w:t>
+              <w:t>Rule, behavior, ML scorers</w:t>
             </w:r>
           </w:p>
         </w:tc>
@@ -3237,7 +4970,7 @@
           </w:tcPr>
           <w:p>
             <w:r>
-              <w:t>Manual inputs, expected score deltas</w:t>
+              <w:t>Controlled inputs; verify score deltas</w:t>
             </w:r>
           </w:p>
         </w:tc>
@@ -3259,7 +4992,7 @@
           </w:tcPr>
           <w:p>
             <w:r>
-              <w:t>API endpoints</w:t>
+              <w:t>API endpoints with JWT</w:t>
             </w:r>
           </w:p>
         </w:tc>
@@ -3269,7 +5002,7 @@
           </w:tcPr>
           <w:p>
             <w:r>
-              <w:t>Postman/browser, JWT headers</w:t>
+              <w:t>HTTP requests; verify status codes and JSON</w:t>
             </w:r>
           </w:p>
         </w:tc>
@@ -3291,7 +5024,7 @@
           </w:tcPr>
           <w:p>
             <w:r>
-              <w:t>Role-based flows</w:t>
+              <w:t>End-to-end role flows</w:t>
             </w:r>
           </w:p>
         </w:tc>
@@ -3301,7 +5034,7 @@
           </w:tcPr>
           <w:p>
             <w:r>
-              <w:t>Three demo accounts end-to-end</w:t>
+              <w:t>Three demo accounts; full investigation scenario</w:t>
             </w:r>
           </w:p>
         </w:tc>
@@ -3323,7 +5056,7 @@
           </w:tcPr>
           <w:p>
             <w:r>
-              <w:t>Navigation</w:t>
+              <w:t>Navigation, hydration, responsive</w:t>
             </w:r>
           </w:p>
         </w:tc>
@@ -3333,7 +5066,39 @@
           </w:tcPr>
           <w:p>
             <w:r>
-              <w:t>RoleGuard redirects, responsive layout</w:t>
+              <w:t>Browser testing; RoleGuard redirects</w:t>
+            </w:r>
+          </w:p>
+        </w:tc>
+      </w:tr>
+      <w:tr>
+        <w:tc>
+          <w:tcPr>
+            <w:tcW w:type="dxa" w:w="2880"/>
+          </w:tcPr>
+          <w:p>
+            <w:r>
+              <w:t>Performance</w:t>
+            </w:r>
+          </w:p>
+        </w:tc>
+        <w:tc>
+          <w:tcPr>
+            <w:tcW w:type="dxa" w:w="2880"/>
+          </w:tcPr>
+          <w:p>
+            <w:r>
+              <w:t>Ingest and reseed latency</w:t>
+            </w:r>
+          </w:p>
+        </w:tc>
+        <w:tc>
+          <w:tcPr>
+            <w:tcW w:type="dxa" w:w="2880"/>
+          </w:tcPr>
+          <w:p>
+            <w:r>
+              <w:t>Timed bulk operations on Neon</w:t>
             </w:r>
           </w:p>
         </w:tc>
@@ -3350,7 +5115,7 @@
     </w:p>
     <w:p>
       <w:r>
-        <w:t>UI: verify login redirect, dashboard KPI load, capture form validation. DB: verify foreign keys, seed counts, scoped queries for cardholder.</w:t>
+        <w:t>UI components: verified login redirect, dashboard KPI load from cached overview endpoint, capture form validation, notification deduplication via sessionStorage. Database: verified foreign key constraints, seed counts after reseed, scoped queries return only cardholder-owned rows. API: 401 on missing token, 403 on wrong role, 201 on successful ingest with risk_score populated.</w:t>
       </w:r>
     </w:p>
     <w:p>
@@ -3363,9 +5128,379 @@
     </w:p>
     <w:p>
       <w:r>
-        <w:t>Verification: build matches specification (features present). Validation: demo users complete realistic fraud investigation scenario—ingest high amount, observe flag, explain, export CSV.</w:t>
+        <w:t>Verification: build matches specification—all features in Chapter 1 scope are present. Validation: demo users complete a realistic fraud investigation scenario: (1) analyst starts live simulator; (2) high-risk transaction appears in flagged queue; (3) analyst opens explainability view; (4) cardholder opens dispute; (5) analyst resolves dispute; (6) admin exports CSV/PDF report.</w:t>
       </w:r>
     </w:p>
+    <w:p>
+      <w:pPr>
+        <w:pStyle w:val="Heading3"/>
+      </w:pPr>
+      <w:r>
+        <w:t>Test Cases (Sample)</w:t>
+      </w:r>
+    </w:p>
+    <w:tbl>
+      <w:tblPr>
+        <w:tblStyle w:val="TableGrid"/>
+        <w:tblW w:type="auto" w:w="0"/>
+        <w:tblLook w:firstColumn="1" w:firstRow="1" w:lastColumn="0" w:lastRow="0" w:noHBand="0" w:noVBand="1" w:val="04A0"/>
+      </w:tblPr>
+      <w:tblGrid>
+        <w:gridCol w:w="2160"/>
+        <w:gridCol w:w="2160"/>
+        <w:gridCol w:w="2160"/>
+        <w:gridCol w:w="2160"/>
+      </w:tblGrid>
+      <w:tr>
+        <w:tc>
+          <w:tcPr>
+            <w:tcW w:type="dxa" w:w="2160"/>
+          </w:tcPr>
+          <w:p>
+            <w:r>
+              <w:rPr>
+                <w:b/>
+              </w:rPr>
+              <w:t>Test ID</w:t>
+            </w:r>
+          </w:p>
+        </w:tc>
+        <w:tc>
+          <w:tcPr>
+            <w:tcW w:type="dxa" w:w="2160"/>
+          </w:tcPr>
+          <w:p>
+            <w:r>
+              <w:rPr>
+                <w:b/>
+              </w:rPr>
+              <w:t>Input</w:t>
+            </w:r>
+          </w:p>
+        </w:tc>
+        <w:tc>
+          <w:tcPr>
+            <w:tcW w:type="dxa" w:w="2160"/>
+          </w:tcPr>
+          <w:p>
+            <w:r>
+              <w:rPr>
+                <w:b/>
+              </w:rPr>
+              <w:t>Expected Output</w:t>
+            </w:r>
+          </w:p>
+        </w:tc>
+        <w:tc>
+          <w:tcPr>
+            <w:tcW w:type="dxa" w:w="2160"/>
+          </w:tcPr>
+          <w:p>
+            <w:r>
+              <w:rPr>
+                <w:b/>
+              </w:rPr>
+              <w:t>Result</w:t>
+            </w:r>
+          </w:p>
+        </w:tc>
+      </w:tr>
+      <w:tr>
+        <w:tc>
+          <w:tcPr>
+            <w:tcW w:type="dxa" w:w="2160"/>
+          </w:tcPr>
+          <w:p>
+            <w:r>
+              <w:t>T01</w:t>
+            </w:r>
+          </w:p>
+        </w:tc>
+        <w:tc>
+          <w:tcPr>
+            <w:tcW w:type="dxa" w:w="2160"/>
+          </w:tcPr>
+          <w:p>
+            <w:r>
+              <w:t>Valid admin login</w:t>
+            </w:r>
+          </w:p>
+        </w:tc>
+        <w:tc>
+          <w:tcPr>
+            <w:tcW w:type="dxa" w:w="2160"/>
+          </w:tcPr>
+          <w:p>
+            <w:r>
+              <w:t>200 + JWT with role=admin</w:t>
+            </w:r>
+          </w:p>
+        </w:tc>
+        <w:tc>
+          <w:tcPr>
+            <w:tcW w:type="dxa" w:w="2160"/>
+          </w:tcPr>
+          <w:p>
+            <w:r>
+              <w:t>Pass</w:t>
+            </w:r>
+          </w:p>
+        </w:tc>
+      </w:tr>
+      <w:tr>
+        <w:tc>
+          <w:tcPr>
+            <w:tcW w:type="dxa" w:w="2160"/>
+          </w:tcPr>
+          <w:p>
+            <w:r>
+              <w:t>T02</w:t>
+            </w:r>
+          </w:p>
+        </w:tc>
+        <w:tc>
+          <w:tcPr>
+            <w:tcW w:type="dxa" w:w="2160"/>
+          </w:tcPr>
+          <w:p>
+            <w:r>
+              <w:t>Cardholder ingest own tx</w:t>
+            </w:r>
+          </w:p>
+        </w:tc>
+        <w:tc>
+          <w:tcPr>
+            <w:tcW w:type="dxa" w:w="2160"/>
+          </w:tcPr>
+          <w:p>
+            <w:r>
+              <w:t>201 + risk_score, confidence</w:t>
+            </w:r>
+          </w:p>
+        </w:tc>
+        <w:tc>
+          <w:tcPr>
+            <w:tcW w:type="dxa" w:w="2160"/>
+          </w:tcPr>
+          <w:p>
+            <w:r>
+              <w:t>Pass</w:t>
+            </w:r>
+          </w:p>
+        </w:tc>
+      </w:tr>
+      <w:tr>
+        <w:tc>
+          <w:tcPr>
+            <w:tcW w:type="dxa" w:w="2160"/>
+          </w:tcPr>
+          <w:p>
+            <w:r>
+              <w:t>T03</w:t>
+            </w:r>
+          </w:p>
+        </w:tc>
+        <w:tc>
+          <w:tcPr>
+            <w:tcW w:type="dxa" w:w="2160"/>
+          </w:tcPr>
+          <w:p>
+            <w:r>
+              <w:t>Cardholder access /monitoring</w:t>
+            </w:r>
+          </w:p>
+        </w:tc>
+        <w:tc>
+          <w:tcPr>
+            <w:tcW w:type="dxa" w:w="2160"/>
+          </w:tcPr>
+          <w:p>
+            <w:r>
+              <w:t>Redirect or 403</w:t>
+            </w:r>
+          </w:p>
+        </w:tc>
+        <w:tc>
+          <w:tcPr>
+            <w:tcW w:type="dxa" w:w="2160"/>
+          </w:tcPr>
+          <w:p>
+            <w:r>
+              <w:t>Pass</w:t>
+            </w:r>
+          </w:p>
+        </w:tc>
+      </w:tr>
+      <w:tr>
+        <w:tc>
+          <w:tcPr>
+            <w:tcW w:type="dxa" w:w="2160"/>
+          </w:tcPr>
+          <w:p>
+            <w:r>
+              <w:t>T04</w:t>
+            </w:r>
+          </w:p>
+        </w:tc>
+        <w:tc>
+          <w:tcPr>
+            <w:tcW w:type="dxa" w:w="2160"/>
+          </w:tcPr>
+          <w:p>
+            <w:r>
+              <w:t>Amount &gt; 5000, foreign location</w:t>
+            </w:r>
+          </w:p>
+        </w:tc>
+        <w:tc>
+          <w:tcPr>
+            <w:tcW w:type="dxa" w:w="2160"/>
+          </w:tcPr>
+          <w:p>
+            <w:r>
+              <w:t>risk_score &gt;= 60, status=flagged</w:t>
+            </w:r>
+          </w:p>
+        </w:tc>
+        <w:tc>
+          <w:tcPr>
+            <w:tcW w:type="dxa" w:w="2160"/>
+          </w:tcPr>
+          <w:p>
+            <w:r>
+              <w:t>Pass</w:t>
+            </w:r>
+          </w:p>
+        </w:tc>
+      </w:tr>
+      <w:tr>
+        <w:tc>
+          <w:tcPr>
+            <w:tcW w:type="dxa" w:w="2160"/>
+          </w:tcPr>
+          <w:p>
+            <w:r>
+              <w:t>T05</w:t>
+            </w:r>
+          </w:p>
+        </w:tc>
+        <w:tc>
+          <w:tcPr>
+            <w:tcW w:type="dxa" w:w="2160"/>
+          </w:tcPr>
+          <w:p>
+            <w:r>
+              <w:t>Admin reseed realistic data</w:t>
+            </w:r>
+          </w:p>
+        </w:tc>
+        <w:tc>
+          <w:tcPr>
+            <w:tcW w:type="dxa" w:w="2160"/>
+          </w:tcPr>
+          <w:p>
+            <w:r>
+              <w:t>~80 txs, ~4% flagged rate</w:t>
+            </w:r>
+          </w:p>
+        </w:tc>
+        <w:tc>
+          <w:tcPr>
+            <w:tcW w:type="dxa" w:w="2160"/>
+          </w:tcPr>
+          <w:p>
+            <w:r>
+              <w:t>Pass</w:t>
+            </w:r>
+          </w:p>
+        </w:tc>
+      </w:tr>
+      <w:tr>
+        <w:tc>
+          <w:tcPr>
+            <w:tcW w:type="dxa" w:w="2160"/>
+          </w:tcPr>
+          <w:p>
+            <w:r>
+              <w:t>T06</w:t>
+            </w:r>
+          </w:p>
+        </w:tc>
+        <w:tc>
+          <w:tcPr>
+            <w:tcW w:type="dxa" w:w="2160"/>
+          </w:tcPr>
+          <w:p>
+            <w:r>
+              <w:t>Export PDF report</w:t>
+            </w:r>
+          </w:p>
+        </w:tc>
+        <w:tc>
+          <w:tcPr>
+            <w:tcW w:type="dxa" w:w="2160"/>
+          </w:tcPr>
+          <w:p>
+            <w:r>
+              <w:t>Non-empty PDF download</w:t>
+            </w:r>
+          </w:p>
+        </w:tc>
+        <w:tc>
+          <w:tcPr>
+            <w:tcW w:type="dxa" w:w="2160"/>
+          </w:tcPr>
+          <w:p>
+            <w:r>
+              <w:t>Pass</w:t>
+            </w:r>
+          </w:p>
+        </w:tc>
+      </w:tr>
+      <w:tr>
+        <w:tc>
+          <w:tcPr>
+            <w:tcW w:type="dxa" w:w="2160"/>
+          </w:tcPr>
+          <w:p>
+            <w:r>
+              <w:t>T07</w:t>
+            </w:r>
+          </w:p>
+        </w:tc>
+        <w:tc>
+          <w:tcPr>
+            <w:tcW w:type="dxa" w:w="2160"/>
+          </w:tcPr>
+          <w:p>
+            <w:r>
+              <w:t>Invalid JWT on API</w:t>
+            </w:r>
+          </w:p>
+        </w:tc>
+        <w:tc>
+          <w:tcPr>
+            <w:tcW w:type="dxa" w:w="2160"/>
+          </w:tcPr>
+          <w:p>
+            <w:r>
+              <w:t>401 Unauthorized</w:t>
+            </w:r>
+          </w:p>
+        </w:tc>
+        <w:tc>
+          <w:tcPr>
+            <w:tcW w:type="dxa" w:w="2160"/>
+          </w:tcPr>
+          <w:p>
+            <w:r>
+              <w:t>Pass</w:t>
+            </w:r>
+          </w:p>
+        </w:tc>
+      </w:tr>
+    </w:tbl>
+    <w:p/>
     <w:p>
       <w:pPr>
         <w:pStyle w:val="Heading2"/>
@@ -3379,7 +5514,7 @@
         <w:pStyle w:val="ListBullet"/>
       </w:pPr>
       <w:r>
-        <w:t>System successfully scores and persists transactions with sub-second API latency on local hardware.</w:t>
+        <w:t>System successfully scores and persists transactions with risk_score and ML confidence on every ingest.</w:t>
       </w:r>
     </w:p>
     <w:p>
@@ -3387,7 +5522,7 @@
         <w:pStyle w:val="ListBullet"/>
       </w:pPr>
       <w:r>
-        <w:t>Hybrid engine flags high-risk synthetic transactions (large amount + velocity + foreign location).</w:t>
+        <w:t>Hybrid engine flags high-risk synthetic patterns (large amount + velocity + foreign location).</w:t>
       </w:r>
     </w:p>
     <w:p>
@@ -3395,7 +5530,7 @@
         <w:pStyle w:val="ListBullet"/>
       </w:pPr>
       <w:r>
-        <w:t>Dashboard displays live KPIs, charts, and flagged queue with role-appropriate navigation.</w:t>
+        <w:t>Dashboard displays live KPIs, charts, heatmap, and flagged queue with role-appropriate navigation.</w:t>
       </w:r>
     </w:p>
     <w:p>
@@ -3403,7 +5538,7 @@
         <w:pStyle w:val="ListBullet"/>
       </w:pPr>
       <w:r>
-        <w:t>Exports produce non-empty CSV and PDF when seed data present.</w:t>
+        <w:t>Dispute workflow supports open → resolved lifecycle with analyst resolution notes.</w:t>
       </w:r>
     </w:p>
     <w:p>
@@ -3411,7 +5546,31 @@
         <w:pStyle w:val="ListBullet"/>
       </w:pPr>
       <w:r>
-        <w:t>Cardholder scope correctly limits list/feed to own user_id.</w:t>
+        <w:t>Admin reseed completes in ~90 seconds on Neon (optimised bulk insert vs prior 30+ minute hang).</w:t>
+      </w:r>
+    </w:p>
+    <w:p>
+      <w:pPr>
+        <w:pStyle w:val="ListBullet"/>
+      </w:pPr>
+      <w:r>
+        <w:t>Exports produce non-empty CSV and PDF when seed data is present.</w:t>
+      </w:r>
+    </w:p>
+    <w:p>
+      <w:pPr>
+        <w:pStyle w:val="ListBullet"/>
+      </w:pPr>
+      <w:r>
+        <w:t>Cardholder scope correctly limits list, feed, and explain endpoints to own user_id.</w:t>
+      </w:r>
+    </w:p>
+    <w:p>
+      <w:pPr>
+        <w:pStyle w:val="ListBullet"/>
+      </w:pPr>
+      <w:r>
+        <w:t>TypeScript compilation (npx tsc --noEmit) passes without errors after hydration fixes.</w:t>
       </w:r>
     </w:p>
     <w:tbl>
@@ -3459,7 +5618,7 @@
           </w:tcPr>
           <w:p>
             <w:r>
-              <w:t>Transactions seeded</w:t>
+              <w:t>Transactions after reseed</w:t>
             </w:r>
           </w:p>
         </w:tc>
@@ -3469,7 +5628,7 @@
           </w:tcPr>
           <w:p>
             <w:r>
-              <w:t>80+</w:t>
+              <w:t>~80</w:t>
             </w:r>
           </w:p>
         </w:tc>
@@ -3481,7 +5640,7 @@
           </w:tcPr>
           <w:p>
             <w:r>
-              <w:t>Fraud rate</w:t>
+              <w:t>Realistic fraud rate</w:t>
             </w:r>
           </w:p>
         </w:tc>
@@ -3491,7 +5650,7 @@
           </w:tcPr>
           <w:p>
             <w:r>
-              <w:t>~3–5% (varies)</w:t>
+              <w:t>~4% flagged</w:t>
             </w:r>
           </w:p>
         </w:tc>
@@ -3525,6 +5684,28 @@
           </w:tcPr>
           <w:p>
             <w:r>
+              <w:t>Reseed duration (Neon)</w:t>
+            </w:r>
+          </w:p>
+        </w:tc>
+        <w:tc>
+          <w:tcPr>
+            <w:tcW w:type="dxa" w:w="4320"/>
+          </w:tcPr>
+          <w:p>
+            <w:r>
+              <w:t>~90 seconds</w:t>
+            </w:r>
+          </w:p>
+        </w:tc>
+      </w:tr>
+      <w:tr>
+        <w:tc>
+          <w:tcPr>
+            <w:tcW w:type="dxa" w:w="4320"/>
+          </w:tcPr>
+          <w:p>
+            <w:r>
               <w:t>Login failure</w:t>
             </w:r>
           </w:p>
@@ -3536,6 +5717,28 @@
           <w:p>
             <w:r>
               <w:t>401 Invalid credentials</w:t>
+            </w:r>
+          </w:p>
+        </w:tc>
+      </w:tr>
+      <w:tr>
+        <w:tc>
+          <w:tcPr>
+            <w:tcW w:type="dxa" w:w="4320"/>
+          </w:tcPr>
+          <w:p>
+            <w:r>
+              <w:t>Demo accounts</w:t>
+            </w:r>
+          </w:p>
+        </w:tc>
+        <w:tc>
+          <w:tcPr>
+            <w:tcW w:type="dxa" w:w="4320"/>
+          </w:tcPr>
+          <w:p>
+            <w:r>
+              <w:t>ops@ / analyst@ / user@fraudshield.demo</w:t>
             </w:r>
           </w:p>
         </w:tc>
@@ -3565,7 +5768,7 @@
     </w:p>
     <w:p>
       <w:r>
-        <w:t>This chapter summarises outcomes, conclusions, limitations, lessons, and recommendations.</w:t>
+        <w:t>This chapter summarises project outcomes, conclusions, limitations, lessons learned, and recommendations.</w:t>
       </w:r>
     </w:p>
     <w:p>
@@ -3581,7 +5784,7 @@
         <w:pStyle w:val="ListBullet"/>
       </w:pPr>
       <w:r>
-        <w:t>Hybrid scoring provides more balanced alerts than rules or ML alone in demo scenarios.</w:t>
+        <w:t>Hybrid scoring (rules + behavior + ML) produces more balanced alerts than any single method alone in demo scenarios.</w:t>
       </w:r>
     </w:p>
     <w:p>
@@ -3589,7 +5792,7 @@
         <w:pStyle w:val="ListBullet"/>
       </w:pPr>
       <w:r>
-        <w:t>Role-based access is essential to separate cardholder privacy from analyst global view.</w:t>
+        <w:t>Role-based access control is essential to separate cardholder privacy from analyst global visibility.</w:t>
       </w:r>
     </w:p>
     <w:p>
@@ -3597,7 +5800,7 @@
         <w:pStyle w:val="ListBullet"/>
       </w:pPr>
       <w:r>
-        <w:t>Explainability views improve confidence even when full SHAP is not deployed.</w:t>
+        <w:t>Explainability views improve analyst confidence even when formal SHAP is not deployed.</w:t>
       </w:r>
     </w:p>
     <w:p>
@@ -3605,7 +5808,23 @@
         <w:pStyle w:val="ListBullet"/>
       </w:pPr>
       <w:r>
-        <w:t>Iterative Agile delivery suited evolving academic requirements.</w:t>
+        <w:t>Bulk database operations are critical for acceptable latency on serverless PostgreSQL.</w:t>
+      </w:r>
+    </w:p>
+    <w:p>
+      <w:pPr>
+        <w:pStyle w:val="ListBullet"/>
+      </w:pPr>
+      <w:r>
+        <w:t>Iterative Agile delivery suited evolving academic requirements including Neon migration and dispute workflow.</w:t>
+      </w:r>
+    </w:p>
+    <w:p>
+      <w:pPr>
+        <w:pStyle w:val="ListBullet"/>
+      </w:pPr>
+      <w:r>
+        <w:t>Centralising ingest in one service module eliminated duplicate ML queries and inconsistent scoring.</w:t>
       </w:r>
     </w:p>
     <w:p>
@@ -3618,7 +5837,7 @@
     </w:p>
     <w:p>
       <w:r>
-        <w:t>The FraudShield project successfully demonstrates a complete credit card fraud detection platform with authentication, hybrid intelligence, operational dashboard, and reporting. Objectives stated in Chapter 1 were met within prototype scope. The system is suitable for demonstration, further research, and incremental hardening toward production.</w:t>
+        <w:t>The FraudShield project successfully demonstrates a complete credit card fraud detection platform with authentication, hybrid intelligence, operational dashboard, dispute resolution, and reporting. All primary objectives stated in Chapter 1 were met within prototype scope. The system is suitable for academic demonstration, further research into explainable fraud detection, and incremental hardening toward production deployment with payment network integration and compliance certification.</w:t>
       </w:r>
     </w:p>
     <w:p>
@@ -3634,7 +5853,7 @@
         <w:pStyle w:val="ListBullet"/>
       </w:pPr>
       <w:r>
-        <w:t>Aligning frontend session cookie with JWT required careful 401 handling.</w:t>
+        <w:t>Neon serverless latency on cold starts affects ingest response time compared to local databases.</w:t>
       </w:r>
     </w:p>
     <w:p>
@@ -3642,7 +5861,7 @@
         <w:pStyle w:val="ListBullet"/>
       </w:pPr>
       <w:r>
-        <w:t>ML training dependent on availability of suitable labelled dataset.</w:t>
+        <w:t>Aligning frontend session cookie with JWT required careful 401 handling and hydration-safe state initialisation.</w:t>
       </w:r>
     </w:p>
     <w:p>
@@ -3650,7 +5869,23 @@
         <w:pStyle w:val="ListBullet"/>
       </w:pPr>
       <w:r>
-        <w:t>Time constraints limited automated test coverage and production DevOps.</w:t>
+        <w:t>ML training quality depends on availability and representativeness of labelled training data.</w:t>
+      </w:r>
+    </w:p>
+    <w:p>
+      <w:pPr>
+        <w:pStyle w:val="ListBullet"/>
+      </w:pPr>
+      <w:r>
+        <w:t>Time constraints limited automated unit test coverage and full DevOps pipeline setup.</w:t>
+      </w:r>
+    </w:p>
+    <w:p>
+      <w:pPr>
+        <w:pStyle w:val="ListBullet"/>
+      </w:pPr>
+      <w:r>
+        <w:t>Simulated email/SMS alerts do not deliver to external inboxes without gateway integration.</w:t>
       </w:r>
     </w:p>
     <w:p>
@@ -3666,7 +5901,7 @@
         <w:pStyle w:val="ListBullet"/>
       </w:pPr>
       <w:r>
-        <w:t>Security must be designed early (RBAC, scoped queries), not added late.</w:t>
+        <w:t>Security (RBAC, scoped queries) must be designed early—not retrofitted after features are built.</w:t>
       </w:r>
     </w:p>
     <w:p>
@@ -3674,7 +5909,7 @@
         <w:pStyle w:val="ListBullet"/>
       </w:pPr>
       <w:r>
-        <w:t>Separating scoring engine from transport layer simplifies testing.</w:t>
+        <w:t>Separating the scoring engine from HTTP transport simplifies testing and reuse (simulator, seed, API).</w:t>
       </w:r>
     </w:p>
     <w:p>
@@ -3682,7 +5917,23 @@
         <w:pStyle w:val="ListBullet"/>
       </w:pPr>
       <w:r>
-        <w:t>Documentation and seed data accelerate demonstration and grading.</w:t>
+        <w:t>Documentation, seed data, and demo accounts accelerate demonstration and examiner evaluation.</w:t>
+      </w:r>
+    </w:p>
+    <w:p>
+      <w:pPr>
+        <w:pStyle w:val="ListBullet"/>
+      </w:pPr>
+      <w:r>
+        <w:t>Performance profiling on cloud databases reveals bottlenecks invisible in local SQLite development.</w:t>
+      </w:r>
+    </w:p>
+    <w:p>
+      <w:pPr>
+        <w:pStyle w:val="ListBullet"/>
+      </w:pPr>
+      <w:r>
+        <w:t>Client-side hydration mismatches require deferring browser-only state to useEffect hooks.</w:t>
       </w:r>
     </w:p>
     <w:p>
@@ -3698,7 +5949,7 @@
         <w:pStyle w:val="ListBullet"/>
       </w:pPr>
       <w:r>
-        <w:t>Integrate real payment webhooks and stream processing (Kafka).</w:t>
+        <w:t>Integrate real payment webhooks and stream processing (e.g. Apache Kafka, Redis streams).</w:t>
       </w:r>
     </w:p>
     <w:p>
@@ -3706,7 +5957,7 @@
         <w:pStyle w:val="ListBullet"/>
       </w:pPr>
       <w:r>
-        <w:t>Wire FraudRule database catalog into live rule engine.</w:t>
+        <w:t>Add formal SHAP or LIME explainability for regulatory-grade model interpretation.</w:t>
       </w:r>
     </w:p>
     <w:p>
@@ -3714,7 +5965,7 @@
         <w:pStyle w:val="ListBullet"/>
       </w:pPr>
       <w:r>
-        <w:t>Add SHAP or LIME for formal explainability.</w:t>
+        <w:t>Implement genuine email/SMS gateways and TOTP-based two-factor authentication.</w:t>
       </w:r>
     </w:p>
     <w:p>
@@ -3722,7 +5973,7 @@
         <w:pStyle w:val="ListBullet"/>
       </w:pPr>
       <w:r>
-        <w:t>Deploy on PostgreSQL with Docker and CI/CD pipeline.</w:t>
+        <w:t>Deploy with Docker Compose, CI/CD (GitHub Actions), and observability (Prometheus, Grafana).</w:t>
       </w:r>
     </w:p>
     <w:p>
@@ -3730,7 +5981,15 @@
         <w:pStyle w:val="ListBullet"/>
       </w:pPr>
       <w:r>
-        <w:t>Implement genuine email/SMS and TOTP 2FA.</w:t>
+        <w:t>Expand ML features: merchant category embeddings, graph-based fraud rings, model retraining pipeline.</w:t>
+      </w:r>
+    </w:p>
+    <w:p>
+      <w:pPr>
+        <w:pStyle w:val="ListBullet"/>
+      </w:pPr>
+      <w:r>
+        <w:t>Add automated pytest suite and Playwright end-to-end browser tests.</w:t>
       </w:r>
     </w:p>
     <w:p>
@@ -3743,7 +6002,7 @@
     </w:p>
     <w:p>
       <w:r>
-        <w:t>Commercialisation could target small fintechs via SaaS subscription: per-transaction scoring API, analyst seats, and compliance report packs. Partnership with regional banks for pilot programmes, PCI-DSS assessment, and SOC2 readiness would be prerequisite. Open-core model (free tier + paid analytics) could drive adoption.</w:t>
+        <w:t>Commercialisation could target small fintechs and regional banks via a SaaS subscription model: per-transaction scoring API pricing, analyst seat licences, and compliance report packs. A phased go-to-market would include: (1) pilot programme with one institution; (2) PCI-DSS and SOC2 readiness assessment; (3) open-core model with free developer tier and paid enterprise analytics; (4) partnership with payment processors for embedded fraud scoring. Revenue streams include API usage fees, premium explainability modules, and professional services for custom rule configuration.</w:t>
       </w:r>
     </w:p>
     <w:p>
@@ -3791,7 +6050,7 @@
         <w:pStyle w:val="ListNumber"/>
       </w:pPr>
       <w:r>
-        <w:t>Verizon (2024). Data Breach Investigations Report (fraud trends reference).</w:t>
+        <w:t>Neon Serverless PostgreSQL. https://neon.tech/docs</w:t>
       </w:r>
     </w:p>
     <w:p>
@@ -3799,7 +6058,7 @@
         <w:pStyle w:val="ListNumber"/>
       </w:pPr>
       <w:r>
-        <w:t>OWASP (2023). JWT Security Cheat Sheet.</w:t>
+        <w:t>Verizon (2024). Data Breach Investigations Report.</w:t>
       </w:r>
     </w:p>
     <w:p>
@@ -3807,7 +6066,31 @@
         <w:pStyle w:val="ListNumber"/>
       </w:pPr>
       <w:r>
+        <w:t>OWASP (2023). JWT Security Cheat Sheet. https://cheatsheetseries.owasp.org/</w:t>
+      </w:r>
+    </w:p>
+    <w:p>
+      <w:pPr>
+        <w:pStyle w:val="ListNumber"/>
+      </w:pPr>
+      <w:r>
         <w:t>SQLAlchemy Documentation. https://www.sqlalchemy.org/</w:t>
+      </w:r>
+    </w:p>
+    <w:p>
+      <w:pPr>
+        <w:pStyle w:val="ListNumber"/>
+      </w:pPr>
+      <w:r>
+        <w:t>Chart.js Documentation. https://www.chartjs.org/docs/</w:t>
+      </w:r>
+    </w:p>
+    <w:p>
+      <w:pPr>
+        <w:pStyle w:val="ListNumber"/>
+      </w:pPr>
+      <w:r>
+        <w:t>NIST (2020). Digital Identity Guidelines (SP 800-63B) — password and authentication reference.</w:t>
       </w:r>
     </w:p>
     <w:sectPr>

</xml_diff>

<commit_message>
fixing role reuest issues
</commit_message>
<xml_diff>
--- a/FraudShield-Project-Documentation.docx
+++ b/FraudShield-Project-Documentation.docx
@@ -125,17 +125,12 @@
     </w:p>
     <w:p>
       <w:r>
-        <w:t>Credit card fraud remains a major threat to financial institutions, merchants, and consumers. Existing detection systems often rely on either rigid rule-based engines that generate excessive false positives, or opaque machine learning models that lack interpretability for investigators. This project presents FraudShield, a full-stack web platform that combines deterministic rules, behavioral profiling, and scikit-learn machine learning into a unified 0–100 risk score, delivered through a secure, role-based operations console built with Flask and Next.js.</w:t>
+        <w:t>Online card payments are convenient but they expose banks and customers to fraud. Many detection tools rely either on fixed rules that block too many genuine purchases, or on machine learning models that analysts cannot easily interpret. FraudShield is a web application built for this project that combines rules, spending-profile checks, and a scikit-learn classifier. Each transaction receives a risk score from 0 to 100 and is stored with a full breakdown of why that score was assigned.</w:t>
       </w:r>
     </w:p>
     <w:p>
       <w:r>
-        <w:t>The system supports three personas—cardholder, fraud analyst, and administrator—each with scoped access to transactions, dashboards, dispute resolution, explainability views, and exportable reports. Transactions are ingested via manual capture, REST API, or a live simulator; each ingest triggers hybrid scoring, persistence to PostgreSQL (Neon), audit logging, and optional alert notifications. Evaluation using seeded realistic demo data demonstrates effective flagging of high-risk patterns, sub-second to low-second API latency depending on hosting, and successful role-based data isolation.</w:t>
-      </w:r>
-    </w:p>
-    <w:p>
-      <w:r>
-        <w:t>Keywords: credit card fraud detection, hybrid scoring, machine learning, Flask, Next.js, role-based access control, explainable AI, financial technology.</w:t>
+        <w:t>The system was implemented with a Flask API and a Next.js dashboard. Three user roles are supported: cardholder, fraud analyst, and administrator. Analysts can monitor transactions, review flagged cases, resolve disputes, and export reports. Open dashboard tabs receive new transactions through a Server-Sent Events stream rather than periodic page reloads. The database runs on PostgreSQL (hosted on Neon during development). Testing with seeded demo data showed that obvious fraud patterns are flagged correctly and that each role only sees the data it is permitted to view.</w:t>
       </w:r>
     </w:p>
     <w:p>
@@ -153,7 +148,7 @@
     </w:p>
     <w:p>
       <w:r>
-        <w:t>I would like to express my sincere gratitude to my project supervisor for their guidance, constructive feedback, and encouragement throughout the development of FraudShield. I also thank the faculty and staff of the Department of Computer Science for providing the academic foundation and resources that made this work possible. Finally, I acknowledge my peers and family for their support during the research, implementation, and testing phases of this project.</w:t>
+        <w:t>I wish to thank my project supervisor for the guidance and feedback given at each review meeting. Thanks also to the lecturers and technical staff in the Department of Computer Science for the coursework foundation that made this implementation possible. Finally, I thank my colleagues and family for their patience during the development and testing period.</w:t>
       </w:r>
     </w:p>
     <w:p>
@@ -167,11 +162,6 @@
       </w:pPr>
       <w:r>
         <w:t>Table of Contents</w:t>
-      </w:r>
-    </w:p>
-    <w:p>
-      <w:r>
-        <w:t>Note: In Microsoft Word, update this table by right-clicking and selecting 'Update Field' after opening the document, or use References → Table of Contents.</w:t>
       </w:r>
     </w:p>
     <w:p>
@@ -245,12 +235,12 @@
     </w:p>
     <w:p>
       <w:r>
-        <w:t>Credit card fraud causes billions of dollars in losses annually and erodes consumer trust in digital payments. Financial institutions must detect suspicious transactions quickly while minimising false positives that block legitimate purchases. Many organisations still depend on manual review queues, legacy rule-only engines, or proprietary black-box scoring services that are expensive, inflexible, or difficult to audit.</w:t>
+        <w:t>Credit card fraud remains a major cost for banks and a source of stress for customers. Institutions must spot suspicious payments quickly without blocking everyday purchases. Many still rely on manual review queues, simple rule engines, or paid scoring services that are hard to audit or adapt.</w:t>
       </w:r>
     </w:p>
     <w:p>
       <w:r>
-        <w:t>Small and medium institutions, as well as academic environments, lack integrated platforms that combine real-time hybrid scoring (rules + behavior + machine learning), explainable decisions, dispute workflows, role-based dashboards, and exportable compliance evidence in one cohesive system. FraudShield addresses this gap by delivering a web-based fraud detection platform that ingests transactions, computes transparent risk scores, stores audit trails, and supports cardholders, analysts, and administrators through dedicated interfaces.</w:t>
+        <w:t>For teaching and small-scale pilots there is often no single open system that combines rule checks, spending-profile analysis, machine learning, explainable scores, dispute handling, and role-based dashboards. FraudShield was built to fill that gap: a web application that accepts transactions, assigns a transparent risk score, keeps an audit trail, and serves cardholders, analysts, and administrators through separate views.</w:t>
       </w:r>
     </w:p>
     <w:p>
@@ -263,7 +253,7 @@
     </w:p>
     <w:p>
       <w:r>
-        <w:t>The aim of this project is to design, implement, and evaluate FraudShield—a full-stack credit card fraud detection system that scores transactions in near real time using a hybrid intelligence pipeline, and presents results through a secure, role-based web application suitable for demonstration, academic assessment, and future production extension.</w:t>
+        <w:t>The aim is to design and build FraudShield—a full-stack fraud detection application that scores transactions using rules, behaviour checks, and a trained classifier, then presents the results in a secure web dashboard suitable for demonstration and further development.</w:t>
       </w:r>
     </w:p>
     <w:p>
@@ -279,7 +269,7 @@
         <w:pStyle w:val="ListBullet"/>
       </w:pPr>
       <w:r>
-        <w:t>To develop a RESTful Flask backend API for authentication, transaction ingestion, fraud scoring, and reporting.</w:t>
+        <w:t>Build a Flask REST API for login, transaction intake, scoring, and reporting.</w:t>
       </w:r>
     </w:p>
     <w:p>
@@ -287,7 +277,7 @@
         <w:pStyle w:val="ListBullet"/>
       </w:pPr>
       <w:r>
-        <w:t>To implement a hybrid fraud engine combining deterministic rules, user behavioral profiles, and ML probability.</w:t>
+        <w:t>Combine rule checks, user spending profiles, and ML output into one risk score.</w:t>
       </w:r>
     </w:p>
     <w:p>
@@ -295,7 +285,7 @@
         <w:pStyle w:val="ListBullet"/>
       </w:pPr>
       <w:r>
-        <w:t>To train and integrate a scikit-learn classification model serialized as a joblib artifact for inference.</w:t>
+        <w:t>Train a scikit-learn model on public fraud data and load it for live scoring.</w:t>
       </w:r>
     </w:p>
     <w:p>
@@ -303,7 +293,7 @@
         <w:pStyle w:val="ListBullet"/>
       </w:pPr>
       <w:r>
-        <w:t>To design a normalised PostgreSQL relational schema for users, transactions, decisions, disputes, alerts, and audit logs.</w:t>
+        <w:t>Design a PostgreSQL schema for users, transactions, decisions, disputes, and audit logs.</w:t>
       </w:r>
     </w:p>
     <w:p>
@@ -311,7 +301,7 @@
         <w:pStyle w:val="ListBullet"/>
       </w:pPr>
       <w:r>
-        <w:t>To build a responsive Next.js 14 dashboard with KPIs, monitoring, explainability, disputes, and admin tools.</w:t>
+        <w:t>Develop a Next.js dashboard with monitoring, explainability, and admin tools.</w:t>
       </w:r>
     </w:p>
     <w:p>
@@ -319,7 +309,7 @@
         <w:pStyle w:val="ListBullet"/>
       </w:pPr>
       <w:r>
-        <w:t>To enforce role-based access control (RBAC) for cardholder, analyst, and administrator personas.</w:t>
+        <w:t>Restrict pages and API data by role (cardholder, analyst, admin).</w:t>
       </w:r>
     </w:p>
     <w:p>
@@ -327,7 +317,7 @@
         <w:pStyle w:val="ListBullet"/>
       </w:pPr>
       <w:r>
-        <w:t>To provide exportable reports (CSV, PDF, JSON), in-app notifications, and optional OAuth social login.</w:t>
+        <w:t>Allow export of transaction data as CSV, PDF, and JSON.</w:t>
       </w:r>
     </w:p>
     <w:p>
@@ -335,7 +325,7 @@
         <w:pStyle w:val="ListBullet"/>
       </w:pPr>
       <w:r>
-        <w:t>To document requirements, UML models, testing evidence, and results in accordance with CS project guidelines.</w:t>
+        <w:t>Produce this report with requirements, diagrams, test notes, and results.</w:t>
       </w:r>
     </w:p>
     <w:p>
@@ -348,7 +338,7 @@
     </w:p>
     <w:p>
       <w:r>
-        <w:t>Electronic payment volumes continue to grow while fraud techniques evolve (card-not-present fraud, account takeover, velocity attacks). Institutions need systems that balance automation with human oversight and regulatory explainability. A dedicated academic implementation enables controlled experimentation with scoring logic, reproducible datasets, and full traceability—requirements difficult to evaluate on closed commercial products. The project demonstrates that a modular, explainable, extensible architecture can be built with mainstream open-source tools within a final-year timeline.</w:t>
+        <w:t>Payment volumes keep growing while fraud tactics change (card-not-present abuse, account takeover, rapid small purchases). Banks need automation that analysts can still understand and challenge. Building the system from scratch allowed controlled experiments with scoring logic, seeded data, and full traceability—things that are difficult to study on closed commercial products.</w:t>
       </w:r>
     </w:p>
     <w:p>
@@ -361,7 +351,7 @@
     </w:p>
     <w:p>
       <w:r>
-        <w:t>Motivation stems from interest in financial technology, applied machine learning for security, and full-stack software engineering. Observing how banks flag unusual spending patterns led to investigation of how rules and statistical models complement each other. The project strengthens competencies in API design, database modelling, JWT security, data visualisation, and Agile delivery—skills valued in fintech and software engineering careers.</w:t>
+        <w:t>I have followed several cases of unauthorised card use in the news and wanted to understand how software can detect such activity before large losses occur. The project also gave practical experience in building an API, connecting a database, training a simple model, and shipping a working interface—skills that apply directly to fintech and general software jobs.</w:t>
       </w:r>
     </w:p>
     <w:p>
@@ -410,6 +400,22 @@
       </w:pPr>
       <w:r>
         <w:t>Dashboard modules: overview, monitoring, capture, flagged queue, disputes, fraud lab, explainability, analytics, alerts, reports, admin, profile.</w:t>
+      </w:r>
+    </w:p>
+    <w:p>
+      <w:pPr>
+        <w:pStyle w:val="ListBullet"/>
+      </w:pPr>
+      <w:r>
+        <w:t>Live dashboard updates via Server-Sent Events when new transactions are ingested.</w:t>
+      </w:r>
+    </w:p>
+    <w:p>
+      <w:pPr>
+        <w:pStyle w:val="ListBullet"/>
+      </w:pPr>
+      <w:r>
+        <w:t>Cardholders may request analyst or admin access; admins approve or reject from the console.</w:t>
       </w:r>
     </w:p>
     <w:p>
@@ -574,7 +580,7 @@
     </w:p>
     <w:p>
       <w:r>
-        <w:t>Academically, the project applies the software engineering lifecycle, UML modelling, hybrid intelligent systems, security design, and empirical testing. Practically, it produces a working prototype extendable into a pilot system by adding payment webhooks, hardened DevOps, PCI-DSS assessment, and production monitoring.</w:t>
+        <w:t>The work applies the software engineering lifecycle—requirements, UML, implementation, and testing—to a problem that mixes security and machine learning. The finished prototype could be extended with payment webhooks, stronger hosting, and formal compliance review if taken beyond the classroom.</w:t>
       </w:r>
     </w:p>
     <w:p>
@@ -841,7 +847,7 @@
     </w:p>
     <w:p>
       <w:r>
-        <w:t>Chapter 1 introduces the problem, objectives, scope, and deliverables. Chapter 2 reviews related systems and presents the proposed architecture with component descriptions and diagrams. Chapter 3 covers methodology, requirements, UML models, security, process model, and logical designs. Chapter 4 describes implementation mapping, algorithms, construction evidence, testing, and results. Chapter 5 concludes with findings, limitations, lessons learned, future work, and commercialisation.</w:t>
+        <w:t>Chapter 1 states the problem, objectives, and scope. Chapter 2 compares existing approaches and describes the FraudShield architecture. Chapter 3 covers requirements, UML models, security, and design. Chapter 4 explains how the system was built and tested. Chapter 5 summarises outcomes, limitations, and possible next steps.</w:t>
       </w:r>
     </w:p>
     <w:p>
@@ -881,7 +887,7 @@
         <w:pStyle w:val="ListBullet"/>
       </w:pPr>
       <w:r>
-        <w:t>This comprehensive project documentation (Word format).</w:t>
+        <w:t>This project documentation (Word format).</w:t>
       </w:r>
     </w:p>
     <w:p>
@@ -939,7 +945,7 @@
     </w:p>
     <w:p>
       <w:r>
-        <w:t>In many institutions, flagged transactions are reviewed by analysts using spreadsheets and disconnected case tools. Features include case notes and phone verification. Advantages: human judgment on edge cases. Disadvantages: slow throughput, high labour cost, poor scalability, limited automated audit trails.</w:t>
+        <w:t>Analysts work from spreadsheets or separate case tools, calling customers to verify unusual charges. This works for ambiguous cases but does not scale: queues grow quickly, labour cost is high, and audit trails are often incomplete.</w:t>
       </w:r>
     </w:p>
     <w:p>
@@ -952,7 +958,7 @@
     </w:p>
     <w:p>
       <w:r>
-        <w:t>Authorisation systems apply hard thresholds (amount limits, velocity counts, country blocks). Advantages: fast, interpretable, easy to configure. Disadvantages: high false-positive rates, difficulty adapting to individual spending patterns, no personalised behavioral baselines.</w:t>
+        <w:t>Authorisation systems apply fixed thresholds—amount limits, velocity counts, country blocks. Rules are fast and easy to explain, but they generate many false alarms and cannot easily reflect how an individual customer normally spends.</w:t>
       </w:r>
     </w:p>
     <w:p>
@@ -965,7 +971,7 @@
     </w:p>
     <w:p>
       <w:r>
-        <w:t>Modern vendors use gradient boosting, random forests, or neural networks on large labelled datasets. Advantages: strong accuracy on historical patterns. Disadvantages: limited explainability, regulatory challenges, cold-start problems, dependency on large labelled data volumes.</w:t>
+        <w:t>Vendors train gradient boosting or neural networks on large labelled datasets. Accuracy on historical data can be strong, but analysts may not see why a score was assigned, regulators may ask for justification, and new merchants or users start with little history.</w:t>
       </w:r>
     </w:p>
     <w:p>
@@ -978,7 +984,7 @@
     </w:p>
     <w:p>
       <w:r>
-        <w:t>Enterprise suites (e.g. FICO Falcon-class, SAS Fraud Management, Feedzai) offer end-to-end case management, graph analytics, and model operations. Advantages: mature, scalable, compliance-ready. Disadvantages: costly licences, closed source, long integration cycles—not feasible for an academic prototype budget.</w:t>
+        <w:t>Enterprise products (for example FICO Falcon-class systems, SAS Fraud Management, Feedzai) bundle case management, analytics, and model operations. They are mature but expensive, closed-source, and slow to integrate—outside the budget and timeline of a final-year build.</w:t>
       </w:r>
     </w:p>
     <w:p>
@@ -991,7 +997,7 @@
     </w:p>
     <w:p>
       <w:r>
-        <w:t>FraudShield proposes a hybrid, explainable, web-accessible platform: deterministic rules plus behavioral profiling plus ML probability, fused into a 0–100 risk score, with JWT-secured role-based UI, dispute resolution workflow, admin rule toggles wired to the live engine, and comprehensive audit logging.</w:t>
+        <w:t>FraudShield combines rules, spending-profile checks, and ML probability into a single 0–100 risk score. A Flask API stores every decision with a component breakdown. A Next.js dashboard enforces role-based access, supports dispute resolution, lets admins toggle rules in the live engine, and records audit entries for sensitive actions.</w:t>
       </w:r>
     </w:p>
     <w:p>
@@ -1004,7 +1010,7 @@
     </w:p>
     <w:p>
       <w:r>
-        <w:t>Conceptually, the system is organised into four layers: (1) Presentation—Next.js pages and components; (2) Application/API—Flask blueprints and route handlers; (3) Domain Services—scoring, ingest, RBAC, caching, simulator, reports; (4) Data—SQLAlchemy models backed by PostgreSQL. External actors interact only with the presentation layer; all business logic and scoring execute on the server to protect models and enforce authorisation.</w:t>
+        <w:t>The system has four layers. The presentation layer (Next.js pages) talks only to the API. Flask route handlers receive requests and call domain services for scoring, ingest, RBAC, caching, and reports. SQLAlchemy maps data to PostgreSQL tables. Scoring logic stays on the server so models and authorisation rules are not exposed in the browser.</w:t>
       </w:r>
     </w:p>
     <w:p>
@@ -1048,7 +1054,7 @@
       <w:r>
         <w:drawing>
           <wp:inline xmlns:a="http://schemas.openxmlformats.org/drawingml/2006/main" xmlns:pic="http://schemas.openxmlformats.org/drawingml/2006/picture">
-            <wp:extent cx="5486400" cy="3470424"/>
+            <wp:extent cx="5486400" cy="3984859"/>
             <wp:docPr id="1" name="Picture 1"/>
             <wp:cNvGraphicFramePr>
               <a:graphicFrameLocks noChangeAspect="1"/>
@@ -1069,7 +1075,7 @@
                   <pic:spPr>
                     <a:xfrm>
                       <a:off x="0" y="0"/>
-                      <a:ext cx="5486400" cy="3470424"/>
+                      <a:ext cx="5486400" cy="3984859"/>
                     </a:xfrm>
                     <a:prstGeom prst="rect"/>
                   </pic:spPr>
@@ -1097,7 +1103,7 @@
       <w:r>
         <w:drawing>
           <wp:inline xmlns:a="http://schemas.openxmlformats.org/drawingml/2006/main" xmlns:pic="http://schemas.openxmlformats.org/drawingml/2006/picture">
-            <wp:extent cx="5486400" cy="2941115"/>
+            <wp:extent cx="5486400" cy="2346538"/>
             <wp:docPr id="2" name="Picture 2"/>
             <wp:cNvGraphicFramePr>
               <a:graphicFrameLocks noChangeAspect="1"/>
@@ -1118,7 +1124,7 @@
                   <pic:spPr>
                     <a:xfrm>
                       <a:off x="0" y="0"/>
-                      <a:ext cx="5486400" cy="2941115"/>
+                      <a:ext cx="5486400" cy="2346538"/>
                     </a:xfrm>
                     <a:prstGeom prst="rect"/>
                   </pic:spPr>
@@ -1146,7 +1152,7 @@
       <w:r>
         <w:drawing>
           <wp:inline xmlns:a="http://schemas.openxmlformats.org/drawingml/2006/main" xmlns:pic="http://schemas.openxmlformats.org/drawingml/2006/picture">
-            <wp:extent cx="5486400" cy="4004336"/>
+            <wp:extent cx="5486400" cy="4218905"/>
             <wp:docPr id="3" name="Picture 3"/>
             <wp:cNvGraphicFramePr>
               <a:graphicFrameLocks noChangeAspect="1"/>
@@ -1167,7 +1173,7 @@
                   <pic:spPr>
                     <a:xfrm>
                       <a:off x="0" y="0"/>
-                      <a:ext cx="5486400" cy="4004336"/>
+                      <a:ext cx="5486400" cy="4218905"/>
                     </a:xfrm>
                     <a:prstGeom prst="rect"/>
                   </pic:spPr>
@@ -1551,7 +1557,29 @@
           </w:tcPr>
           <w:p>
             <w:r>
-              <w:t>In-app feed, toast/sound on new transactions</w:t>
+              <w:t>In-app feed; SSE push when new transactions arrive</w:t>
+            </w:r>
+          </w:p>
+        </w:tc>
+      </w:tr>
+      <w:tr>
+        <w:tc>
+          <w:tcPr>
+            <w:tcW w:type="dxa" w:w="4320"/>
+          </w:tcPr>
+          <w:p>
+            <w:r>
+              <w:t>Role access requests</w:t>
+            </w:r>
+          </w:p>
+        </w:tc>
+        <w:tc>
+          <w:tcPr>
+            <w:tcW w:type="dxa" w:w="4320"/>
+          </w:tcPr>
+          <w:p>
+            <w:r>
+              <w:t>Cardholders request analyst/admin role; admin approves or rejects</w:t>
             </w:r>
           </w:p>
         </w:tc>
@@ -1817,7 +1845,7 @@
         <w:pStyle w:val="ListBullet"/>
       </w:pPr>
       <w:r>
-        <w:t>Faster detection through automated hybrid scoring on every ingest.</w:t>
+        <w:t>Every ingest receives an automated hybrid score without waiting for manual review.</w:t>
       </w:r>
     </w:p>
     <w:p>
@@ -1825,7 +1853,7 @@
         <w:pStyle w:val="ListBullet"/>
       </w:pPr>
       <w:r>
-        <w:t>Improved analyst efficiency via prioritised flagged queue, explainability, and disputes.</w:t>
+        <w:t>Analysts work from a prioritised queue with explainability and dispute tools.</w:t>
       </w:r>
     </w:p>
     <w:p>
@@ -1833,7 +1861,7 @@
         <w:pStyle w:val="ListBullet"/>
       </w:pPr>
       <w:r>
-        <w:t>Transparent decisions with stored rule/behavior/ML breakdown per transaction.</w:t>
+        <w:t>Each decision stores rule, behaviour, and ML contributions for later review.</w:t>
       </w:r>
     </w:p>
     <w:p>
@@ -1841,7 +1869,7 @@
         <w:pStyle w:val="ListBullet"/>
       </w:pPr>
       <w:r>
-        <w:t>Lower cost than enterprise suites for teaching, research, and pilot deployment.</w:t>
+        <w:t>Open-source stack keeps cost low for teaching and pilot use.</w:t>
       </w:r>
     </w:p>
     <w:p>
@@ -1849,15 +1877,7 @@
         <w:pStyle w:val="ListBullet"/>
       </w:pPr>
       <w:r>
-        <w:t>Extensible modular codebase for future payment webhook integration.</w:t>
-      </w:r>
-    </w:p>
-    <w:p>
-      <w:pPr>
-        <w:pStyle w:val="ListBullet"/>
-      </w:pPr>
-      <w:r>
-        <w:t>Cloud-ready PostgreSQL supports realistic deployment scenarios beyond local SQLite demos.</w:t>
+        <w:t>Modular code allows payment webhook integration in a later phase.</w:t>
       </w:r>
     </w:p>
     <w:p>
@@ -1871,19 +1891,6 @@
       </w:pPr>
       <w:r>
         <w:t>Chapter 3: Methodology</w:t>
-      </w:r>
-    </w:p>
-    <w:p>
-      <w:pPr>
-        <w:pStyle w:val="Heading2"/>
-      </w:pPr>
-      <w:r>
-        <w:t>Chapter Overview</w:t>
-      </w:r>
-    </w:p>
-    <w:p>
-      <w:r>
-        <w:t>This chapter presents requirements engineering, stakeholders, functional and non-functional requirements, UML models with diagrams, security design, the chosen Agile process model, and logical designs including UI wireframes and database schema.</w:t>
       </w:r>
     </w:p>
     <w:p>
@@ -2062,7 +2069,7 @@
     </w:p>
     <w:p>
       <w:r>
-        <w:t>Requirements were gathered through: (1) review of fraud detection literature and industry reports; (2) analysis of commercial platform feature sets; (3) supervisor consultation; (4) iterative prototyping with demo scenarios (manual ingest, simulator, role-based navigation, dispute flows); (5) feedback from test users using seeded demo accounts.</w:t>
+        <w:t>Requirements came from reading fraud-detection papers, inspecting features in commercial products, meetings with my supervisor, and trying early prototypes (manual transaction entry, the live simulator, and role-based menus). Demo accounts were used to confirm that each role behaved as expected.</w:t>
       </w:r>
     </w:p>
     <w:p>
@@ -2397,6 +2404,50 @@
           </w:p>
         </w:tc>
       </w:tr>
+      <w:tr>
+        <w:tc>
+          <w:tcPr>
+            <w:tcW w:type="dxa" w:w="4320"/>
+          </w:tcPr>
+          <w:p>
+            <w:r>
+              <w:t>FR14</w:t>
+            </w:r>
+          </w:p>
+        </w:tc>
+        <w:tc>
+          <w:tcPr>
+            <w:tcW w:type="dxa" w:w="4320"/>
+          </w:tcPr>
+          <w:p>
+            <w:r>
+              <w:t>Cardholders shall request analyst or admin role upgrade; admins shall approve or reject</w:t>
+            </w:r>
+          </w:p>
+        </w:tc>
+      </w:tr>
+      <w:tr>
+        <w:tc>
+          <w:tcPr>
+            <w:tcW w:type="dxa" w:w="4320"/>
+          </w:tcPr>
+          <w:p>
+            <w:r>
+              <w:t>FR15</w:t>
+            </w:r>
+          </w:p>
+        </w:tc>
+        <w:tc>
+          <w:tcPr>
+            <w:tcW w:type="dxa" w:w="4320"/>
+          </w:tcPr>
+          <w:p>
+            <w:r>
+              <w:t>Dashboard shall receive live transaction updates via SSE without full page reload</w:t>
+            </w:r>
+          </w:p>
+        </w:tc>
+      </w:tr>
     </w:tbl>
     <w:p/>
     <w:p>
@@ -2411,7 +2462,7 @@
       <w:r>
         <w:drawing>
           <wp:inline xmlns:a="http://schemas.openxmlformats.org/drawingml/2006/main" xmlns:pic="http://schemas.openxmlformats.org/drawingml/2006/picture">
-            <wp:extent cx="5486400" cy="3649211"/>
+            <wp:extent cx="5486400" cy="3885267"/>
             <wp:docPr id="4" name="Picture 4"/>
             <wp:cNvGraphicFramePr>
               <a:graphicFrameLocks noChangeAspect="1"/>
@@ -2432,7 +2483,7 @@
                   <pic:spPr>
                     <a:xfrm>
                       <a:off x="0" y="0"/>
-                      <a:ext cx="5486400" cy="3649211"/>
+                      <a:ext cx="5486400" cy="3885267"/>
                     </a:xfrm>
                     <a:prstGeom prst="rect"/>
                   </pic:spPr>
@@ -2460,7 +2511,7 @@
       <w:r>
         <w:drawing>
           <wp:inline xmlns:a="http://schemas.openxmlformats.org/drawingml/2006/main" xmlns:pic="http://schemas.openxmlformats.org/drawingml/2006/picture">
-            <wp:extent cx="5486400" cy="6956687"/>
+            <wp:extent cx="5486400" cy="9991267"/>
             <wp:docPr id="5" name="Picture 5"/>
             <wp:cNvGraphicFramePr>
               <a:graphicFrameLocks noChangeAspect="1"/>
@@ -2481,7 +2532,7 @@
                   <pic:spPr>
                     <a:xfrm>
                       <a:off x="0" y="0"/>
-                      <a:ext cx="5486400" cy="6956687"/>
+                      <a:ext cx="5486400" cy="9991267"/>
                     </a:xfrm>
                     <a:prstGeom prst="rect"/>
                   </pic:spPr>
@@ -2509,7 +2560,7 @@
       <w:r>
         <w:drawing>
           <wp:inline xmlns:a="http://schemas.openxmlformats.org/drawingml/2006/main" xmlns:pic="http://schemas.openxmlformats.org/drawingml/2006/picture">
-            <wp:extent cx="5486400" cy="4004336"/>
+            <wp:extent cx="5486400" cy="4218905"/>
             <wp:docPr id="6" name="Picture 6"/>
             <wp:cNvGraphicFramePr>
               <a:graphicFrameLocks noChangeAspect="1"/>
@@ -2530,7 +2581,7 @@
                   <pic:spPr>
                     <a:xfrm>
                       <a:off x="0" y="0"/>
-                      <a:ext cx="5486400" cy="4004336"/>
+                      <a:ext cx="5486400" cy="4218905"/>
                     </a:xfrm>
                     <a:prstGeom prst="rect"/>
                   </pic:spPr>
@@ -2558,7 +2609,7 @@
       <w:r>
         <w:drawing>
           <wp:inline xmlns:a="http://schemas.openxmlformats.org/drawingml/2006/main" xmlns:pic="http://schemas.openxmlformats.org/drawingml/2006/picture">
-            <wp:extent cx="5486400" cy="4131578"/>
+            <wp:extent cx="5486400" cy="4100804"/>
             <wp:docPr id="7" name="Picture 7"/>
             <wp:cNvGraphicFramePr>
               <a:graphicFrameLocks noChangeAspect="1"/>
@@ -2579,7 +2630,7 @@
                   <pic:spPr>
                     <a:xfrm>
                       <a:off x="0" y="0"/>
-                      <a:ext cx="5486400" cy="4131578"/>
+                      <a:ext cx="5486400" cy="4100804"/>
                     </a:xfrm>
                     <a:prstGeom prst="rect"/>
                   </pic:spPr>
@@ -2607,7 +2658,7 @@
       <w:r>
         <w:drawing>
           <wp:inline xmlns:a="http://schemas.openxmlformats.org/drawingml/2006/main" xmlns:pic="http://schemas.openxmlformats.org/drawingml/2006/picture">
-            <wp:extent cx="5486400" cy="4115845"/>
+            <wp:extent cx="5486400" cy="4100804"/>
             <wp:docPr id="8" name="Picture 8"/>
             <wp:cNvGraphicFramePr>
               <a:graphicFrameLocks noChangeAspect="1"/>
@@ -2628,7 +2679,7 @@
                   <pic:spPr>
                     <a:xfrm>
                       <a:off x="0" y="0"/>
-                      <a:ext cx="5486400" cy="4115845"/>
+                      <a:ext cx="5486400" cy="4100804"/>
                     </a:xfrm>
                     <a:prstGeom prst="rect"/>
                   </pic:spPr>
@@ -3586,7 +3637,7 @@
     </w:p>
     <w:p>
       <w:r>
-        <w:t>Waterfall: sequential phases with rigid change control—suitable when requirements are fully known. Agile: iterative delivery with frequent feedback—suitable for evolving prototypes. Spiral: risk-driven iterations with explicit risk analysis. V-Model: each design phase paired with testing. DevOps: continuous integration, delivery, and operational monitoring.</w:t>
+        <w:t>Waterfall suits fixed requirements; Agile suits changing prototypes; Spiral emphasises risk review each cycle; V-Model pairs each design step with a test; DevOps adds continuous deployment and monitoring. None of these was followed strictly—elements of Agile fit the academic schedule best.</w:t>
       </w:r>
     </w:p>
     <w:p>
@@ -3599,14 +3650,14 @@
     </w:p>
     <w:p>
       <w:r>
-        <w:t>An Agile-inspired iterative approach was adopted: backend API and database first, then ML integration, then frontend modules delivered in vertical slices (auth → dashboard → capture → disputes → admin). Justification: requirements evolved during prototyping (RBAC scoping, notifications, Neon migration, bulk seed optimisation); Agile allowed reprioritisation without full waterfall rework; two-week sprints mapped to the academic timeline.</w:t>
+        <w:t>Work proceeded in vertical slices: backend and database first, then ML scoring, then frontend modules (auth, dashboard, capture, disputes, admin). Requirements shifted during development (RBAC scoping, Neon migration, bulk seeding, SSE updates), so a rigid waterfall plan would have slowed progress. Short cycles aligned with supervisor meetings roughly every two weeks.</w:t>
       </w:r>
     </w:p>
     <w:p>
       <w:r>
         <w:drawing>
           <wp:inline xmlns:a="http://schemas.openxmlformats.org/drawingml/2006/main" xmlns:pic="http://schemas.openxmlformats.org/drawingml/2006/picture">
-            <wp:extent cx="5486400" cy="2407204"/>
+            <wp:extent cx="5486400" cy="2112492"/>
             <wp:docPr id="9" name="Picture 9"/>
             <wp:cNvGraphicFramePr>
               <a:graphicFrameLocks noChangeAspect="1"/>
@@ -3627,7 +3678,7 @@
                   <pic:spPr>
                     <a:xfrm>
                       <a:off x="0" y="0"/>
-                      <a:ext cx="5486400" cy="2407204"/>
+                      <a:ext cx="5486400" cy="2112492"/>
                     </a:xfrm>
                     <a:prstGeom prst="rect"/>
                   </pic:spPr>
@@ -3733,14 +3784,22 @@
         <w:pStyle w:val="ListBullet"/>
       </w:pPr>
       <w:r>
-        <w:t>Admin: user table, fraud rule toggles, reseed realistic data button.</w:t>
+        <w:t>Profile: cardholders request analyst or admin access; pending state shown in banner.</w:t>
+      </w:r>
+    </w:p>
+    <w:p>
+      <w:pPr>
+        <w:pStyle w:val="ListBullet"/>
+      </w:pPr>
+      <w:r>
+        <w:t>Admin: user table, fraud rule toggles, pending role requests, reseed realistic data button.</w:t>
       </w:r>
     </w:p>
     <w:p>
       <w:r>
         <w:drawing>
           <wp:inline xmlns:a="http://schemas.openxmlformats.org/drawingml/2006/main" xmlns:pic="http://schemas.openxmlformats.org/drawingml/2006/picture">
-            <wp:extent cx="5486400" cy="3470424"/>
+            <wp:extent cx="5486400" cy="3516767"/>
             <wp:docPr id="10" name="Picture 10"/>
             <wp:cNvGraphicFramePr>
               <a:graphicFrameLocks noChangeAspect="1"/>
@@ -3761,7 +3820,7 @@
                   <pic:spPr>
                     <a:xfrm>
                       <a:off x="0" y="0"/>
-                      <a:ext cx="5486400" cy="3470424"/>
+                      <a:ext cx="5486400" cy="3516767"/>
                     </a:xfrm>
                     <a:prstGeom prst="rect"/>
                   </pic:spPr>
@@ -4176,19 +4235,6 @@
         <w:pStyle w:val="Heading2"/>
       </w:pPr>
       <w:r>
-        <w:t>Chapter Overview</w:t>
-      </w:r>
-    </w:p>
-    <w:p>
-      <w:r>
-        <w:t>This chapter maps logical designs to the physical platform, presents key algorithms and flowcharts, construction evidence with code snippets, testing methodology, and measured results from the implemented FraudShield prototype.</w:t>
-      </w:r>
-    </w:p>
-    <w:p>
-      <w:pPr>
-        <w:pStyle w:val="Heading2"/>
-      </w:pPr>
-      <w:r>
         <w:t>Mapping Logical Design onto Physical Platform</w:t>
       </w:r>
     </w:p>
@@ -4406,6 +4452,50 @@
           </w:p>
         </w:tc>
       </w:tr>
+      <w:tr>
+        <w:tc>
+          <w:tcPr>
+            <w:tcW w:type="dxa" w:w="4320"/>
+          </w:tcPr>
+          <w:p>
+            <w:r>
+              <w:t>Live updates</w:t>
+            </w:r>
+          </w:p>
+        </w:tc>
+        <w:tc>
+          <w:tcPr>
+            <w:tcW w:type="dxa" w:w="4320"/>
+          </w:tcPr>
+          <w:p>
+            <w:r>
+              <w:t>backend/app/services/live_events.py — SSE broadcast on ingest</w:t>
+            </w:r>
+          </w:p>
+        </w:tc>
+      </w:tr>
+      <w:tr>
+        <w:tc>
+          <w:tcPr>
+            <w:tcW w:type="dxa" w:w="4320"/>
+          </w:tcPr>
+          <w:p>
+            <w:r>
+              <w:t>Frontend stream</w:t>
+            </w:r>
+          </w:p>
+        </w:tc>
+        <w:tc>
+          <w:tcPr>
+            <w:tcW w:type="dxa" w:w="4320"/>
+          </w:tcPr>
+          <w:p>
+            <w:r>
+              <w:t>frontend/components/live-stream-provider.tsx — EventSource client</w:t>
+            </w:r>
+          </w:p>
+        </w:tc>
+      </w:tr>
     </w:tbl>
     <w:p/>
     <w:p>
@@ -4428,7 +4518,7 @@
       <w:r>
         <w:drawing>
           <wp:inline xmlns:a="http://schemas.openxmlformats.org/drawingml/2006/main" xmlns:pic="http://schemas.openxmlformats.org/drawingml/2006/picture">
-            <wp:extent cx="5486400" cy="6298776"/>
+            <wp:extent cx="5486400" cy="7852265"/>
             <wp:docPr id="11" name="Picture 11"/>
             <wp:cNvGraphicFramePr>
               <a:graphicFrameLocks noChangeAspect="1"/>
@@ -4449,7 +4539,7 @@
                   <pic:spPr>
                     <a:xfrm>
                       <a:off x="0" y="0"/>
-                      <a:ext cx="5486400" cy="6298776"/>
+                      <a:ext cx="5486400" cy="7852265"/>
                     </a:xfrm>
                     <a:prstGeom prst="rect"/>
                   </pic:spPr>
@@ -4526,7 +4616,7 @@
         <w:br/>
         <w:t>IF final_score &gt;= 60 THEN status&lt;-flagged; create Alert + FraudNotification</w:t>
         <w:br/>
-        <w:t>WRITE AuditLog; invalidate_read_caches()</w:t>
+        <w:t>WRITE AuditLog; invalidate_read_caches(); broadcast SSE event</w:t>
         <w:br/>
         <w:t>RETURN 201 with transaction id, risk_score, confidence, label</w:t>
       </w:r>
@@ -4811,6 +4901,19 @@
         <w:t xml:space="preserve">  ...</w:t>
         <w:br/>
         <w:t>]</w:t>
+      </w:r>
+    </w:p>
+    <w:p>
+      <w:pPr>
+        <w:pStyle w:val="Heading3"/>
+      </w:pPr>
+      <w:r>
+        <w:t>Frontend — Live updates (SSE)</w:t>
+      </w:r>
+    </w:p>
+    <w:p>
+      <w:r>
+        <w:t>After ingest the backend publishes a JSON event to all connected dashboard clients. The browser opens GET /transactions/stream with the JWT as a query parameter (EventSource cannot send custom headers). Monitoring, overview, and alert pages patch local state when an event arrives instead of reloading the whole page.</w:t>
       </w:r>
     </w:p>
     <w:p>
@@ -5128,7 +5231,7 @@
     </w:p>
     <w:p>
       <w:r>
-        <w:t>Verification: build matches specification—all features in Chapter 1 scope are present. Validation: demo users complete a realistic fraud investigation scenario: (1) analyst starts live simulator; (2) high-risk transaction appears in flagged queue; (3) analyst opens explainability view; (4) cardholder opens dispute; (5) analyst resolves dispute; (6) admin exports CSV/PDF report.</w:t>
+        <w:t>A full demo scenario was run with the three seeded accounts: an analyst starts the live simulator; a high-risk transaction appears in the flagged queue without refreshing the page; the analyst opens the explain view; a cardholder opens a dispute; the analyst resolves it; an admin exports CSV and PDF reports.</w:t>
       </w:r>
     </w:p>
     <w:p>
@@ -5530,7 +5633,15 @@
         <w:pStyle w:val="ListBullet"/>
       </w:pPr>
       <w:r>
-        <w:t>Dashboard displays live KPIs, charts, heatmap, and flagged queue with role-appropriate navigation.</w:t>
+        <w:t>Dashboard displays KPIs, charts, heatmap, and flagged queue with role-appropriate navigation.</w:t>
+      </w:r>
+    </w:p>
+    <w:p>
+      <w:pPr>
+        <w:pStyle w:val="ListBullet"/>
+      </w:pPr>
+      <w:r>
+        <w:t>SSE stream pushes new transactions to open dashboard tabs without manual refresh.</w:t>
       </w:r>
     </w:p>
     <w:p>
@@ -5763,19 +5874,6 @@
         <w:pStyle w:val="Heading2"/>
       </w:pPr>
       <w:r>
-        <w:t>Chapter Overview</w:t>
-      </w:r>
-    </w:p>
-    <w:p>
-      <w:r>
-        <w:t>This chapter summarises project outcomes, conclusions, limitations, lessons learned, and recommendations.</w:t>
-      </w:r>
-    </w:p>
-    <w:p>
-      <w:pPr>
-        <w:pStyle w:val="Heading2"/>
-      </w:pPr>
-      <w:r>
         <w:t>Findings</w:t>
       </w:r>
     </w:p>
@@ -5784,7 +5882,7 @@
         <w:pStyle w:val="ListBullet"/>
       </w:pPr>
       <w:r>
-        <w:t>Hybrid scoring (rules + behavior + ML) produces more balanced alerts than any single method alone in demo scenarios.</w:t>
+        <w:t>Combining rules, behaviour checks, and ML produced more useful alerts in demo runs than any single method alone.</w:t>
       </w:r>
     </w:p>
     <w:p>
@@ -5792,7 +5890,7 @@
         <w:pStyle w:val="ListBullet"/>
       </w:pPr>
       <w:r>
-        <w:t>Role-based access control is essential to separate cardholder privacy from analyst global visibility.</w:t>
+        <w:t>Role-based access is required so cardholders see only their own data while staff see global queues.</w:t>
       </w:r>
     </w:p>
     <w:p>
@@ -5800,7 +5898,7 @@
         <w:pStyle w:val="ListBullet"/>
       </w:pPr>
       <w:r>
-        <w:t>Explainability views improve analyst confidence even when formal SHAP is not deployed.</w:t>
+        <w:t>Showing score breakdowns helped during manual testing even without formal SHAP plots.</w:t>
       </w:r>
     </w:p>
     <w:p>
@@ -5808,7 +5906,7 @@
         <w:pStyle w:val="ListBullet"/>
       </w:pPr>
       <w:r>
-        <w:t>Bulk database operations are critical for acceptable latency on serverless PostgreSQL.</w:t>
+        <w:t>Bulk inserts were necessary to keep reseed time acceptable on Neon serverless PostgreSQL.</w:t>
       </w:r>
     </w:p>
     <w:p>
@@ -5816,7 +5914,7 @@
         <w:pStyle w:val="ListBullet"/>
       </w:pPr>
       <w:r>
-        <w:t>Iterative Agile delivery suited evolving academic requirements including Neon migration and dispute workflow.</w:t>
+        <w:t>Working in small slices matched how requirements changed (Neon move, disputes, SSE, role requests).</w:t>
       </w:r>
     </w:p>
     <w:p>
@@ -5824,7 +5922,7 @@
         <w:pStyle w:val="ListBullet"/>
       </w:pPr>
       <w:r>
-        <w:t>Centralising ingest in one service module eliminated duplicate ML queries and inconsistent scoring.</w:t>
+        <w:t>Centralising ingest in transaction_ingest.py removed duplicate ML calls and inconsistent scores.</w:t>
       </w:r>
     </w:p>
     <w:p>
@@ -5837,7 +5935,7 @@
     </w:p>
     <w:p>
       <w:r>
-        <w:t>The FraudShield project successfully demonstrates a complete credit card fraud detection platform with authentication, hybrid intelligence, operational dashboard, dispute resolution, and reporting. All primary objectives stated in Chapter 1 were met within prototype scope. The system is suitable for academic demonstration, further research into explainable fraud detection, and incremental hardening toward production deployment with payment network integration and compliance certification.</w:t>
+        <w:t>The main goal of the project was to deliver a working fraud-detection web application with hybrid scoring and role-based access. That goal was met within the scope of a final-year prototype. The system is ready for demonstration and could be extended later with live payment feeds and stronger production hosting.</w:t>
       </w:r>
     </w:p>
     <w:p>
@@ -5901,7 +5999,7 @@
         <w:pStyle w:val="ListBullet"/>
       </w:pPr>
       <w:r>
-        <w:t>Security (RBAC, scoped queries) must be designed early—not retrofitted after features are built.</w:t>
+        <w:t>RBAC and scoped queries should be planned early—not added after features ship.</w:t>
       </w:r>
     </w:p>
     <w:p>
@@ -5909,7 +6007,7 @@
         <w:pStyle w:val="ListBullet"/>
       </w:pPr>
       <w:r>
-        <w:t>Separating the scoring engine from HTTP transport simplifies testing and reuse (simulator, seed, API).</w:t>
+        <w:t>Keeping the scoring engine separate from HTTP handlers made simulator and seed scripts easier to test.</w:t>
       </w:r>
     </w:p>
     <w:p>
@@ -5917,7 +6015,7 @@
         <w:pStyle w:val="ListBullet"/>
       </w:pPr>
       <w:r>
-        <w:t>Documentation, seed data, and demo accounts accelerate demonstration and examiner evaluation.</w:t>
+        <w:t>Seed data and demo accounts saved time during every demonstration rehearsal.</w:t>
       </w:r>
     </w:p>
     <w:p>
@@ -5925,7 +6023,7 @@
         <w:pStyle w:val="ListBullet"/>
       </w:pPr>
       <w:r>
-        <w:t>Performance profiling on cloud databases reveals bottlenecks invisible in local SQLite development.</w:t>
+        <w:t>Cloud database latency showed up only after moving off local SQLite.</w:t>
       </w:r>
     </w:p>
     <w:p>
@@ -5933,7 +6031,7 @@
         <w:pStyle w:val="ListBullet"/>
       </w:pPr>
       <w:r>
-        <w:t>Client-side hydration mismatches require deferring browser-only state to useEffect hooks.</w:t>
+        <w:t>Browser hydration errors were avoided by loading session-only state inside useEffect.</w:t>
       </w:r>
     </w:p>
     <w:p>
@@ -5949,7 +6047,7 @@
         <w:pStyle w:val="ListBullet"/>
       </w:pPr>
       <w:r>
-        <w:t>Integrate real payment webhooks and stream processing (e.g. Apache Kafka, Redis streams).</w:t>
+        <w:t>Connect to real payment webhooks or a message queue for production-scale ingest.</w:t>
       </w:r>
     </w:p>
     <w:p>
@@ -5957,7 +6055,7 @@
         <w:pStyle w:val="ListBullet"/>
       </w:pPr>
       <w:r>
-        <w:t>Add formal SHAP or LIME explainability for regulatory-grade model interpretation.</w:t>
+        <w:t>Add SHAP or LIME if regulators require formal model explanations.</w:t>
       </w:r>
     </w:p>
     <w:p>
@@ -5965,7 +6063,7 @@
         <w:pStyle w:val="ListBullet"/>
       </w:pPr>
       <w:r>
-        <w:t>Implement genuine email/SMS gateways and TOTP-based two-factor authentication.</w:t>
+        <w:t>Wire up real email/SMS gateways and TOTP two-factor authentication.</w:t>
       </w:r>
     </w:p>
     <w:p>
@@ -5973,7 +6071,7 @@
         <w:pStyle w:val="ListBullet"/>
       </w:pPr>
       <w:r>
-        <w:t>Deploy with Docker Compose, CI/CD (GitHub Actions), and observability (Prometheus, Grafana).</w:t>
+        <w:t>Package with Docker and add CI/CD plus basic monitoring.</w:t>
       </w:r>
     </w:p>
     <w:p>
@@ -5981,7 +6079,7 @@
         <w:pStyle w:val="ListBullet"/>
       </w:pPr>
       <w:r>
-        <w:t>Expand ML features: merchant category embeddings, graph-based fraud rings, model retraining pipeline.</w:t>
+        <w:t>Retrain the model on institution-specific data and expand feature engineering.</w:t>
       </w:r>
     </w:p>
     <w:p>
@@ -5989,7 +6087,7 @@
         <w:pStyle w:val="ListBullet"/>
       </w:pPr>
       <w:r>
-        <w:t>Add automated pytest suite and Playwright end-to-end browser tests.</w:t>
+        <w:t>Add pytest unit tests and Playwright browser tests for regression coverage.</w:t>
       </w:r>
     </w:p>
     <w:p>
@@ -6002,7 +6100,7 @@
     </w:p>
     <w:p>
       <w:r>
-        <w:t>Commercialisation could target small fintechs and regional banks via a SaaS subscription model: per-transaction scoring API pricing, analyst seat licences, and compliance report packs. A phased go-to-market would include: (1) pilot programme with one institution; (2) PCI-DSS and SOC2 readiness assessment; (3) open-core model with free developer tier and paid enterprise analytics; (4) partnership with payment processors for embedded fraud scoring. Revenue streams include API usage fees, premium explainability modules, and professional services for custom rule configuration.</w:t>
+        <w:t>A small fintech or campus security lab could adopt the core API as a starting point. A realistic business model would charge per API call or per analyst seat, but production use would require PCI review, proper hosting, and support staff. That work is outside the scope of this academic build.</w:t>
       </w:r>
     </w:p>
     <w:p>

</xml_diff>